<commit_message>
Align KAK TAT PIN/PDD with SETAPAK program proposal (HD Pasir peat, Output 2)
Co-Authored-By: Claude Opus 5.5 <noreply@anthropic.com>
Claude-Session: https://claude.ai/code/session_016hKM1xZpgjxw9qEmhhTJUQ
</commit_message>
<xml_diff>
--- a/KAK_TAT_PIN_PDD_PlanVivo_Desa_Pasir.docx
+++ b/KAK_TAT_PIN_PDD_PlanVivo_Desa_Pasir.docx
@@ -73,7 +73,24 @@
           <w:szCs w:val="24"/>
           <w:lang w:val="id-ID"/>
         </w:rPr>
-        <w:t xml:space="preserve">Proyek Karbon Berbasis Masyarakat Desa Pasir, Kabupaten Mempawah</w:t>
+        <w:t xml:space="preserve">Proyek Karbon Berbasis Masyarakat Hutan Desa Pasir, Kabupaten Mempawah</w:t>
+      </w:r>
+    </w:p>
+    <w:p>
+      <w:pPr>
+        <w:spacing w:after="40"/>
+        <w:jc w:val="center"/>
+        <w:rPr>
+          <w:lang w:val="id-ID"/>
+        </w:rPr>
+      </w:pPr>
+      <w:r>
+        <w:rPr>
+          <w:sz w:val="20"/>
+          <w:szCs w:val="20"/>
+          <w:lang w:val="id-ID"/>
+        </w:rPr>
+        <w:t xml:space="preserve">Program SETAPAK – Strengthening Women’s Roles and Leadership in Social Forestry through Community-Based Climate Mitigation</w:t>
       </w:r>
     </w:p>
     <w:p>
@@ -90,7 +107,7 @@
           <w:iCs/>
           <w:lang w:val="id-ID"/>
         </w:rPr>
-        <w:t xml:space="preserve">November 2026 – Juni 2027</w:t>
+        <w:t xml:space="preserve">November 2026 – Juli 2027</w:t>
       </w:r>
     </w:p>
     <w:p>
@@ -129,35 +146,7 @@
         <w:rPr>
           <w:lang w:val="id-ID"/>
         </w:rPr>
-        <w:t xml:space="preserve">SAMPAN Kalimantan sedang mengembangkan program karbon berbasis masyarakat (community carbon) di Desa Pasir, Kecamatan Mempawah Hilir, Kabupaten Mempawah, Kalimantan Barat. Program ini berangkat dari pendampingan SAMPAN bersama masyarakat pesisir Desa Pasir dalam perlindungan dan pemulihan ekosistem mangrove pada areal seluas </w:t>
-      </w:r>
-      <w:r>
-        <w:rPr>
-          <w:i/>
-          <w:iCs/>
-          <w:lang w:val="id-ID"/>
-        </w:rPr>
-        <w:t xml:space="preserve">[± … ha]</w:t>
-      </w:r>
-      <w:r>
-        <w:rPr>
-          <w:lang w:val="id-ID"/>
-        </w:rPr>
-        <w:t xml:space="preserve"> yang dikelola oleh </w:t>
-      </w:r>
-      <w:r>
-        <w:rPr>
-          <w:i/>
-          <w:iCs/>
-          <w:lang w:val="id-ID"/>
-        </w:rPr>
-        <w:t xml:space="preserve">[nama kelompok/lembaga pengelola masyarakat]</w:t>
-      </w:r>
-      <w:r>
-        <w:rPr>
-          <w:lang w:val="id-ID"/>
-        </w:rPr>
-        <w:t xml:space="preserve">. Melalui sertifikasi karbon, upaya tersebut diharapkan memperoleh pengakuan dan sumber pendanaan jangka panjang yang manfaatnya kembali kepada masyarakat. Skema yang dipilih adalah Standar Plan Vivo (PV Climate), standar yang dirancang khusus untuk proyek berbasis masyarakat dan mensyaratkan sebagian besar manfaat dari penjualan sertifikat diterima oleh masyarakat.</w:t>
+        <w:t xml:space="preserve">Melalui dukungan Program SETAPAK – The Asia Foundation periode Agustus 2026 – Juli 2027, SAMPAN Kalimantan menjalankan program Strengthening Women’s Roles and Leadership in Social Forestry through Community-Based Climate Mitigation di Desa Pasir, Kabupaten Mempawah, Kalimantan Barat. Program ini mengembangkan Hutan Desa (HD) Pasir sebagai model aksi mitigasi perubahan iklim melalui perdagangan karbon berbasis masyarakat (community carbon), dengan Lembaga Pengelola Hutan Desa (LPHD) Pasir sebagai pemegang hak, pengelola utama, dan penerima manfaat utama. Persetujuan Pengelolaan HD Pasir diterbitkan melalui SK.10885/MENLHK-PSKL/PKPS/PSL.0/2019 untuk areal seluas ± 2.468,51 ha, dengan RKPS 2020–2029 dan RKT 2026 yang telah memuat rencana pemanfaatan jasa lingkungan penyerapan dan penyimpanan karbon.</w:t>
       </w:r>
     </w:p>
     <w:p>
@@ -172,7 +161,7 @@
         <w:rPr>
           <w:lang w:val="id-ID"/>
         </w:rPr>
-        <w:t xml:space="preserve">Untuk masuk ke dalam sistem sertifikasi Plan Vivo, SAMPAN perlu menyusun dua dokumen kunci. Project Idea Note (PIN) diajukan kepada Plan Vivo Foundation sebagai tahap awal penilaian kelayakan proyek, sedangkan Project Design Document (PDD) merupakan dokumen desain lengkap yang menjadi dasar validasi oleh lembaga validasi/verifikasi independen. Kedua dokumen menuntut kapasitas teknis yang spesifik: penetapan batas proyek dan skenario baseline, pembuktian additionality, perhitungan stok dan serapan karbon, analisis kebocoran (leakage) dan risiko non-permanen, rencana pemantauan, safeguards sosial dan lingkungan termasuk Persetujuan Atas Dasar Informasi Awal Tanpa Paksaan (PADIATAPA/FPIC), serta tata kelola dan mekanisme pembagian manfaat. Tim SAMPAN memiliki penguasaan lapangan dan kedekatan dengan masyarakat, tetapi belum memiliki pengalaman menyusun dokumen proyek sesuai persyaratan PV Climate.</w:t>
+        <w:t xml:space="preserve">Kawasan ini didominasi ekosistem gambut seluas 2.014,34 ha (81,60%). Sekitar 1.482,18 ha (60,04%) masih berupa hutan, sedangkan hampir 40% lainnya berupa semak belukar, perkebunan sawit, dan lahan terbuka. Pembagian kawasan menetapkan 1.299,01 ha untuk perlindungan dan 1.169,49 ha untuk rehabilitasi, sehingga desain proyek memadukan perlindungan hutan (pengurangan emisi dari deforestasi dan degradasi, termasuk gambut) dengan pemulihan ekosistem pada areal terdegradasi. Hasil pre-assessment menunjukkan potensi stok karbon biomassa hidup sekitar 773.000–835.000 tCO₂e, di luar karbon tanah gambut, serta potensi emisi dekomposisi gambut sekitar 76.961 tCO₂e per tahun. Kawasan ini juga merupakan habitat Orangutan Kalimantan, Trenggiling Sunda, Beruang Madu, dan Rangkong Gading.</w:t>
       </w:r>
     </w:p>
     <w:p>
@@ -187,7 +176,7 @@
         <w:rPr>
           <w:lang w:val="id-ID"/>
         </w:rPr>
-        <w:t xml:space="preserve">SAMPAN memilih agar PIN dan PDD ditulis oleh tim SAMPAN sendiri. Pilihan ini penting karena proyek Plan Vivo berjalan dalam jangka panjang dan menuntut pemantauan serta pelaporan berkala oleh pengelola proyek; pengetahuan dan kepemilikan atas desain proyek harus tinggal di SAMPAN dan masyarakat, bukan pada pihak luar. Namun tanpa pendampingan ahli, dokumen berisiko direvisi berulang kali pada tahap review Plan Vivo maupun validasi, yang menambah biaya dan menunda akses pendanaan. Perhitungan karbon yang tidak tepat juga dapat menimbulkan klaim berlebih yang merugikan kredibilitas proyek. Selain itu, desain proyek perlu selaras dengan ketentuan nasional tentang Nilai Ekonomi Karbon, termasuk pencatatan pada Sistem Registri Nasional Pengendalian Perubahan Iklim (SRN-PPI).</w:t>
+        <w:t xml:space="preserve">Output 2 program menargetkan penyiapan proyek karbon masyarakat sesuai persyaratan registri nasional dan internasional. Plan Vivo (PV Climate) dipilih sebagai registri internasional karena dirancang untuk proyek berbasis masyarakat dan memiliki akses pasar yang lebih luas. Penyusunan PIN dan PDD menuntut kapasitas teknis yang spesifik: penetapan batas proyek dan skenario baseline, additionality, kuantifikasi karbon hutan dan gambut, kebocoran (leakage), risiko non-permanen, rencana pemantauan (MRV), safeguards termasuk FPIC, mekanisme penanganan keluhan, GEDSI, serta mekanisme pembagian manfaat. Desain proyek juga harus konsisten dengan persyaratan nasional, yakni Persetujuan Perdagangan Karbon dari Kementerian Kehutanan dan pendaftaran pada Sistem Registri Unit Karbon (SRUK), sebagaimana diatur dalam Perpres Nomor 110 Tahun 2025 dan Permen Kehutanan Nomor 6 Tahun 2026.</w:t>
       </w:r>
     </w:p>
     <w:p>
@@ -202,7 +191,7 @@
         <w:rPr>
           <w:lang w:val="id-ID"/>
         </w:rPr>
-        <w:t xml:space="preserve">Berdasarkan kondisi tersebut, SAMPAN Kalimantan akan melibatkan </w:t>
+        <w:t xml:space="preserve">Sesuai prinsip community carbon, SAMPAN memutuskan PIN dan PDD ditulis oleh tim SAMPAN bersama Community Carbon Action Leaders (CCAL) Desa Pasir, agar pengetahuan dan kendali atas desain proyek tetap berada di SAMPAN dan masyarakat untuk masa proyek yang panjang. Namun tanpa pendampingan ahli, dokumen berisiko direvisi berulang kali pada tahap review Plan Vivo maupun validasi, padahal periode program berakhir Juli 2027. Karena itu, SAMPAN Kalimantan akan melibatkan </w:t>
       </w:r>
       <w:r>
         <w:rPr>
@@ -216,7 +205,7 @@
         <w:rPr>
           <w:lang w:val="id-ID"/>
         </w:rPr>
-        <w:t xml:space="preserve"> untuk mendampingi penyusunan PIN dan PDD. Seluruh penulisan dokumen dilakukan oleh tim SAMPAN; TAT berperan sebagai penasihat, pelatih, reviewer, dan penjamin mutu (QA/QC) yang memastikan setiap persyaratan PV Climate terpenuhi. Pendampingan dilakukan dengan pendekatan belajar sambil bekerja (learning by doing) melalui pelatihan, coaching berkala, review berjenjang, dan pendampingan lapangan di Desa Pasir. Kegiatan ini diharapkan menghasilkan PIN yang dapat diajukan kepada Plan Vivo Foundation dan PDD yang siap validasi, sekaligus tim SAMPAN yang mampu mengelola siklus proyek secara mandiri.</w:t>
+        <w:t xml:space="preserve"> yang berperan sebagai penasihat, pelatih, reviewer, dan penjamin mutu (QA/QC) untuk memastikan setiap persyaratan PV Climate terpenuhi. Pendampingan dilakukan dengan pendekatan belajar sambil bekerja (learning by doing) melalui pelatihan, coaching, review berjenjang, dan pendampingan lapangan, dengan hasil akhir PIN yang diajukan kepada Plan Vivo Foundation dan PDD yang siap validasi.</w:t>
       </w:r>
     </w:p>
     <w:p>
@@ -260,7 +249,7 @@
         <w:rPr>
           <w:lang w:val="id-ID"/>
         </w:rPr>
-        <w:t xml:space="preserve">Memperkuat pemahaman tim SAMPAN dan perwakilan masyarakat Desa Pasir tentang persyaratan Standar Plan Vivo (PV Climate) serta siklus proyek, mulai dari PIN, PDD, validasi, hingga verifikasi.</w:t>
+        <w:t xml:space="preserve">Memperkuat pemahaman tim SAMPAN, LPHD Pasir, dan CCAL tentang persyaratan Standar Plan Vivo (PV Climate), siklus proyek dari PIN hingga verifikasi, serta keterkaitannya dengan persyaratan nasional (Persetujuan Perdagangan Karbon dan SRUK).</w:t>
       </w:r>
     </w:p>
     <w:p>
@@ -280,7 +269,7 @@
         <w:rPr>
           <w:lang w:val="id-ID"/>
         </w:rPr>
-        <w:t xml:space="preserve">Meningkatkan kapasitas teknis tim SAMPAN dalam menyusun komponen PIN dan PDD, termasuk perhitungan karbon, rencana pemantauan, safeguards, dan mekanisme pembagian manfaat, melalui pelatihan dan pendampingan langsung.</w:t>
+        <w:t xml:space="preserve">Meningkatkan kapasitas teknis tim SAMPAN dan CCAL dalam menyusun komponen PIN dan PDD, termasuk desain dan pengolahan data baseline, kuantifikasi karbon hutan dan gambut, rencana pemantauan, safeguards, GEDSI, dan pembagian manfaat.</w:t>
       </w:r>
     </w:p>
     <w:p>
@@ -300,7 +289,7 @@
         <w:rPr>
           <w:lang w:val="id-ID"/>
         </w:rPr>
-        <w:t xml:space="preserve">Memastikan PIN dan PDD yang disusun tim SAMPAN memenuhi persyaratan PV Climate melalui review teknis dan QA/QC, sehingga PIN dapat diajukan kepada Plan Vivo Foundation dan PDD siap memasuki tahap validasi.</w:t>
+        <w:t xml:space="preserve">Memastikan PIN dan PDD yang disusun tim SAMPAN memenuhi persyaratan PV Climate melalui review teknis dan QA/QC, sehingga PIN dapat diajukan kepada Plan Vivo Foundation dan PDD siap memasuki tahap validasi sebelum program berakhir pada Juli 2027.</w:t>
       </w:r>
     </w:p>
     <w:p>
@@ -344,7 +333,7 @@
         <w:rPr>
           <w:lang w:val="id-ID"/>
         </w:rPr>
-        <w:t xml:space="preserve">Tim SAMPAN (minimal </w:t>
+        <w:t xml:space="preserve">Tim SAMPAN, pengurus LPHD Pasir, dan CCAL (minimal </w:t>
       </w:r>
       <w:r>
         <w:rPr>
@@ -352,13 +341,13 @@
           <w:iCs/>
           <w:lang w:val="id-ID"/>
         </w:rPr>
-        <w:t xml:space="preserve">[5]</w:t>
+        <w:t xml:space="preserve">[…]</w:t>
       </w:r>
       <w:r>
         <w:rPr>
           <w:lang w:val="id-ID"/>
         </w:rPr>
-        <w:t xml:space="preserve"> orang) dan perwakilan masyarakat memahami persyaratan PV Climate dan alur sertifikasi, dibuktikan dengan laporan pelatihan dan hasil pre-test/post-test, serta tersedianya matriks analisis kesenjangan (gap analysis) kesiapan proyek.</w:t>
+        <w:t xml:space="preserve"> orang, dengan keterwakilan perempuan minimal 40%) memahami persyaratan PV Climate dan alur sertifikasi, dibuktikan dengan laporan pelatihan dan hasil pre-test/post-test, serta tersedianya matriks analisis kesenjangan (gap analysis) kesiapan proyek.</w:t>
       </w:r>
     </w:p>
     <w:p>
@@ -378,7 +367,7 @@
         <w:rPr>
           <w:lang w:val="id-ID"/>
         </w:rPr>
-        <w:t xml:space="preserve">Tim SAMPAN mampu menyusun sendiri setiap bab PIN dan PDD, termasuk menjalankan perhitungan karbon dan menyusun rencana pemantauan, dengan dukungan modul pelatihan, templat, dan alat bantu perhitungan yang dapat digunakan kembali.</w:t>
+        <w:t xml:space="preserve">Tim SAMPAN dan CCAL mampu menyusun sendiri setiap bab PIN dan PDD, didukung protokol pengambilan data baseline yang telah direview, modul pelatihan, templat, dan alat bantu perhitungan karbon yang dapat digunakan kembali.</w:t>
       </w:r>
     </w:p>
     <w:p>
@@ -398,7 +387,7 @@
         <w:rPr>
           <w:lang w:val="id-ID"/>
         </w:rPr>
-        <w:t xml:space="preserve">PIN final yang telah lolos QA/QC dan diajukan kepada Plan Vivo Foundation beserta tanggapan atas hasil review-nya, serta PDD final yang telah lolos QA/QC dan dinyatakan siap validasi, dilengkapi matriks kepatuhan (compliance matrix) terhadap persyaratan PV Climate.</w:t>
+        <w:t xml:space="preserve">PIN final yang telah lolos QA/QC dan diajukan kepada Plan Vivo Foundation beserta tanggapan atas hasil review-nya, serta PDD final yang telah lolos QA/QC dan dinyatakan siap validasi, dilengkapi matriks kepatuhan (compliance matrix) terhadap PV Climate dan catatan konsistensi dengan DRAM untuk pendaftaran SRUK.</w:t>
       </w:r>
     </w:p>
     <w:p>
@@ -437,7 +426,22 @@
         <w:rPr>
           <w:lang w:val="id-ID"/>
         </w:rPr>
-        <w:t xml:space="preserve">Pekerjaan ini menggunakan skema pendampingan: </w:t>
+        <w:t xml:space="preserve">Pekerjaan TAT mendukung kegiatan Output 2 program, yaitu 2.1.1 Capacity Building CCAL, 2.2.1 Pengambilan Data Baseline, 2.3.1 Penyusunan DRAM dan/atau Dokumen Desain Proyek Karbon, dan 2.3.3 Fasilitasi Pendaftaran ke Lembaga Registri. Hasil kegiatan Output 1 dan 4, yaitu Pra-FPIC dan FPIC-LSC, dokumen penanganan keluhan dan konflik, mekanisme pembagian manfaat, dan GEDSI Action Plan, menjadi masukan bagi bab safeguards dan tata kelola dalam PDD.</w:t>
+      </w:r>
+    </w:p>
+    <w:p>
+      <w:pPr>
+        <w:spacing w:after="200" w:line="300" w:lineRule="auto"/>
+        <w:jc w:val="both"/>
+        <w:rPr>
+          <w:lang w:val="id-ID"/>
+        </w:rPr>
+      </w:pPr>
+      <w:r>
+        <w:rPr>
+          <w:lang w:val="id-ID"/>
+        </w:rPr>
+        <w:t xml:space="preserve">Skema kerjanya adalah pendampingan: </w:t>
       </w:r>
       <w:r>
         <w:rPr>
@@ -465,7 +469,7 @@
         <w:rPr>
           <w:lang w:val="id-ID"/>
         </w:rPr>
-        <w:t xml:space="preserve">. TAT tidak mengambil alih penulisan; apabila ditemukan kekurangan, TAT menjelaskan bagian yang belum memenuhi persyaratan dan cara memperbaikinya, kemudian tim SAMPAN melakukan perbaikan. Pembagian peran untuk setiap komponen pekerjaan adalah sebagai berikut.</w:t>
+        <w:t xml:space="preserve">. TAT tidak mengambil alih penulisan; apabila ditemukan kekurangan, TAT menjelaskan bagian yang belum memenuhi persyaratan dan cara memperbaikinya, kemudian tim SAMPAN melakukan perbaikan.</w:t>
       </w:r>
     </w:p>
     <w:tbl>
@@ -556,7 +560,7 @@
                 <w:szCs w:val="20"/>
                 <w:lang w:val="id-ID"/>
               </w:rPr>
-              <w:t xml:space="preserve">Tim SAMPAN (Penyusun)</w:t>
+              <w:t xml:space="preserve">Tim SAMPAN dan CCAL (Penyusun)</w:t>
             </w:r>
           </w:p>
         </w:tc>
@@ -669,7 +673,7 @@
                 <w:szCs w:val="20"/>
                 <w:lang w:val="id-ID"/>
               </w:rPr>
-              <w:t xml:space="preserve">Menyusun rencana kerja dan pembagian tugas penulisan; menyediakan dokumen, peta, dan data yang sudah ada.</w:t>
+              <w:t xml:space="preserve">Menyusun rencana kerja dan pembagian tugas penulisan; menyediakan RKPS, RKT, peta, hasil pre-assessment, dan data yang sudah ada.</w:t>
             </w:r>
           </w:p>
         </w:tc>
@@ -703,7 +707,7 @@
                 <w:szCs w:val="20"/>
                 <w:lang w:val="id-ID"/>
               </w:rPr>
-              <w:t xml:space="preserve">Melakukan analisis kesenjangan (gap analysis) terhadap persyaratan PV Climate; memberi masukan atas rencana kerja; menetapkan checklist QA/QC.</w:t>
+              <w:t xml:space="preserve">Melakukan gap analysis terhadap persyaratan PV Climate; memberi masukan atas rencana kerja; menetapkan checklist QA/QC.</w:t>
             </w:r>
           </w:p>
         </w:tc>
@@ -778,7 +782,7 @@
                 <w:szCs w:val="20"/>
                 <w:lang w:val="id-ID"/>
               </w:rPr>
-              <w:t xml:space="preserve">Mengikuti pelatihan dan menerapkannya langsung dalam penulisan.</w:t>
+              <w:t xml:space="preserve">Tim SAMPAN dan CCAL mengikuti pelatihan dan menerapkannya langsung dalam pengambilan data dan penulisan.</w:t>
             </w:r>
           </w:p>
         </w:tc>
@@ -853,7 +857,7 @@
                 <w:szCs w:val="20"/>
                 <w:lang w:val="id-ID"/>
               </w:rPr>
-              <w:t xml:space="preserve">Penulisan PIN dan PDD</w:t>
+              <w:t xml:space="preserve">Data baseline</w:t>
             </w:r>
           </w:p>
         </w:tc>
@@ -887,7 +891,7 @@
                 <w:szCs w:val="20"/>
                 <w:lang w:val="id-ID"/>
               </w:rPr>
-              <w:t xml:space="preserve">Menulis seluruh bab PIN dan PDD sesuai templat Plan Vivo.</w:t>
+              <w:t xml:space="preserve">Melaksanakan inventarisasi karbon hutan, karakteristik gambut dan mangrove, NKT, survei flora-fauna, dan survei sosial (kegiatan 2.2.1).</w:t>
             </w:r>
           </w:p>
         </w:tc>
@@ -921,7 +925,7 @@
                 <w:szCs w:val="20"/>
                 <w:lang w:val="id-ID"/>
               </w:rPr>
-              <w:t xml:space="preserve">Memberi arahan per bab, coaching, dan menjawab pertanyaan teknis.</w:t>
+              <w:t xml:space="preserve">Mereview desain sampling dan protokol lapangan sebelum pengambilan data; memeriksa kualitas data (QA/QC).</w:t>
             </w:r>
           </w:p>
         </w:tc>
@@ -962,7 +966,7 @@
                 <w:szCs w:val="20"/>
                 <w:lang w:val="id-ID"/>
               </w:rPr>
-              <w:t xml:space="preserve">Data dan perhitungan karbon</w:t>
+              <w:t xml:space="preserve">Penulisan PIN dan PDD</w:t>
             </w:r>
           </w:p>
         </w:tc>
@@ -996,7 +1000,7 @@
                 <w:szCs w:val="20"/>
                 <w:lang w:val="id-ID"/>
               </w:rPr>
-              <w:t xml:space="preserve">Melakukan inventarisasi lapangan, pemetaan, pengolahan data, dan perhitungan karbon.</w:t>
+              <w:t xml:space="preserve">Menulis seluruh bab PIN dan PDD sesuai templat Plan Vivo.</w:t>
             </w:r>
           </w:p>
         </w:tc>
@@ -1030,7 +1034,7 @@
                 <w:szCs w:val="20"/>
                 <w:lang w:val="id-ID"/>
               </w:rPr>
-              <w:t xml:space="preserve">Memeriksa desain sampling, pemilihan metodologi, dan perhitungan; melakukan perhitungan ulang atas sampel data (QA/QC).</w:t>
+              <w:t xml:space="preserve">Memberi arahan per bab, coaching, dan menjawab pertanyaan teknis.</w:t>
             </w:r>
           </w:p>
         </w:tc>
@@ -1071,7 +1075,7 @@
                 <w:szCs w:val="20"/>
                 <w:lang w:val="id-ID"/>
               </w:rPr>
-              <w:t xml:space="preserve">Konsultasi masyarakat dan FPIC</w:t>
+              <w:t xml:space="preserve">Kuantifikasi karbon</w:t>
             </w:r>
           </w:p>
         </w:tc>
@@ -1105,7 +1109,7 @@
                 <w:szCs w:val="20"/>
                 <w:lang w:val="id-ID"/>
               </w:rPr>
-              <w:t xml:space="preserve">Memfasilitasi proses PADIATAPA/FPIC, musyawarah desa, dan penyusunan kesepakatan tata kelola serta pembagian manfaat.</w:t>
+              <w:t xml:space="preserve">Melakukan stratifikasi, pemetaan, dan perhitungan baseline, emisi proyek, leakage, dan buffer.</w:t>
             </w:r>
           </w:p>
         </w:tc>
@@ -1139,7 +1143,7 @@
                 <w:szCs w:val="20"/>
                 <w:lang w:val="id-ID"/>
               </w:rPr>
-              <w:t xml:space="preserve">Memberi panduan proses dan memeriksa kecukupan dokumentasi terhadap persyaratan safeguards PV Climate.</w:t>
+              <w:t xml:space="preserve">Mereview pemilihan metodologi dan perhitungan; melakukan perhitungan ulang atas sampel data.</w:t>
             </w:r>
           </w:p>
         </w:tc>
@@ -1180,7 +1184,7 @@
                 <w:szCs w:val="20"/>
                 <w:lang w:val="id-ID"/>
               </w:rPr>
-              <w:t xml:space="preserve">Review dan QA/QC</w:t>
+              <w:t xml:space="preserve">Safeguards, GEDSI, dan pembagian manfaat</w:t>
             </w:r>
           </w:p>
         </w:tc>
@@ -1214,7 +1218,7 @@
                 <w:szCs w:val="20"/>
                 <w:lang w:val="id-ID"/>
               </w:rPr>
-              <w:t xml:space="preserve">Merevisi dokumen berdasarkan catatan review.</w:t>
+              <w:t xml:space="preserve">Memfasilitasi Pra-FPIC, FPIC-LSC, GRM, BSM, dan GEDSI Action Plan bersama LPHD dan masyarakat.</w:t>
             </w:r>
           </w:p>
         </w:tc>
@@ -1248,25 +1252,7 @@
                 <w:szCs w:val="20"/>
                 <w:lang w:val="id-ID"/>
               </w:rPr>
-              <w:t xml:space="preserve">Memberi review tertulis paling lambat </w:t>
-            </w:r>
-            <w:r>
-              <w:rPr>
-                <w:i/>
-                <w:iCs/>
-                <w:sz w:val="20"/>
-                <w:szCs w:val="20"/>
-                <w:lang w:val="id-ID"/>
-              </w:rPr>
-              <w:t xml:space="preserve">[10]</w:t>
-            </w:r>
-            <w:r>
-              <w:rPr>
-                <w:sz w:val="20"/>
-                <w:szCs w:val="20"/>
-                <w:lang w:val="id-ID"/>
-              </w:rPr>
-              <w:t xml:space="preserve"> hari kerja setelah draf diterima; menerbitkan catatan QA/QC dan matriks kepatuhan.</w:t>
+              <w:t xml:space="preserve">Memberi panduan agar proses dan dokumentasinya memenuhi persyaratan PV Climate; mereview bab terkait dalam PDD.</w:t>
             </w:r>
           </w:p>
         </w:tc>
@@ -1307,7 +1293,7 @@
                 <w:szCs w:val="20"/>
                 <w:lang w:val="id-ID"/>
               </w:rPr>
-              <w:t xml:space="preserve">Hubungan dengan Plan Vivo Foundation dan VVB</w:t>
+              <w:t xml:space="preserve">Review dan QA/QC</w:t>
             </w:r>
           </w:p>
         </w:tc>
@@ -1341,7 +1327,7 @@
                 <w:szCs w:val="20"/>
                 <w:lang w:val="id-ID"/>
               </w:rPr>
-              <w:t xml:space="preserve">Mengajukan dokumen dan menjadi kontak resmi proyek.</w:t>
+              <w:t xml:space="preserve">Merevisi dokumen berdasarkan catatan review.</w:t>
             </w:r>
           </w:p>
         </w:tc>
@@ -1375,7 +1361,134 @@
                 <w:szCs w:val="20"/>
                 <w:lang w:val="id-ID"/>
               </w:rPr>
-              <w:t xml:space="preserve">Mendampingi penyusunan tanggapan atas hasil review dan persiapan validasi.</w:t>
+              <w:t xml:space="preserve">Memberi review tertulis paling lambat </w:t>
+            </w:r>
+            <w:r>
+              <w:rPr>
+                <w:i/>
+                <w:iCs/>
+                <w:sz w:val="20"/>
+                <w:szCs w:val="20"/>
+                <w:lang w:val="id-ID"/>
+              </w:rPr>
+              <w:t xml:space="preserve">[10]</w:t>
+            </w:r>
+            <w:r>
+              <w:rPr>
+                <w:sz w:val="20"/>
+                <w:szCs w:val="20"/>
+                <w:lang w:val="id-ID"/>
+              </w:rPr>
+              <w:t xml:space="preserve"> hari kerja setelah draf diterima; menerbitkan catatan QA/QC dan matriks kepatuhan.</w:t>
+            </w:r>
+          </w:p>
+        </w:tc>
+      </w:tr>
+      <w:tr>
+        <w:trPr>
+          <w:cantSplit/>
+        </w:trPr>
+        <w:tc>
+          <w:tcPr>
+            <w:tcW w:w="1900" w:type="dxa"/>
+            <w:tcBorders>
+              <w:top w:val="single" w:sz="4" w:space="0" w:color="999999"/>
+              <w:left w:val="single" w:sz="4" w:space="0" w:color="999999"/>
+              <w:bottom w:val="single" w:sz="4" w:space="0" w:color="999999"/>
+              <w:right w:val="single" w:sz="4" w:space="0" w:color="999999"/>
+            </w:tcBorders>
+            <w:tcMar>
+              <w:top w:w="100" w:type="dxa"/>
+              <w:left w:w="120" w:type="dxa"/>
+              <w:bottom w:w="100" w:type="dxa"/>
+              <w:right w:w="120" w:type="dxa"/>
+            </w:tcMar>
+            <w:vAlign w:val="center"/>
+          </w:tcPr>
+          <w:p>
+            <w:pPr>
+              <w:spacing w:after="40"/>
+              <w:rPr>
+                <w:lang w:val="id-ID"/>
+              </w:rPr>
+            </w:pPr>
+            <w:r>
+              <w:rPr>
+                <w:b/>
+                <w:bCs/>
+                <w:sz w:val="20"/>
+                <w:szCs w:val="20"/>
+                <w:lang w:val="id-ID"/>
+              </w:rPr>
+              <w:t xml:space="preserve">Keselarasan nasional dan registri</w:t>
+            </w:r>
+          </w:p>
+        </w:tc>
+        <w:tc>
+          <w:tcPr>
+            <w:tcW w:w="3563" w:type="dxa"/>
+            <w:tcBorders>
+              <w:top w:val="single" w:sz="4" w:space="0" w:color="999999"/>
+              <w:left w:val="single" w:sz="4" w:space="0" w:color="999999"/>
+              <w:bottom w:val="single" w:sz="4" w:space="0" w:color="999999"/>
+              <w:right w:val="single" w:sz="4" w:space="0" w:color="999999"/>
+            </w:tcBorders>
+            <w:tcMar>
+              <w:top w:w="100" w:type="dxa"/>
+              <w:left w:w="120" w:type="dxa"/>
+              <w:bottom w:w="100" w:type="dxa"/>
+              <w:right w:w="120" w:type="dxa"/>
+            </w:tcMar>
+            <w:vAlign w:val="center"/>
+          </w:tcPr>
+          <w:p>
+            <w:pPr>
+              <w:spacing w:after="40"/>
+              <w:rPr>
+                <w:lang w:val="id-ID"/>
+              </w:rPr>
+            </w:pPr>
+            <w:r>
+              <w:rPr>
+                <w:sz w:val="20"/>
+                <w:szCs w:val="20"/>
+                <w:lang w:val="id-ID"/>
+              </w:rPr>
+              <w:t xml:space="preserve">Menyusun DRAM, mengajukan Persetujuan Perdagangan Karbon dan pendaftaran SRUK; mengajukan PIN/PDD ke Plan Vivo.</w:t>
+            </w:r>
+          </w:p>
+        </w:tc>
+        <w:tc>
+          <w:tcPr>
+            <w:tcW w:w="3563" w:type="dxa"/>
+            <w:tcBorders>
+              <w:top w:val="single" w:sz="4" w:space="0" w:color="999999"/>
+              <w:left w:val="single" w:sz="4" w:space="0" w:color="999999"/>
+              <w:bottom w:val="single" w:sz="4" w:space="0" w:color="999999"/>
+              <w:right w:val="single" w:sz="4" w:space="0" w:color="999999"/>
+            </w:tcBorders>
+            <w:tcMar>
+              <w:top w:w="100" w:type="dxa"/>
+              <w:left w:w="120" w:type="dxa"/>
+              <w:bottom w:w="100" w:type="dxa"/>
+              <w:right w:w="120" w:type="dxa"/>
+            </w:tcMar>
+            <w:vAlign w:val="center"/>
+          </w:tcPr>
+          <w:p>
+            <w:pPr>
+              <w:spacing w:after="40"/>
+              <w:rPr>
+                <w:lang w:val="id-ID"/>
+              </w:rPr>
+            </w:pPr>
+            <w:r>
+              <w:rPr>
+                <w:sz w:val="20"/>
+                <w:szCs w:val="20"/>
+                <w:lang w:val="id-ID"/>
+              </w:rPr>
+              <w:t xml:space="preserve">Mereview konsistensi PDD dengan DRAM; mendampingi tanggapan atas review Plan Vivo dan persiapan validasi.</w:t>
             </w:r>
           </w:p>
         </w:tc>
@@ -1422,7 +1535,7 @@
         <w:rPr>
           <w:lang w:val="id-ID"/>
         </w:rPr>
-        <w:t xml:space="preserve">Pendampingan dilaksanakan secara bertahap mengikuti alur penyusunan dokumen, dengan kombinasi metode berikut:</w:t>
+        <w:t xml:space="preserve">Pendampingan dilaksanakan bertahap mengikuti alur pengambilan data dan penyusunan dokumen, dengan kombinasi metode berikut:</w:t>
       </w:r>
     </w:p>
     <w:p>
@@ -1450,7 +1563,7 @@
         <w:rPr>
           <w:lang w:val="id-ID"/>
         </w:rPr>
-        <w:t xml:space="preserve"> (luring dan daring) tentang PV Climate, struktur PIN/PDD, metodologi karbon mangrove, safeguards, dan pembagian manfaat. Pelatihan dibagi dua tahap: dasar (sebelum penulisan PIN) dan teknis lanjutan (sebelum penulisan PDD).</w:t>
+        <w:t xml:space="preserve"> (luring dan daring) dalam dua tahap: tahap dasar tentang PV Climate, struktur PIN, dan keterkaitan dengan persyaratan nasional; tahap teknis tentang desain baseline, kuantifikasi karbon hutan dan gambut, MRV, safeguards, GEDSI, dan pembagian manfaat. Pelatihan teknis menjadi bagian dari capacity building CCAL (kegiatan 2.1.1).</w:t>
       </w:r>
     </w:p>
     <w:p>
@@ -1478,7 +1591,7 @@
         <w:rPr>
           <w:lang w:val="id-ID"/>
         </w:rPr>
-        <w:t xml:space="preserve"> secara berkala, sekurang-kurangnya dua minggu sekali secara daring, untuk membahas kemajuan dan kendala penulisan per bab.</w:t>
+        <w:t xml:space="preserve"> sekurang-kurangnya dua minggu sekali secara daring untuk membahas kemajuan dan kendala penulisan per bab.</w:t>
       </w:r>
     </w:p>
     <w:p>
@@ -1534,7 +1647,7 @@
         <w:rPr>
           <w:lang w:val="id-ID"/>
         </w:rPr>
-        <w:t xml:space="preserve"> di Desa Pasir untuk uji coba plot sampling, pengecekan batas areal proyek, serta pendampingan konsultasi masyarakat.</w:t>
+        <w:t xml:space="preserve"> di HD Pasir untuk uji coba plot inventarisasi karbon dan pengukuran gambut, pengecekan batas dan stratifikasi areal, serta pendampingan konsultasi masyarakat.</w:t>
       </w:r>
     </w:p>
     <w:p>
@@ -1670,7 +1783,7 @@
                 <w:szCs w:val="20"/>
                 <w:lang w:val="id-ID"/>
               </w:rPr>
-              <w:t xml:space="preserve">November 2026 – Juni 2027 (± 8 bulan), dapat disesuaikan dengan lama proses review oleh Plan Vivo Foundation</w:t>
+              <w:t xml:space="preserve">November 2026 – Juli 2027 (± 9 bulan), berakhir bersamaan dengan periode Program SETAPAK</w:t>
             </w:r>
           </w:p>
         </w:tc>
@@ -1748,7 +1861,7 @@
                 <w:szCs w:val="20"/>
                 <w:lang w:val="id-ID"/>
               </w:rPr>
-              <w:t xml:space="preserve">[± 50–60]</w:t>
+              <w:t xml:space="preserve">[± 55–65]</w:t>
             </w:r>
             <w:r>
               <w:rPr>
@@ -1848,7 +1961,7 @@
                 <w:szCs w:val="20"/>
                 <w:lang w:val="id-ID"/>
               </w:rPr>
-              <w:t xml:space="preserve">Desa Pasir, Kecamatan Mempawah Hilir, Kabupaten Mempawah</w:t>
+              <w:t xml:space="preserve">Desa Pasir dan Hutan Desa Pasir, Kabupaten Mempawah</w:t>
             </w:r>
           </w:p>
           <w:p>
@@ -2179,7 +2292,7 @@
                 <w:szCs w:val="20"/>
                 <w:lang w:val="id-ID"/>
               </w:rPr>
-              <w:t xml:space="preserve">Bulan 1 (Nov 2026)</w:t>
+              <w:t xml:space="preserve">Nov 2026</w:t>
             </w:r>
           </w:p>
         </w:tc>
@@ -2247,7 +2360,7 @@
                 <w:szCs w:val="20"/>
                 <w:lang w:val="id-ID"/>
               </w:rPr>
-              <w:t xml:space="preserve">Rapat awal, telaah dokumen dan data yang ada, analisis kesenjangan terhadap PV Climate, penyepakatan rencana kerja dan checklist QA/QC. Output: laporan inception dan matriks gap analysis.</w:t>
+              <w:t xml:space="preserve">Rapat awal; telaah RKPS, RKT, peta, dan hasil pre-assessment; gap analysis terhadap PV Climate; penyepakatan rencana kerja dan checklist QA/QC. Output: laporan inception dan matriks gap analysis.</w:t>
             </w:r>
           </w:p>
         </w:tc>
@@ -2281,7 +2394,7 @@
                 <w:szCs w:val="20"/>
                 <w:lang w:val="id-ID"/>
               </w:rPr>
-              <w:t xml:space="preserve">TAT; Koordinator Program SAMPAN</w:t>
+              <w:t xml:space="preserve">TAT; Program Manager SAMPAN</w:t>
             </w:r>
           </w:p>
         </w:tc>
@@ -2357,7 +2470,7 @@
                 <w:szCs w:val="20"/>
                 <w:lang w:val="id-ID"/>
               </w:rPr>
-              <w:t xml:space="preserve">Bulan 1 (Nov 2026)</w:t>
+              <w:t xml:space="preserve">Nov 2026</w:t>
             </w:r>
           </w:p>
         </w:tc>
@@ -2425,7 +2538,7 @@
                 <w:szCs w:val="20"/>
                 <w:lang w:val="id-ID"/>
               </w:rPr>
-              <w:t xml:space="preserve">PV Climate dan siklus proyek, struktur PIN, kelayakan dan additionality, gambaran safeguards dan FPIC. Output: modul dan laporan pelatihan.</w:t>
+              <w:t xml:space="preserve">PV Climate dan siklus proyek, struktur PIN, kelayakan dan additionality, keterkaitan dengan Persetujuan Perdagangan Karbon dan SRUK. Output: modul dan laporan pelatihan.</w:t>
             </w:r>
           </w:p>
         </w:tc>
@@ -2535,7 +2648,7 @@
                 <w:szCs w:val="20"/>
                 <w:lang w:val="id-ID"/>
               </w:rPr>
-              <w:t xml:space="preserve">Bulan 2–3 (Des 2026 – Jan 2027)</w:t>
+              <w:t xml:space="preserve">Des 2026 – Jan 2027</w:t>
             </w:r>
           </w:p>
         </w:tc>
@@ -2569,7 +2682,7 @@
                 <w:szCs w:val="20"/>
                 <w:lang w:val="id-ID"/>
               </w:rPr>
-              <w:t xml:space="preserve">Penulisan PIN dengan pendampingan</w:t>
+              <w:t xml:space="preserve">Pelatihan tahap 2 (teknis) dan review desain baseline</w:t>
             </w:r>
           </w:p>
         </w:tc>
@@ -2603,7 +2716,7 @@
                 <w:szCs w:val="20"/>
                 <w:lang w:val="id-ID"/>
               </w:rPr>
-              <w:t xml:space="preserve">Tim SAMPAN menulis PIN; coaching berkala; review draf 1 dan draf 2; QA/QC. Output: PIN final siap ajukan.</w:t>
+              <w:t xml:space="preserve">Pelatihan CCAL tentang desain sampling, inventarisasi karbon, dan pengukuran gambut; review protokol data baseline sebelum turun lapangan; uji coba plot di HD Pasir. Output: protokol baseline yang direview dan laporan pelatihan.</w:t>
             </w:r>
           </w:p>
         </w:tc>
@@ -2637,7 +2750,7 @@
                 <w:szCs w:val="20"/>
                 <w:lang w:val="id-ID"/>
               </w:rPr>
-              <w:t xml:space="preserve">Tim SAMPAN; TAT (review)</w:t>
+              <w:t xml:space="preserve">TAT; Tim SAMPAN; CCAL</w:t>
             </w:r>
           </w:p>
         </w:tc>
@@ -2713,7 +2826,7 @@
                 <w:szCs w:val="20"/>
                 <w:lang w:val="id-ID"/>
               </w:rPr>
-              <w:t xml:space="preserve">Bulan 3–4 (Jan – Feb 2027)</w:t>
+              <w:t xml:space="preserve">Des 2026 – Feb 2027</w:t>
             </w:r>
           </w:p>
         </w:tc>
@@ -2747,7 +2860,7 @@
                 <w:szCs w:val="20"/>
                 <w:lang w:val="id-ID"/>
               </w:rPr>
-              <w:t xml:space="preserve">Pengajuan PIN dan tindak lanjut review</w:t>
+              <w:t xml:space="preserve">Penulisan PIN dengan pendampingan</w:t>
             </w:r>
           </w:p>
         </w:tc>
@@ -2781,7 +2894,7 @@
                 <w:szCs w:val="20"/>
                 <w:lang w:val="id-ID"/>
               </w:rPr>
-              <w:t xml:space="preserve">Pengajuan PIN kepada Plan Vivo Foundation; penyusunan tanggapan atas hasil review. Output: matriks tanggapan review PIN.</w:t>
+              <w:t xml:space="preserve">Tim SAMPAN menulis PIN berbasis data pre-assessment; coaching; review draf 1 dan draf 2; QA/QC. Output: PIN final siap ajukan.</w:t>
             </w:r>
           </w:p>
         </w:tc>
@@ -2815,7 +2928,7 @@
                 <w:szCs w:val="20"/>
                 <w:lang w:val="id-ID"/>
               </w:rPr>
-              <w:t xml:space="preserve">SAMPAN; TAT (pendamping)</w:t>
+              <w:t xml:space="preserve">Tim SAMPAN; TAT (review)</w:t>
             </w:r>
           </w:p>
         </w:tc>
@@ -2891,7 +3004,7 @@
                 <w:szCs w:val="20"/>
                 <w:lang w:val="id-ID"/>
               </w:rPr>
-              <w:t xml:space="preserve">Bulan 4 (Feb – Mar 2027)</w:t>
+              <w:t xml:space="preserve">Feb – Apr 2027</w:t>
             </w:r>
           </w:p>
         </w:tc>
@@ -2925,7 +3038,7 @@
                 <w:szCs w:val="20"/>
                 <w:lang w:val="id-ID"/>
               </w:rPr>
-              <w:t xml:space="preserve">Pelatihan tahap 2 (teknis) dan pendampingan lapangan</w:t>
+              <w:t xml:space="preserve">Pengajuan PIN dan QA/QC data baseline</w:t>
             </w:r>
           </w:p>
         </w:tc>
@@ -2959,7 +3072,7 @@
                 <w:szCs w:val="20"/>
                 <w:lang w:val="id-ID"/>
               </w:rPr>
-              <w:t xml:space="preserve">Stratifikasi dan desain sampling, perhitungan karbon, leakage, risiko non-permanen, rencana pemantauan, tata kelola dan pembagian manfaat; uji coba plot di Desa Pasir. Output: laporan pelatihan dan protokol lapangan.</w:t>
+              <w:t xml:space="preserve">Pengajuan PIN kepada Plan Vivo Foundation dan penyusunan tanggapan atas review; QA/QC data baseline hasil kegiatan 2.2.1. Output: matriks tanggapan review PIN dan catatan QA/QC data.</w:t>
             </w:r>
           </w:p>
         </w:tc>
@@ -2993,7 +3106,7 @@
                 <w:szCs w:val="20"/>
                 <w:lang w:val="id-ID"/>
               </w:rPr>
-              <w:t xml:space="preserve">TAT; Tim SAMPAN</w:t>
+              <w:t xml:space="preserve">SAMPAN; TAT (pendamping)</w:t>
             </w:r>
           </w:p>
         </w:tc>
@@ -3069,7 +3182,7 @@
                 <w:szCs w:val="20"/>
                 <w:lang w:val="id-ID"/>
               </w:rPr>
-              <w:t xml:space="preserve">Bulan 4–7 (Mar – Mei 2027)</w:t>
+              <w:t xml:space="preserve">Mar – Jun 2027</w:t>
             </w:r>
           </w:p>
         </w:tc>
@@ -3137,7 +3250,7 @@
                 <w:szCs w:val="20"/>
                 <w:lang w:val="id-ID"/>
               </w:rPr>
-              <w:t xml:space="preserve">Tim SAMPAN menulis PDD per bab; konsultasi masyarakat dan FPIC; review per bab dan QA/QC perhitungan karbon. Output: draf PDD lengkap dan catatan QA/QC.</w:t>
+              <w:t xml:space="preserve">Tim SAMPAN menulis PDD per bab, memasukkan hasil FPIC-LSC, GRM, BSM, dan GEDSI Action Plan; review per bab dan QA/QC perhitungan karbon. Output: draf PDD lengkap dan catatan QA/QC.</w:t>
             </w:r>
           </w:p>
         </w:tc>
@@ -3247,7 +3360,7 @@
                 <w:szCs w:val="20"/>
                 <w:lang w:val="id-ID"/>
               </w:rPr>
-              <w:t xml:space="preserve">Bulan 8 (Jun 2027)</w:t>
+              <w:t xml:space="preserve">Jul 2027</w:t>
             </w:r>
           </w:p>
         </w:tc>
@@ -3315,7 +3428,7 @@
                 <w:szCs w:val="20"/>
                 <w:lang w:val="id-ID"/>
               </w:rPr>
-              <w:t xml:space="preserve">Review akhir, matriks kepatuhan PV Climate, pre-validation check. Output: PDD final siap validasi.</w:t>
+              <w:t xml:space="preserve">Review akhir, matriks kepatuhan PV Climate, pemeriksaan konsistensi dengan DRAM, pre-validation check. Output: PDD final siap validasi.</w:t>
             </w:r>
           </w:p>
         </w:tc>
@@ -3425,7 +3538,7 @@
                 <w:szCs w:val="20"/>
                 <w:lang w:val="id-ID"/>
               </w:rPr>
-              <w:t xml:space="preserve">Bulan 8 (Jun 2027)</w:t>
+              <w:t xml:space="preserve">Jul 2027</w:t>
             </w:r>
           </w:p>
         </w:tc>
@@ -3493,7 +3606,7 @@
                 <w:szCs w:val="20"/>
                 <w:lang w:val="id-ID"/>
               </w:rPr>
-              <w:t xml:space="preserve">Laporan akhir pendampingan, refleksi peningkatan kapasitas, dan rekomendasi tahap validasi dan pemantauan. Output: laporan akhir TAT.</w:t>
+              <w:t xml:space="preserve">Laporan akhir pendampingan, refleksi peningkatan kapasitas, dan rekomendasi tahap validasi, pendaftaran, dan pemantauan. Output: laporan akhir TAT.</w:t>
             </w:r>
           </w:p>
         </w:tc>
@@ -3852,7 +3965,7 @@
                 <w:szCs w:val="20"/>
                 <w:lang w:val="id-ID"/>
               </w:rPr>
-              <w:t xml:space="preserve">Akhir Bulan 1</w:t>
+              <w:t xml:space="preserve">Akhir Nov 2026</w:t>
             </w:r>
           </w:p>
         </w:tc>
@@ -3964,7 +4077,7 @@
                 <w:szCs w:val="20"/>
                 <w:lang w:val="id-ID"/>
               </w:rPr>
-              <w:t xml:space="preserve">Modul dan laporan pelatihan tahap 1</w:t>
+              <w:t xml:space="preserve">Modul dan laporan pelatihan tahap 1 dan tahap 2, serta catatan review protokol data baseline</w:t>
             </w:r>
           </w:p>
         </w:tc>
@@ -3998,7 +4111,7 @@
                 <w:szCs w:val="20"/>
                 <w:lang w:val="id-ID"/>
               </w:rPr>
-              <w:t xml:space="preserve">Akhir Bulan 1</w:t>
+              <w:t xml:space="preserve">Jan 2027</w:t>
             </w:r>
           </w:p>
         </w:tc>
@@ -4034,7 +4147,7 @@
                 <w:szCs w:val="20"/>
                 <w:lang w:val="id-ID"/>
               </w:rPr>
-              <w:t xml:space="preserve">[10%]</w:t>
+              <w:t xml:space="preserve">[15%]</w:t>
             </w:r>
           </w:p>
         </w:tc>
@@ -4110,7 +4223,7 @@
                 <w:szCs w:val="20"/>
                 <w:lang w:val="id-ID"/>
               </w:rPr>
-              <w:t xml:space="preserve">Catatan review dan QA/QC PIN, pernyataan PIN siap ajukan, serta matriks tanggapan atas review Plan Vivo</w:t>
+              <w:t xml:space="preserve">Catatan review dan QA/QC PIN, pernyataan PIN siap ajukan, dan matriks tanggapan atas review Plan Vivo</w:t>
             </w:r>
           </w:p>
         </w:tc>
@@ -4144,7 +4257,7 @@
                 <w:szCs w:val="20"/>
                 <w:lang w:val="id-ID"/>
               </w:rPr>
-              <w:t xml:space="preserve">Bulan 3–4</w:t>
+              <w:t xml:space="preserve">Feb – Apr 2027</w:t>
             </w:r>
           </w:p>
         </w:tc>
@@ -4256,7 +4369,7 @@
                 <w:szCs w:val="20"/>
                 <w:lang w:val="id-ID"/>
               </w:rPr>
-              <w:t xml:space="preserve">Modul dan laporan pelatihan tahap 2, protokol lapangan, laporan pendampingan lapangan</w:t>
+              <w:t xml:space="preserve">Catatan QA/QC data baseline dan catatan review per bab PDD</w:t>
             </w:r>
           </w:p>
         </w:tc>
@@ -4290,7 +4403,7 @@
                 <w:szCs w:val="20"/>
                 <w:lang w:val="id-ID"/>
               </w:rPr>
-              <w:t xml:space="preserve">Bulan 4</w:t>
+              <w:t xml:space="preserve">Mei 2027</w:t>
             </w:r>
           </w:p>
         </w:tc>
@@ -4402,7 +4515,7 @@
                 <w:szCs w:val="20"/>
                 <w:lang w:val="id-ID"/>
               </w:rPr>
-              <w:t xml:space="preserve">Catatan review per bab PDD, laporan QA/QC perhitungan karbon, matriks kepatuhan PV Climate, dan pernyataan PDD siap validasi</w:t>
+              <w:t xml:space="preserve">Laporan QA/QC perhitungan karbon, matriks kepatuhan PV Climate, catatan konsistensi dengan DRAM, dan pernyataan PDD siap validasi</w:t>
             </w:r>
           </w:p>
         </w:tc>
@@ -4436,7 +4549,7 @@
                 <w:szCs w:val="20"/>
                 <w:lang w:val="id-ID"/>
               </w:rPr>
-              <w:t xml:space="preserve">Bulan 8</w:t>
+              <w:t xml:space="preserve">Jul 2027</w:t>
             </w:r>
           </w:p>
         </w:tc>
@@ -4472,7 +4585,7 @@
                 <w:szCs w:val="20"/>
                 <w:lang w:val="id-ID"/>
               </w:rPr>
-              <w:t xml:space="preserve">[25%]</w:t>
+              <w:t xml:space="preserve">[20%]</w:t>
             </w:r>
           </w:p>
         </w:tc>
@@ -4582,7 +4695,7 @@
                 <w:szCs w:val="20"/>
                 <w:lang w:val="id-ID"/>
               </w:rPr>
-              <w:t xml:space="preserve">Akhir Bulan 8</w:t>
+              <w:t xml:space="preserve">Akhir Jul 2027</w:t>
             </w:r>
           </w:p>
         </w:tc>
@@ -4641,7 +4754,7 @@
         <w:rPr>
           <w:lang w:val="id-ID"/>
         </w:rPr>
-        <w:t xml:space="preserve">PIN dan PDD disusun oleh tim SAMPAN dalam Bahasa Inggris sesuai templat Plan Vivo; laporan TAT disusun dalam Bahasa Indonesia. Seluruh dokumen, data, peta, dan alat bantu perhitungan yang dihasilkan selama pekerjaan menjadi milik SAMPAN Kalimantan dan masyarakat Desa Pasir. TAT wajib menjaga kerahasiaan data proyek dan masyarakat.</w:t>
+        <w:t xml:space="preserve">PIN dan PDD disusun oleh tim SAMPAN dalam Bahasa Inggris sesuai templat Plan Vivo; laporan TAT disusun dalam Bahasa Indonesia. Seluruh dokumen, data, peta, dan alat bantu perhitungan yang dihasilkan selama pekerjaan menjadi milik SAMPAN Kalimantan dan LPHD Pasir. TAT wajib menjaga kerahasiaan data proyek dan masyarakat. Produk TAT juga menjadi bahan bagi laporan program SAMPAN kepada Program SETAPAK.</w:t>
       </w:r>
     </w:p>
     <w:p>
@@ -4905,13 +5018,11 @@
             </w:pPr>
             <w:r>
               <w:rPr>
-                <w:i/>
-                <w:iCs/>
-                <w:sz w:val="20"/>
-                <w:szCs w:val="20"/>
-                <w:lang w:val="id-ID"/>
-              </w:rPr>
-              <w:t xml:space="preserve">[Nama]</w:t>
+                <w:sz w:val="20"/>
+                <w:szCs w:val="20"/>
+                <w:lang w:val="id-ID"/>
+              </w:rPr>
+              <w:t xml:space="preserve">Fajri Nailus Subchi</w:t>
             </w:r>
           </w:p>
         </w:tc>
@@ -4979,7 +5090,7 @@
                 <w:szCs w:val="20"/>
                 <w:lang w:val="id-ID"/>
               </w:rPr>
-              <w:t xml:space="preserve">Koordinator Program; penanggung jawab penyusunan PIN/PDD</w:t>
+              <w:t xml:space="preserve">Direktur; pengarah dan penanggung jawab kerja sama dengan TAT</w:t>
             </w:r>
           </w:p>
         </w:tc>
@@ -5051,13 +5162,11 @@
             </w:pPr>
             <w:r>
               <w:rPr>
-                <w:i/>
-                <w:iCs/>
-                <w:sz w:val="20"/>
-                <w:szCs w:val="20"/>
-                <w:lang w:val="id-ID"/>
-              </w:rPr>
-              <w:t xml:space="preserve">[Nama]</w:t>
+                <w:sz w:val="20"/>
+                <w:szCs w:val="20"/>
+                <w:lang w:val="id-ID"/>
+              </w:rPr>
+              <w:t xml:space="preserve">Revolia Az-Zahra</w:t>
             </w:r>
           </w:p>
         </w:tc>
@@ -5125,7 +5234,7 @@
                 <w:szCs w:val="20"/>
                 <w:lang w:val="id-ID"/>
               </w:rPr>
-              <w:t xml:space="preserve">Staf teknis karbon/kehutanan; penulis bab teknis dan perhitungan karbon</w:t>
+              <w:t xml:space="preserve">Program Manager; penanggung jawab penyusunan PIN/PDD dan kontak utama TAT</w:t>
             </w:r>
           </w:p>
         </w:tc>
@@ -5197,13 +5306,11 @@
             </w:pPr>
             <w:r>
               <w:rPr>
-                <w:i/>
-                <w:iCs/>
-                <w:sz w:val="20"/>
-                <w:szCs w:val="20"/>
-                <w:lang w:val="id-ID"/>
-              </w:rPr>
-              <w:t xml:space="preserve">[Nama]</w:t>
+                <w:sz w:val="20"/>
+                <w:szCs w:val="20"/>
+                <w:lang w:val="id-ID"/>
+              </w:rPr>
+              <w:t xml:space="preserve">Damar Keina Lebaying</w:t>
             </w:r>
           </w:p>
         </w:tc>
@@ -5271,7 +5378,7 @@
                 <w:szCs w:val="20"/>
                 <w:lang w:val="id-ID"/>
               </w:rPr>
-              <w:t xml:space="preserve">Staf GIS; pemetaan batas proyek dan analisis tutupan lahan</w:t>
+              <w:t xml:space="preserve">Program Officer (MRV &amp; Document Control); penulis dan pengendali dokumen</w:t>
             </w:r>
           </w:p>
         </w:tc>
@@ -5343,13 +5450,11 @@
             </w:pPr>
             <w:r>
               <w:rPr>
-                <w:i/>
-                <w:iCs/>
-                <w:sz w:val="20"/>
-                <w:szCs w:val="20"/>
-                <w:lang w:val="id-ID"/>
-              </w:rPr>
-              <w:t xml:space="preserve">[Nama]</w:t>
+                <w:sz w:val="20"/>
+                <w:szCs w:val="20"/>
+                <w:lang w:val="id-ID"/>
+              </w:rPr>
+              <w:t xml:space="preserve">Ari Bintang Saputra</w:t>
             </w:r>
           </w:p>
         </w:tc>
@@ -5417,7 +5522,7 @@
                 <w:szCs w:val="20"/>
                 <w:lang w:val="id-ID"/>
               </w:rPr>
-              <w:t xml:space="preserve">Fasilitator lapangan; konsultasi masyarakat dan FPIC</w:t>
+              <w:t xml:space="preserve">GIS Manager; batas proyek, tutupan lahan, dan stratifikasi</w:t>
             </w:r>
           </w:p>
         </w:tc>
@@ -5489,13 +5594,11 @@
             </w:pPr>
             <w:r>
               <w:rPr>
-                <w:i/>
-                <w:iCs/>
-                <w:sz w:val="20"/>
-                <w:szCs w:val="20"/>
-                <w:lang w:val="id-ID"/>
-              </w:rPr>
-              <w:t xml:space="preserve">[Nama]</w:t>
+                <w:sz w:val="20"/>
+                <w:szCs w:val="20"/>
+                <w:lang w:val="id-ID"/>
+              </w:rPr>
+              <w:t xml:space="preserve">Desi Albinasari</w:t>
             </w:r>
           </w:p>
         </w:tc>
@@ -5529,7 +5632,7 @@
                 <w:szCs w:val="20"/>
                 <w:lang w:val="id-ID"/>
               </w:rPr>
-              <w:t xml:space="preserve">Pemerintah Desa Pasir</w:t>
+              <w:t xml:space="preserve">SAMPAN Kalimantan</w:t>
             </w:r>
           </w:p>
         </w:tc>
@@ -5563,7 +5666,7 @@
                 <w:szCs w:val="20"/>
                 <w:lang w:val="id-ID"/>
               </w:rPr>
-              <w:t xml:space="preserve">Mitra desa; dukungan legalitas dan musyawarah desa</w:t>
+              <w:t xml:space="preserve">Biodiversity Manager; NKT serta data flora dan fauna</w:t>
             </w:r>
           </w:p>
         </w:tc>
@@ -5635,19 +5738,417 @@
             </w:pPr>
             <w:r>
               <w:rPr>
+                <w:sz w:val="20"/>
+                <w:szCs w:val="20"/>
+                <w:lang w:val="id-ID"/>
+              </w:rPr>
+              <w:t xml:space="preserve">Sigit Budi Martono</w:t>
+            </w:r>
+          </w:p>
+        </w:tc>
+        <w:tc>
+          <w:tcPr>
+            <w:tcW w:w="2700" w:type="dxa"/>
+            <w:tcBorders>
+              <w:top w:val="single" w:sz="4" w:space="0" w:color="999999"/>
+              <w:left w:val="single" w:sz="4" w:space="0" w:color="999999"/>
+              <w:bottom w:val="single" w:sz="4" w:space="0" w:color="999999"/>
+              <w:right w:val="single" w:sz="4" w:space="0" w:color="999999"/>
+            </w:tcBorders>
+            <w:tcMar>
+              <w:top w:w="100" w:type="dxa"/>
+              <w:left w:w="120" w:type="dxa"/>
+              <w:bottom w:w="100" w:type="dxa"/>
+              <w:right w:w="120" w:type="dxa"/>
+            </w:tcMar>
+            <w:vAlign w:val="center"/>
+          </w:tcPr>
+          <w:p>
+            <w:pPr>
+              <w:spacing w:after="40"/>
+              <w:rPr>
+                <w:lang w:val="id-ID"/>
+              </w:rPr>
+            </w:pPr>
+            <w:r>
+              <w:rPr>
+                <w:sz w:val="20"/>
+                <w:szCs w:val="20"/>
+                <w:lang w:val="id-ID"/>
+              </w:rPr>
+              <w:t xml:space="preserve">SAMPAN Kalimantan</w:t>
+            </w:r>
+          </w:p>
+        </w:tc>
+        <w:tc>
+          <w:tcPr>
+            <w:tcW w:w="3326" w:type="dxa"/>
+            <w:tcBorders>
+              <w:top w:val="single" w:sz="4" w:space="0" w:color="999999"/>
+              <w:left w:val="single" w:sz="4" w:space="0" w:color="999999"/>
+              <w:bottom w:val="single" w:sz="4" w:space="0" w:color="999999"/>
+              <w:right w:val="single" w:sz="4" w:space="0" w:color="999999"/>
+            </w:tcBorders>
+            <w:tcMar>
+              <w:top w:w="100" w:type="dxa"/>
+              <w:left w:w="120" w:type="dxa"/>
+              <w:bottom w:w="100" w:type="dxa"/>
+              <w:right w:w="120" w:type="dxa"/>
+            </w:tcMar>
+            <w:vAlign w:val="center"/>
+          </w:tcPr>
+          <w:p>
+            <w:pPr>
+              <w:spacing w:after="40"/>
+              <w:rPr>
+                <w:lang w:val="id-ID"/>
+              </w:rPr>
+            </w:pPr>
+            <w:r>
+              <w:rPr>
+                <w:sz w:val="20"/>
+                <w:szCs w:val="20"/>
+                <w:lang w:val="id-ID"/>
+              </w:rPr>
+              <w:t xml:space="preserve">Community Development; FPIC, GRM, dan pembagian manfaat</w:t>
+            </w:r>
+          </w:p>
+        </w:tc>
+      </w:tr>
+      <w:tr>
+        <w:trPr>
+          <w:cantSplit/>
+        </w:trPr>
+        <w:tc>
+          <w:tcPr>
+            <w:tcW w:w="600" w:type="dxa"/>
+            <w:tcBorders>
+              <w:top w:val="single" w:sz="4" w:space="0" w:color="999999"/>
+              <w:left w:val="single" w:sz="4" w:space="0" w:color="999999"/>
+              <w:bottom w:val="single" w:sz="4" w:space="0" w:color="999999"/>
+              <w:right w:val="single" w:sz="4" w:space="0" w:color="999999"/>
+            </w:tcBorders>
+            <w:tcMar>
+              <w:top w:w="100" w:type="dxa"/>
+              <w:left w:w="120" w:type="dxa"/>
+              <w:bottom w:w="100" w:type="dxa"/>
+              <w:right w:w="120" w:type="dxa"/>
+            </w:tcMar>
+            <w:vAlign w:val="center"/>
+          </w:tcPr>
+          <w:p>
+            <w:pPr>
+              <w:spacing w:after="40"/>
+              <w:jc w:val="center"/>
+              <w:rPr>
+                <w:lang w:val="id-ID"/>
+              </w:rPr>
+            </w:pPr>
+            <w:r>
+              <w:rPr>
+                <w:b/>
+                <w:bCs/>
+                <w:sz w:val="20"/>
+                <w:szCs w:val="20"/>
+                <w:lang w:val="id-ID"/>
+              </w:rPr>
+              <w:t xml:space="preserve">7</w:t>
+            </w:r>
+          </w:p>
+        </w:tc>
+        <w:tc>
+          <w:tcPr>
+            <w:tcW w:w="2400" w:type="dxa"/>
+            <w:tcBorders>
+              <w:top w:val="single" w:sz="4" w:space="0" w:color="999999"/>
+              <w:left w:val="single" w:sz="4" w:space="0" w:color="999999"/>
+              <w:bottom w:val="single" w:sz="4" w:space="0" w:color="999999"/>
+              <w:right w:val="single" w:sz="4" w:space="0" w:color="999999"/>
+            </w:tcBorders>
+            <w:tcMar>
+              <w:top w:w="100" w:type="dxa"/>
+              <w:left w:w="120" w:type="dxa"/>
+              <w:bottom w:w="100" w:type="dxa"/>
+              <w:right w:w="120" w:type="dxa"/>
+            </w:tcMar>
+            <w:vAlign w:val="center"/>
+          </w:tcPr>
+          <w:p>
+            <w:pPr>
+              <w:spacing w:after="40"/>
+              <w:rPr>
+                <w:lang w:val="id-ID"/>
+              </w:rPr>
+            </w:pPr>
+            <w:r>
+              <w:rPr>
+                <w:sz w:val="20"/>
+                <w:szCs w:val="20"/>
+                <w:lang w:val="id-ID"/>
+              </w:rPr>
+              <w:t xml:space="preserve">Reisya Namira</w:t>
+            </w:r>
+          </w:p>
+        </w:tc>
+        <w:tc>
+          <w:tcPr>
+            <w:tcW w:w="2700" w:type="dxa"/>
+            <w:tcBorders>
+              <w:top w:val="single" w:sz="4" w:space="0" w:color="999999"/>
+              <w:left w:val="single" w:sz="4" w:space="0" w:color="999999"/>
+              <w:bottom w:val="single" w:sz="4" w:space="0" w:color="999999"/>
+              <w:right w:val="single" w:sz="4" w:space="0" w:color="999999"/>
+            </w:tcBorders>
+            <w:tcMar>
+              <w:top w:w="100" w:type="dxa"/>
+              <w:left w:w="120" w:type="dxa"/>
+              <w:bottom w:w="100" w:type="dxa"/>
+              <w:right w:w="120" w:type="dxa"/>
+            </w:tcMar>
+            <w:vAlign w:val="center"/>
+          </w:tcPr>
+          <w:p>
+            <w:pPr>
+              <w:spacing w:after="40"/>
+              <w:rPr>
+                <w:lang w:val="id-ID"/>
+              </w:rPr>
+            </w:pPr>
+            <w:r>
+              <w:rPr>
+                <w:sz w:val="20"/>
+                <w:szCs w:val="20"/>
+                <w:lang w:val="id-ID"/>
+              </w:rPr>
+              <w:t xml:space="preserve">SAMPAN Kalimantan</w:t>
+            </w:r>
+          </w:p>
+        </w:tc>
+        <w:tc>
+          <w:tcPr>
+            <w:tcW w:w="3326" w:type="dxa"/>
+            <w:tcBorders>
+              <w:top w:val="single" w:sz="4" w:space="0" w:color="999999"/>
+              <w:left w:val="single" w:sz="4" w:space="0" w:color="999999"/>
+              <w:bottom w:val="single" w:sz="4" w:space="0" w:color="999999"/>
+              <w:right w:val="single" w:sz="4" w:space="0" w:color="999999"/>
+            </w:tcBorders>
+            <w:tcMar>
+              <w:top w:w="100" w:type="dxa"/>
+              <w:left w:w="120" w:type="dxa"/>
+              <w:bottom w:w="100" w:type="dxa"/>
+              <w:right w:w="120" w:type="dxa"/>
+            </w:tcMar>
+            <w:vAlign w:val="center"/>
+          </w:tcPr>
+          <w:p>
+            <w:pPr>
+              <w:spacing w:after="40"/>
+              <w:rPr>
+                <w:lang w:val="id-ID"/>
+              </w:rPr>
+            </w:pPr>
+            <w:r>
+              <w:rPr>
+                <w:sz w:val="20"/>
+                <w:szCs w:val="20"/>
+                <w:lang w:val="id-ID"/>
+              </w:rPr>
+              <w:t xml:space="preserve">Koordinator Pendamping Desa; koordinasi dengan LPHD dan CCAL</w:t>
+            </w:r>
+          </w:p>
+        </w:tc>
+      </w:tr>
+      <w:tr>
+        <w:trPr>
+          <w:cantSplit/>
+        </w:trPr>
+        <w:tc>
+          <w:tcPr>
+            <w:tcW w:w="600" w:type="dxa"/>
+            <w:tcBorders>
+              <w:top w:val="single" w:sz="4" w:space="0" w:color="999999"/>
+              <w:left w:val="single" w:sz="4" w:space="0" w:color="999999"/>
+              <w:bottom w:val="single" w:sz="4" w:space="0" w:color="999999"/>
+              <w:right w:val="single" w:sz="4" w:space="0" w:color="999999"/>
+            </w:tcBorders>
+            <w:tcMar>
+              <w:top w:w="100" w:type="dxa"/>
+              <w:left w:w="120" w:type="dxa"/>
+              <w:bottom w:w="100" w:type="dxa"/>
+              <w:right w:w="120" w:type="dxa"/>
+            </w:tcMar>
+            <w:vAlign w:val="center"/>
+          </w:tcPr>
+          <w:p>
+            <w:pPr>
+              <w:spacing w:after="40"/>
+              <w:jc w:val="center"/>
+              <w:rPr>
+                <w:lang w:val="id-ID"/>
+              </w:rPr>
+            </w:pPr>
+            <w:r>
+              <w:rPr>
+                <w:b/>
+                <w:bCs/>
+                <w:sz w:val="20"/>
+                <w:szCs w:val="20"/>
+                <w:lang w:val="id-ID"/>
+              </w:rPr>
+              <w:t xml:space="preserve">8</w:t>
+            </w:r>
+          </w:p>
+        </w:tc>
+        <w:tc>
+          <w:tcPr>
+            <w:tcW w:w="2400" w:type="dxa"/>
+            <w:tcBorders>
+              <w:top w:val="single" w:sz="4" w:space="0" w:color="999999"/>
+              <w:left w:val="single" w:sz="4" w:space="0" w:color="999999"/>
+              <w:bottom w:val="single" w:sz="4" w:space="0" w:color="999999"/>
+              <w:right w:val="single" w:sz="4" w:space="0" w:color="999999"/>
+            </w:tcBorders>
+            <w:tcMar>
+              <w:top w:w="100" w:type="dxa"/>
+              <w:left w:w="120" w:type="dxa"/>
+              <w:bottom w:w="100" w:type="dxa"/>
+              <w:right w:w="120" w:type="dxa"/>
+            </w:tcMar>
+            <w:vAlign w:val="center"/>
+          </w:tcPr>
+          <w:p>
+            <w:pPr>
+              <w:spacing w:after="40"/>
+              <w:rPr>
+                <w:lang w:val="id-ID"/>
+              </w:rPr>
+            </w:pPr>
+            <w:r>
+              <w:rPr>
                 <w:i/>
                 <w:iCs/>
                 <w:sz w:val="20"/>
                 <w:szCs w:val="20"/>
                 <w:lang w:val="id-ID"/>
               </w:rPr>
-              <w:t xml:space="preserve">[Nama]</w:t>
+              <w:t xml:space="preserve">[Nama Ketua]</w:t>
             </w:r>
           </w:p>
         </w:tc>
         <w:tc>
           <w:tcPr>
             <w:tcW w:w="2700" w:type="dxa"/>
+            <w:tcBorders>
+              <w:top w:val="single" w:sz="4" w:space="0" w:color="999999"/>
+              <w:left w:val="single" w:sz="4" w:space="0" w:color="999999"/>
+              <w:bottom w:val="single" w:sz="4" w:space="0" w:color="999999"/>
+              <w:right w:val="single" w:sz="4" w:space="0" w:color="999999"/>
+            </w:tcBorders>
+            <w:tcMar>
+              <w:top w:w="100" w:type="dxa"/>
+              <w:left w:w="120" w:type="dxa"/>
+              <w:bottom w:w="100" w:type="dxa"/>
+              <w:right w:w="120" w:type="dxa"/>
+            </w:tcMar>
+            <w:vAlign w:val="center"/>
+          </w:tcPr>
+          <w:p>
+            <w:pPr>
+              <w:spacing w:after="40"/>
+              <w:rPr>
+                <w:lang w:val="id-ID"/>
+              </w:rPr>
+            </w:pPr>
+            <w:r>
+              <w:rPr>
+                <w:sz w:val="20"/>
+                <w:szCs w:val="20"/>
+                <w:lang w:val="id-ID"/>
+              </w:rPr>
+              <w:t xml:space="preserve">LPHD Pasir</w:t>
+            </w:r>
+          </w:p>
+        </w:tc>
+        <w:tc>
+          <w:tcPr>
+            <w:tcW w:w="3326" w:type="dxa"/>
+            <w:tcBorders>
+              <w:top w:val="single" w:sz="4" w:space="0" w:color="999999"/>
+              <w:left w:val="single" w:sz="4" w:space="0" w:color="999999"/>
+              <w:bottom w:val="single" w:sz="4" w:space="0" w:color="999999"/>
+              <w:right w:val="single" w:sz="4" w:space="0" w:color="999999"/>
+            </w:tcBorders>
+            <w:tcMar>
+              <w:top w:w="100" w:type="dxa"/>
+              <w:left w:w="120" w:type="dxa"/>
+              <w:bottom w:w="100" w:type="dxa"/>
+              <w:right w:w="120" w:type="dxa"/>
+            </w:tcMar>
+            <w:vAlign w:val="center"/>
+          </w:tcPr>
+          <w:p>
+            <w:pPr>
+              <w:spacing w:after="40"/>
+              <w:rPr>
+                <w:lang w:val="id-ID"/>
+              </w:rPr>
+            </w:pPr>
+            <w:r>
+              <w:rPr>
+                <w:sz w:val="20"/>
+                <w:szCs w:val="20"/>
+                <w:lang w:val="id-ID"/>
+              </w:rPr>
+              <w:t xml:space="preserve">Pemegang persetujuan HD Pasir; pengambil keputusan proyek</w:t>
+            </w:r>
+          </w:p>
+        </w:tc>
+      </w:tr>
+      <w:tr>
+        <w:trPr>
+          <w:cantSplit/>
+        </w:trPr>
+        <w:tc>
+          <w:tcPr>
+            <w:tcW w:w="600" w:type="dxa"/>
+            <w:tcBorders>
+              <w:top w:val="single" w:sz="4" w:space="0" w:color="999999"/>
+              <w:left w:val="single" w:sz="4" w:space="0" w:color="999999"/>
+              <w:bottom w:val="single" w:sz="4" w:space="0" w:color="999999"/>
+              <w:right w:val="single" w:sz="4" w:space="0" w:color="999999"/>
+            </w:tcBorders>
+            <w:tcMar>
+              <w:top w:w="100" w:type="dxa"/>
+              <w:left w:w="120" w:type="dxa"/>
+              <w:bottom w:w="100" w:type="dxa"/>
+              <w:right w:w="120" w:type="dxa"/>
+            </w:tcMar>
+            <w:vAlign w:val="center"/>
+          </w:tcPr>
+          <w:p>
+            <w:pPr>
+              <w:spacing w:after="40"/>
+              <w:jc w:val="center"/>
+              <w:rPr>
+                <w:lang w:val="id-ID"/>
+              </w:rPr>
+            </w:pPr>
+            <w:r>
+              <w:rPr>
+                <w:b/>
+                <w:bCs/>
+                <w:sz w:val="20"/>
+                <w:szCs w:val="20"/>
+                <w:lang w:val="id-ID"/>
+              </w:rPr>
+              <w:t xml:space="preserve">9</w:t>
+            </w:r>
+          </w:p>
+        </w:tc>
+        <w:tc>
+          <w:tcPr>
+            <w:tcW w:w="2400" w:type="dxa"/>
             <w:tcBorders>
               <w:top w:val="single" w:sz="4" w:space="0" w:color="999999"/>
               <w:left w:val="single" w:sz="4" w:space="0" w:color="999999"/>
@@ -5677,7 +6178,41 @@
                 <w:szCs w:val="20"/>
                 <w:lang w:val="id-ID"/>
               </w:rPr>
-              <w:t xml:space="preserve">[Kelompok pengelola mangrove]</w:t>
+              <w:t xml:space="preserve">[… orang]</w:t>
+            </w:r>
+          </w:p>
+        </w:tc>
+        <w:tc>
+          <w:tcPr>
+            <w:tcW w:w="2700" w:type="dxa"/>
+            <w:tcBorders>
+              <w:top w:val="single" w:sz="4" w:space="0" w:color="999999"/>
+              <w:left w:val="single" w:sz="4" w:space="0" w:color="999999"/>
+              <w:bottom w:val="single" w:sz="4" w:space="0" w:color="999999"/>
+              <w:right w:val="single" w:sz="4" w:space="0" w:color="999999"/>
+            </w:tcBorders>
+            <w:tcMar>
+              <w:top w:w="100" w:type="dxa"/>
+              <w:left w:w="120" w:type="dxa"/>
+              <w:bottom w:w="100" w:type="dxa"/>
+              <w:right w:w="120" w:type="dxa"/>
+            </w:tcMar>
+            <w:vAlign w:val="center"/>
+          </w:tcPr>
+          <w:p>
+            <w:pPr>
+              <w:spacing w:after="40"/>
+              <w:rPr>
+                <w:lang w:val="id-ID"/>
+              </w:rPr>
+            </w:pPr>
+            <w:r>
+              <w:rPr>
+                <w:sz w:val="20"/>
+                <w:szCs w:val="20"/>
+                <w:lang w:val="id-ID"/>
+              </w:rPr>
+              <w:t xml:space="preserve">CCAL Desa Pasir</w:t>
             </w:r>
           </w:p>
         </w:tc>
@@ -5711,7 +6246,153 @@
                 <w:szCs w:val="20"/>
                 <w:lang w:val="id-ID"/>
               </w:rPr>
-              <w:t xml:space="preserve">Perwakilan masyarakat pengelola proyek; peserta pelatihan</w:t>
+              <w:t xml:space="preserve">Champion teknis karbon masyarakat; peserta pelatihan dan pengambil data; perempuan minimal 40%</w:t>
+            </w:r>
+          </w:p>
+        </w:tc>
+      </w:tr>
+      <w:tr>
+        <w:trPr>
+          <w:cantSplit/>
+        </w:trPr>
+        <w:tc>
+          <w:tcPr>
+            <w:tcW w:w="600" w:type="dxa"/>
+            <w:tcBorders>
+              <w:top w:val="single" w:sz="4" w:space="0" w:color="999999"/>
+              <w:left w:val="single" w:sz="4" w:space="0" w:color="999999"/>
+              <w:bottom w:val="single" w:sz="4" w:space="0" w:color="999999"/>
+              <w:right w:val="single" w:sz="4" w:space="0" w:color="999999"/>
+            </w:tcBorders>
+            <w:tcMar>
+              <w:top w:w="100" w:type="dxa"/>
+              <w:left w:w="120" w:type="dxa"/>
+              <w:bottom w:w="100" w:type="dxa"/>
+              <w:right w:w="120" w:type="dxa"/>
+            </w:tcMar>
+            <w:vAlign w:val="center"/>
+          </w:tcPr>
+          <w:p>
+            <w:pPr>
+              <w:spacing w:after="40"/>
+              <w:jc w:val="center"/>
+              <w:rPr>
+                <w:lang w:val="id-ID"/>
+              </w:rPr>
+            </w:pPr>
+            <w:r>
+              <w:rPr>
+                <w:b/>
+                <w:bCs/>
+                <w:sz w:val="20"/>
+                <w:szCs w:val="20"/>
+                <w:lang w:val="id-ID"/>
+              </w:rPr>
+              <w:t xml:space="preserve">10</w:t>
+            </w:r>
+          </w:p>
+        </w:tc>
+        <w:tc>
+          <w:tcPr>
+            <w:tcW w:w="2400" w:type="dxa"/>
+            <w:tcBorders>
+              <w:top w:val="single" w:sz="4" w:space="0" w:color="999999"/>
+              <w:left w:val="single" w:sz="4" w:space="0" w:color="999999"/>
+              <w:bottom w:val="single" w:sz="4" w:space="0" w:color="999999"/>
+              <w:right w:val="single" w:sz="4" w:space="0" w:color="999999"/>
+            </w:tcBorders>
+            <w:tcMar>
+              <w:top w:w="100" w:type="dxa"/>
+              <w:left w:w="120" w:type="dxa"/>
+              <w:bottom w:w="100" w:type="dxa"/>
+              <w:right w:w="120" w:type="dxa"/>
+            </w:tcMar>
+            <w:vAlign w:val="center"/>
+          </w:tcPr>
+          <w:p>
+            <w:pPr>
+              <w:spacing w:after="40"/>
+              <w:rPr>
+                <w:lang w:val="id-ID"/>
+              </w:rPr>
+            </w:pPr>
+            <w:r>
+              <w:rPr>
+                <w:i/>
+                <w:iCs/>
+                <w:sz w:val="20"/>
+                <w:szCs w:val="20"/>
+                <w:lang w:val="id-ID"/>
+              </w:rPr>
+              <w:t xml:space="preserve">[Nama]</w:t>
+            </w:r>
+          </w:p>
+        </w:tc>
+        <w:tc>
+          <w:tcPr>
+            <w:tcW w:w="2700" w:type="dxa"/>
+            <w:tcBorders>
+              <w:top w:val="single" w:sz="4" w:space="0" w:color="999999"/>
+              <w:left w:val="single" w:sz="4" w:space="0" w:color="999999"/>
+              <w:bottom w:val="single" w:sz="4" w:space="0" w:color="999999"/>
+              <w:right w:val="single" w:sz="4" w:space="0" w:color="999999"/>
+            </w:tcBorders>
+            <w:tcMar>
+              <w:top w:w="100" w:type="dxa"/>
+              <w:left w:w="120" w:type="dxa"/>
+              <w:bottom w:w="100" w:type="dxa"/>
+              <w:right w:w="120" w:type="dxa"/>
+            </w:tcMar>
+            <w:vAlign w:val="center"/>
+          </w:tcPr>
+          <w:p>
+            <w:pPr>
+              <w:spacing w:after="40"/>
+              <w:rPr>
+                <w:lang w:val="id-ID"/>
+              </w:rPr>
+            </w:pPr>
+            <w:r>
+              <w:rPr>
+                <w:sz w:val="20"/>
+                <w:szCs w:val="20"/>
+                <w:lang w:val="id-ID"/>
+              </w:rPr>
+              <w:t xml:space="preserve">Pemerintah Desa Pasir</w:t>
+            </w:r>
+          </w:p>
+        </w:tc>
+        <w:tc>
+          <w:tcPr>
+            <w:tcW w:w="3326" w:type="dxa"/>
+            <w:tcBorders>
+              <w:top w:val="single" w:sz="4" w:space="0" w:color="999999"/>
+              <w:left w:val="single" w:sz="4" w:space="0" w:color="999999"/>
+              <w:bottom w:val="single" w:sz="4" w:space="0" w:color="999999"/>
+              <w:right w:val="single" w:sz="4" w:space="0" w:color="999999"/>
+            </w:tcBorders>
+            <w:tcMar>
+              <w:top w:w="100" w:type="dxa"/>
+              <w:left w:w="120" w:type="dxa"/>
+              <w:bottom w:w="100" w:type="dxa"/>
+              <w:right w:w="120" w:type="dxa"/>
+            </w:tcMar>
+            <w:vAlign w:val="center"/>
+          </w:tcPr>
+          <w:p>
+            <w:pPr>
+              <w:spacing w:after="40"/>
+              <w:rPr>
+                <w:lang w:val="id-ID"/>
+              </w:rPr>
+            </w:pPr>
+            <w:r>
+              <w:rPr>
+                <w:sz w:val="20"/>
+                <w:szCs w:val="20"/>
+                <w:lang w:val="id-ID"/>
+              </w:rPr>
+              <w:t xml:space="preserve">Mitra desa; dukungan musyawarah dan legalitas</w:t>
             </w:r>
           </w:p>
         </w:tc>
@@ -6086,7 +6767,7 @@
                 <w:szCs w:val="20"/>
                 <w:lang w:val="id-ID"/>
               </w:rPr>
-              <w:t xml:space="preserve"> PIN/PDD pada Plan Vivo atau standar setara; memahami regulasi karbon nasional.</w:t>
+              <w:t xml:space="preserve"> PIN/PDD pada Plan Vivo atau standar setara; memahami regulasi karbon nasional (Persetujuan Perdagangan Karbon dan SRUK).</w:t>
             </w:r>
           </w:p>
         </w:tc>
@@ -6196,7 +6877,7 @@
                 <w:szCs w:val="20"/>
                 <w:lang w:val="id-ID"/>
               </w:rPr>
-              <w:t xml:space="preserve">Ahli Karbon Mangrove dan GIS</w:t>
+              <w:t xml:space="preserve">Ahli Karbon Hutan dan Gambut</w:t>
             </w:r>
           </w:p>
         </w:tc>
@@ -6230,7 +6911,7 @@
                 <w:szCs w:val="20"/>
                 <w:lang w:val="id-ID"/>
               </w:rPr>
-              <w:t xml:space="preserve">Pengalaman inventarisasi biomassa/karbon mangrove dan analisis penginderaan jauh; memahami metodologi karbon biru.</w:t>
+              <w:t xml:space="preserve">Pengalaman inventarisasi karbon hutan, pengukuran gambut, dan kuantifikasi emisi gambut; menguasai GIS dan penginderaan jauh.</w:t>
             </w:r>
           </w:p>
         </w:tc>
@@ -6264,7 +6945,7 @@
                 <w:szCs w:val="20"/>
                 <w:lang w:val="id-ID"/>
               </w:rPr>
-              <w:t xml:space="preserve">Pelatih dan reviewer baseline, sampling, perhitungan karbon, dan rencana pemantauan</w:t>
+              <w:t xml:space="preserve">Pelatih dan reviewer desain baseline, perhitungan karbon, leakage, buffer, dan rencana pemantauan</w:t>
             </w:r>
           </w:p>
         </w:tc>
@@ -6340,7 +7021,7 @@
                 <w:szCs w:val="20"/>
                 <w:lang w:val="id-ID"/>
               </w:rPr>
-              <w:t xml:space="preserve">Ahli Sosial dan Safeguards</w:t>
+              <w:t xml:space="preserve">Ahli Sosial, Safeguards, dan GEDSI</w:t>
             </w:r>
           </w:p>
         </w:tc>
@@ -6374,7 +7055,7 @@
                 <w:szCs w:val="20"/>
                 <w:lang w:val="id-ID"/>
               </w:rPr>
-              <w:t xml:space="preserve">Pengalaman fasilitasi FPIC, tata kelola berbasis masyarakat, dan desain mekanisme pembagian manfaat.</w:t>
+              <w:t xml:space="preserve">Pengalaman fasilitasi FPIC, tata kelola berbasis masyarakat, mekanisme pengaduan, dan desain pembagian manfaat yang responsif gender.</w:t>
             </w:r>
           </w:p>
         </w:tc>
@@ -6408,7 +7089,7 @@
                 <w:szCs w:val="20"/>
                 <w:lang w:val="id-ID"/>
               </w:rPr>
-              <w:t xml:space="preserve">Pelatih dan reviewer safeguards, FPIC, tata kelola, dan pembagian manfaat</w:t>
+              <w:t xml:space="preserve">Pelatih dan reviewer bab safeguards, GEDSI, tata kelola, dan pembagian manfaat</w:t>
             </w:r>
           </w:p>
         </w:tc>
@@ -6455,7 +7136,7 @@
         <w:rPr>
           <w:lang w:val="id-ID"/>
         </w:rPr>
-        <w:t xml:space="preserve">Biaya pekerjaan dibebankan pada </w:t>
+        <w:t xml:space="preserve">Biaya pekerjaan dibebankan pada anggaran Program SETAPAK – The Asia Foundation yang dikelola SAMPAN Kalimantan, Output 2 kegiatan 2.3.1 Penyusunan DRAM dan/atau Dokumen Desain Proyek Karbon </w:t>
       </w:r>
       <w:r>
         <w:rPr>
@@ -6463,13 +7144,13 @@
           <w:iCs/>
           <w:lang w:val="id-ID"/>
         </w:rPr>
-        <w:t xml:space="preserve">[sumber dana/program]</w:t>
+        <w:t xml:space="preserve">[kode budget line]</w:t>
       </w:r>
       <w:r>
         <w:rPr>
           <w:lang w:val="id-ID"/>
         </w:rPr>
-        <w:t xml:space="preserve"> SAMPAN Kalimantan. Nilai kontrak ditetapkan berdasarkan proposal teknis dan biaya yang diajukan TAT. Biaya perjalanan dan akomodasi ke Desa Pasir serta biaya pelatihan luring diatur sesuai ketentuan keuangan SAMPAN Kalimantan.</w:t>
+        <w:t xml:space="preserve">. Nilai kontrak ditetapkan berdasarkan proposal teknis dan biaya yang diajukan TAT. Biaya perjalanan dan akomodasi ke Desa Pasir serta biaya pelatihan luring diatur sesuai ketentuan keuangan SAMPAN Kalimantan dan ketentuan donor.</w:t>
       </w:r>
     </w:p>
     <w:p>

</xml_diff>

<commit_message>
Update SAMPAN team roster in KAK TAT
Co-Authored-By: Claude Opus 5.5 <noreply@anthropic.com>
Claude-Session: https://claude.ai/code/session_016hKM1xZpgjxw9qEmhhTJUQ
</commit_message>
<xml_diff>
--- a/KAK_TAT_PIN_PDD_PlanVivo_Desa_Pasir.docx
+++ b/KAK_TAT_PIN_PDD_PlanVivo_Desa_Pasir.docx
@@ -2394,7 +2394,7 @@
                 <w:szCs w:val="20"/>
                 <w:lang w:val="id-ID"/>
               </w:rPr>
-              <w:t xml:space="preserve">TAT; Program Manager SAMPAN</w:t>
+              <w:t xml:space="preserve">TAT; Revolia (General Document)</w:t>
             </w:r>
           </w:p>
         </w:tc>
@@ -5022,7 +5022,7 @@
                 <w:szCs w:val="20"/>
                 <w:lang w:val="id-ID"/>
               </w:rPr>
-              <w:t xml:space="preserve">Fajri Nailus Subchi</w:t>
+              <w:t xml:space="preserve">Revolia Az-Zahra</w:t>
             </w:r>
           </w:p>
         </w:tc>
@@ -5090,7 +5090,7 @@
                 <w:szCs w:val="20"/>
                 <w:lang w:val="id-ID"/>
               </w:rPr>
-              <w:t xml:space="preserve">Direktur; pengarah dan penanggung jawab kerja sama dengan TAT</w:t>
+              <w:t xml:space="preserve">General Document; koordinator penyusunan PIN/PDD, penulisan bab umum, pengendalian dokumen, dan kontak utama TAT</w:t>
             </w:r>
           </w:p>
         </w:tc>
@@ -5166,7 +5166,7 @@
                 <w:szCs w:val="20"/>
                 <w:lang w:val="id-ID"/>
               </w:rPr>
-              <w:t xml:space="preserve">Revolia Az-Zahra</w:t>
+              <w:t xml:space="preserve">Damar Keina Lebaying</w:t>
             </w:r>
           </w:p>
         </w:tc>
@@ -5234,7 +5234,7 @@
                 <w:szCs w:val="20"/>
                 <w:lang w:val="id-ID"/>
               </w:rPr>
-              <w:t xml:space="preserve">Program Manager; penanggung jawab penyusunan PIN/PDD dan kontak utama TAT</w:t>
+              <w:t xml:space="preserve">Social Safeguard and Community; FPIC, GRM, pembagian manfaat, GEDSI, dan bab sosial PDD</w:t>
             </w:r>
           </w:p>
         </w:tc>
@@ -5310,7 +5310,7 @@
                 <w:szCs w:val="20"/>
                 <w:lang w:val="id-ID"/>
               </w:rPr>
-              <w:t xml:space="preserve">Damar Keina Lebaying</w:t>
+              <w:t xml:space="preserve">Riko</w:t>
             </w:r>
           </w:p>
         </w:tc>
@@ -5378,7 +5378,7 @@
                 <w:szCs w:val="20"/>
                 <w:lang w:val="id-ID"/>
               </w:rPr>
-              <w:t xml:space="preserve">Program Officer (MRV &amp; Document Control); penulis dan pengendali dokumen</w:t>
+              <w:t xml:space="preserve">Biodiversity; NKT, data flora dan fauna, dan bab keanekaragaman hayati</w:t>
             </w:r>
           </w:p>
         </w:tc>
@@ -5454,7 +5454,7 @@
                 <w:szCs w:val="20"/>
                 <w:lang w:val="id-ID"/>
               </w:rPr>
-              <w:t xml:space="preserve">Ari Bintang Saputra</w:t>
+              <w:t xml:space="preserve">Keke</w:t>
             </w:r>
           </w:p>
         </w:tc>
@@ -5522,7 +5522,7 @@
                 <w:szCs w:val="20"/>
                 <w:lang w:val="id-ID"/>
               </w:rPr>
-              <w:t xml:space="preserve">GIS Manager; batas proyek, tutupan lahan, dan stratifikasi</w:t>
+              <w:t xml:space="preserve">Remote Sensing and GIS; batas proyek, tutupan dan perubahan tutupan lahan, serta stratifikasi</w:t>
             </w:r>
           </w:p>
         </w:tc>
@@ -5598,7 +5598,7 @@
                 <w:szCs w:val="20"/>
                 <w:lang w:val="id-ID"/>
               </w:rPr>
-              <w:t xml:space="preserve">Desi Albinasari</w:t>
+              <w:t xml:space="preserve">Rieta</w:t>
             </w:r>
           </w:p>
         </w:tc>
@@ -5666,7 +5666,7 @@
                 <w:szCs w:val="20"/>
                 <w:lang w:val="id-ID"/>
               </w:rPr>
-              <w:t xml:space="preserve">Biodiversity Manager; NKT serta data flora dan fauna</w:t>
+              <w:t xml:space="preserve">Administratif; administrasi kontrak, penjadwalan, logistik pelatihan, dan pembayaran</w:t>
             </w:r>
           </w:p>
         </w:tc>
@@ -5738,11 +5738,13 @@
             </w:pPr>
             <w:r>
               <w:rPr>
-                <w:sz w:val="20"/>
-                <w:szCs w:val="20"/>
-                <w:lang w:val="id-ID"/>
-              </w:rPr>
-              <w:t xml:space="preserve">Sigit Budi Martono</w:t>
+                <w:i/>
+                <w:iCs/>
+                <w:sz w:val="20"/>
+                <w:szCs w:val="20"/>
+                <w:lang w:val="id-ID"/>
+              </w:rPr>
+              <w:t xml:space="preserve">[Nama Ketua]</w:t>
             </w:r>
           </w:p>
         </w:tc>
@@ -5776,7 +5778,7 @@
                 <w:szCs w:val="20"/>
                 <w:lang w:val="id-ID"/>
               </w:rPr>
-              <w:t xml:space="preserve">SAMPAN Kalimantan</w:t>
+              <w:t xml:space="preserve">LPHD Pasir</w:t>
             </w:r>
           </w:p>
         </w:tc>
@@ -5810,7 +5812,7 @@
                 <w:szCs w:val="20"/>
                 <w:lang w:val="id-ID"/>
               </w:rPr>
-              <w:t xml:space="preserve">Community Development; FPIC, GRM, dan pembagian manfaat</w:t>
+              <w:t xml:space="preserve">Pemegang persetujuan HD Pasir; pengambil keputusan proyek</w:t>
             </w:r>
           </w:p>
         </w:tc>
@@ -5882,11 +5884,13 @@
             </w:pPr>
             <w:r>
               <w:rPr>
-                <w:sz w:val="20"/>
-                <w:szCs w:val="20"/>
-                <w:lang w:val="id-ID"/>
-              </w:rPr>
-              <w:t xml:space="preserve">Reisya Namira</w:t>
+                <w:i/>
+                <w:iCs/>
+                <w:sz w:val="20"/>
+                <w:szCs w:val="20"/>
+                <w:lang w:val="id-ID"/>
+              </w:rPr>
+              <w:t xml:space="preserve">[… orang]</w:t>
             </w:r>
           </w:p>
         </w:tc>
@@ -5920,7 +5924,7 @@
                 <w:szCs w:val="20"/>
                 <w:lang w:val="id-ID"/>
               </w:rPr>
-              <w:t xml:space="preserve">SAMPAN Kalimantan</w:t>
+              <w:t xml:space="preserve">CCAL Desa Pasir</w:t>
             </w:r>
           </w:p>
         </w:tc>
@@ -5954,7 +5958,7 @@
                 <w:szCs w:val="20"/>
                 <w:lang w:val="id-ID"/>
               </w:rPr>
-              <w:t xml:space="preserve">Koordinator Pendamping Desa; koordinasi dengan LPHD dan CCAL</w:t>
+              <w:t xml:space="preserve">Champion teknis karbon masyarakat; peserta pelatihan dan pengambil data; perempuan minimal 40%</w:t>
             </w:r>
           </w:p>
         </w:tc>
@@ -5997,298 +6001,6 @@
                 <w:lang w:val="id-ID"/>
               </w:rPr>
               <w:t xml:space="preserve">8</w:t>
-            </w:r>
-          </w:p>
-        </w:tc>
-        <w:tc>
-          <w:tcPr>
-            <w:tcW w:w="2400" w:type="dxa"/>
-            <w:tcBorders>
-              <w:top w:val="single" w:sz="4" w:space="0" w:color="999999"/>
-              <w:left w:val="single" w:sz="4" w:space="0" w:color="999999"/>
-              <w:bottom w:val="single" w:sz="4" w:space="0" w:color="999999"/>
-              <w:right w:val="single" w:sz="4" w:space="0" w:color="999999"/>
-            </w:tcBorders>
-            <w:tcMar>
-              <w:top w:w="100" w:type="dxa"/>
-              <w:left w:w="120" w:type="dxa"/>
-              <w:bottom w:w="100" w:type="dxa"/>
-              <w:right w:w="120" w:type="dxa"/>
-            </w:tcMar>
-            <w:vAlign w:val="center"/>
-          </w:tcPr>
-          <w:p>
-            <w:pPr>
-              <w:spacing w:after="40"/>
-              <w:rPr>
-                <w:lang w:val="id-ID"/>
-              </w:rPr>
-            </w:pPr>
-            <w:r>
-              <w:rPr>
-                <w:i/>
-                <w:iCs/>
-                <w:sz w:val="20"/>
-                <w:szCs w:val="20"/>
-                <w:lang w:val="id-ID"/>
-              </w:rPr>
-              <w:t xml:space="preserve">[Nama Ketua]</w:t>
-            </w:r>
-          </w:p>
-        </w:tc>
-        <w:tc>
-          <w:tcPr>
-            <w:tcW w:w="2700" w:type="dxa"/>
-            <w:tcBorders>
-              <w:top w:val="single" w:sz="4" w:space="0" w:color="999999"/>
-              <w:left w:val="single" w:sz="4" w:space="0" w:color="999999"/>
-              <w:bottom w:val="single" w:sz="4" w:space="0" w:color="999999"/>
-              <w:right w:val="single" w:sz="4" w:space="0" w:color="999999"/>
-            </w:tcBorders>
-            <w:tcMar>
-              <w:top w:w="100" w:type="dxa"/>
-              <w:left w:w="120" w:type="dxa"/>
-              <w:bottom w:w="100" w:type="dxa"/>
-              <w:right w:w="120" w:type="dxa"/>
-            </w:tcMar>
-            <w:vAlign w:val="center"/>
-          </w:tcPr>
-          <w:p>
-            <w:pPr>
-              <w:spacing w:after="40"/>
-              <w:rPr>
-                <w:lang w:val="id-ID"/>
-              </w:rPr>
-            </w:pPr>
-            <w:r>
-              <w:rPr>
-                <w:sz w:val="20"/>
-                <w:szCs w:val="20"/>
-                <w:lang w:val="id-ID"/>
-              </w:rPr>
-              <w:t xml:space="preserve">LPHD Pasir</w:t>
-            </w:r>
-          </w:p>
-        </w:tc>
-        <w:tc>
-          <w:tcPr>
-            <w:tcW w:w="3326" w:type="dxa"/>
-            <w:tcBorders>
-              <w:top w:val="single" w:sz="4" w:space="0" w:color="999999"/>
-              <w:left w:val="single" w:sz="4" w:space="0" w:color="999999"/>
-              <w:bottom w:val="single" w:sz="4" w:space="0" w:color="999999"/>
-              <w:right w:val="single" w:sz="4" w:space="0" w:color="999999"/>
-            </w:tcBorders>
-            <w:tcMar>
-              <w:top w:w="100" w:type="dxa"/>
-              <w:left w:w="120" w:type="dxa"/>
-              <w:bottom w:w="100" w:type="dxa"/>
-              <w:right w:w="120" w:type="dxa"/>
-            </w:tcMar>
-            <w:vAlign w:val="center"/>
-          </w:tcPr>
-          <w:p>
-            <w:pPr>
-              <w:spacing w:after="40"/>
-              <w:rPr>
-                <w:lang w:val="id-ID"/>
-              </w:rPr>
-            </w:pPr>
-            <w:r>
-              <w:rPr>
-                <w:sz w:val="20"/>
-                <w:szCs w:val="20"/>
-                <w:lang w:val="id-ID"/>
-              </w:rPr>
-              <w:t xml:space="preserve">Pemegang persetujuan HD Pasir; pengambil keputusan proyek</w:t>
-            </w:r>
-          </w:p>
-        </w:tc>
-      </w:tr>
-      <w:tr>
-        <w:trPr>
-          <w:cantSplit/>
-        </w:trPr>
-        <w:tc>
-          <w:tcPr>
-            <w:tcW w:w="600" w:type="dxa"/>
-            <w:tcBorders>
-              <w:top w:val="single" w:sz="4" w:space="0" w:color="999999"/>
-              <w:left w:val="single" w:sz="4" w:space="0" w:color="999999"/>
-              <w:bottom w:val="single" w:sz="4" w:space="0" w:color="999999"/>
-              <w:right w:val="single" w:sz="4" w:space="0" w:color="999999"/>
-            </w:tcBorders>
-            <w:tcMar>
-              <w:top w:w="100" w:type="dxa"/>
-              <w:left w:w="120" w:type="dxa"/>
-              <w:bottom w:w="100" w:type="dxa"/>
-              <w:right w:w="120" w:type="dxa"/>
-            </w:tcMar>
-            <w:vAlign w:val="center"/>
-          </w:tcPr>
-          <w:p>
-            <w:pPr>
-              <w:spacing w:after="40"/>
-              <w:jc w:val="center"/>
-              <w:rPr>
-                <w:lang w:val="id-ID"/>
-              </w:rPr>
-            </w:pPr>
-            <w:r>
-              <w:rPr>
-                <w:b/>
-                <w:bCs/>
-                <w:sz w:val="20"/>
-                <w:szCs w:val="20"/>
-                <w:lang w:val="id-ID"/>
-              </w:rPr>
-              <w:t xml:space="preserve">9</w:t>
-            </w:r>
-          </w:p>
-        </w:tc>
-        <w:tc>
-          <w:tcPr>
-            <w:tcW w:w="2400" w:type="dxa"/>
-            <w:tcBorders>
-              <w:top w:val="single" w:sz="4" w:space="0" w:color="999999"/>
-              <w:left w:val="single" w:sz="4" w:space="0" w:color="999999"/>
-              <w:bottom w:val="single" w:sz="4" w:space="0" w:color="999999"/>
-              <w:right w:val="single" w:sz="4" w:space="0" w:color="999999"/>
-            </w:tcBorders>
-            <w:tcMar>
-              <w:top w:w="100" w:type="dxa"/>
-              <w:left w:w="120" w:type="dxa"/>
-              <w:bottom w:w="100" w:type="dxa"/>
-              <w:right w:w="120" w:type="dxa"/>
-            </w:tcMar>
-            <w:vAlign w:val="center"/>
-          </w:tcPr>
-          <w:p>
-            <w:pPr>
-              <w:spacing w:after="40"/>
-              <w:rPr>
-                <w:lang w:val="id-ID"/>
-              </w:rPr>
-            </w:pPr>
-            <w:r>
-              <w:rPr>
-                <w:i/>
-                <w:iCs/>
-                <w:sz w:val="20"/>
-                <w:szCs w:val="20"/>
-                <w:lang w:val="id-ID"/>
-              </w:rPr>
-              <w:t xml:space="preserve">[… orang]</w:t>
-            </w:r>
-          </w:p>
-        </w:tc>
-        <w:tc>
-          <w:tcPr>
-            <w:tcW w:w="2700" w:type="dxa"/>
-            <w:tcBorders>
-              <w:top w:val="single" w:sz="4" w:space="0" w:color="999999"/>
-              <w:left w:val="single" w:sz="4" w:space="0" w:color="999999"/>
-              <w:bottom w:val="single" w:sz="4" w:space="0" w:color="999999"/>
-              <w:right w:val="single" w:sz="4" w:space="0" w:color="999999"/>
-            </w:tcBorders>
-            <w:tcMar>
-              <w:top w:w="100" w:type="dxa"/>
-              <w:left w:w="120" w:type="dxa"/>
-              <w:bottom w:w="100" w:type="dxa"/>
-              <w:right w:w="120" w:type="dxa"/>
-            </w:tcMar>
-            <w:vAlign w:val="center"/>
-          </w:tcPr>
-          <w:p>
-            <w:pPr>
-              <w:spacing w:after="40"/>
-              <w:rPr>
-                <w:lang w:val="id-ID"/>
-              </w:rPr>
-            </w:pPr>
-            <w:r>
-              <w:rPr>
-                <w:sz w:val="20"/>
-                <w:szCs w:val="20"/>
-                <w:lang w:val="id-ID"/>
-              </w:rPr>
-              <w:t xml:space="preserve">CCAL Desa Pasir</w:t>
-            </w:r>
-          </w:p>
-        </w:tc>
-        <w:tc>
-          <w:tcPr>
-            <w:tcW w:w="3326" w:type="dxa"/>
-            <w:tcBorders>
-              <w:top w:val="single" w:sz="4" w:space="0" w:color="999999"/>
-              <w:left w:val="single" w:sz="4" w:space="0" w:color="999999"/>
-              <w:bottom w:val="single" w:sz="4" w:space="0" w:color="999999"/>
-              <w:right w:val="single" w:sz="4" w:space="0" w:color="999999"/>
-            </w:tcBorders>
-            <w:tcMar>
-              <w:top w:w="100" w:type="dxa"/>
-              <w:left w:w="120" w:type="dxa"/>
-              <w:bottom w:w="100" w:type="dxa"/>
-              <w:right w:w="120" w:type="dxa"/>
-            </w:tcMar>
-            <w:vAlign w:val="center"/>
-          </w:tcPr>
-          <w:p>
-            <w:pPr>
-              <w:spacing w:after="40"/>
-              <w:rPr>
-                <w:lang w:val="id-ID"/>
-              </w:rPr>
-            </w:pPr>
-            <w:r>
-              <w:rPr>
-                <w:sz w:val="20"/>
-                <w:szCs w:val="20"/>
-                <w:lang w:val="id-ID"/>
-              </w:rPr>
-              <w:t xml:space="preserve">Champion teknis karbon masyarakat; peserta pelatihan dan pengambil data; perempuan minimal 40%</w:t>
-            </w:r>
-          </w:p>
-        </w:tc>
-      </w:tr>
-      <w:tr>
-        <w:trPr>
-          <w:cantSplit/>
-        </w:trPr>
-        <w:tc>
-          <w:tcPr>
-            <w:tcW w:w="600" w:type="dxa"/>
-            <w:tcBorders>
-              <w:top w:val="single" w:sz="4" w:space="0" w:color="999999"/>
-              <w:left w:val="single" w:sz="4" w:space="0" w:color="999999"/>
-              <w:bottom w:val="single" w:sz="4" w:space="0" w:color="999999"/>
-              <w:right w:val="single" w:sz="4" w:space="0" w:color="999999"/>
-            </w:tcBorders>
-            <w:tcMar>
-              <w:top w:w="100" w:type="dxa"/>
-              <w:left w:w="120" w:type="dxa"/>
-              <w:bottom w:w="100" w:type="dxa"/>
-              <w:right w:w="120" w:type="dxa"/>
-            </w:tcMar>
-            <w:vAlign w:val="center"/>
-          </w:tcPr>
-          <w:p>
-            <w:pPr>
-              <w:spacing w:after="40"/>
-              <w:jc w:val="center"/>
-              <w:rPr>
-                <w:lang w:val="id-ID"/>
-              </w:rPr>
-            </w:pPr>
-            <w:r>
-              <w:rPr>
-                <w:b/>
-                <w:bCs/>
-                <w:sz w:val="20"/>
-                <w:szCs w:val="20"/>
-                <w:lang w:val="id-ID"/>
-              </w:rPr>
-              <w:t xml:space="preserve">10</w:t>
             </w:r>
           </w:p>
         </w:tc>

</xml_diff>

<commit_message>
Update full names and roles in KAK TAT team table
Co-Authored-By: Claude Opus 5.5 <noreply@anthropic.com>
Claude-Session: https://claude.ai/code/session_016hKM1xZpgjxw9qEmhhTJUQ
</commit_message>
<xml_diff>
--- a/KAK_TAT_PIN_PDD_PlanVivo_Desa_Pasir.docx
+++ b/KAK_TAT_PIN_PDD_PlanVivo_Desa_Pasir.docx
@@ -5454,7 +5454,7 @@
                 <w:szCs w:val="20"/>
                 <w:lang w:val="id-ID"/>
               </w:rPr>
-              <w:t xml:space="preserve">Keke</w:t>
+              <w:t xml:space="preserve">Keke Amalia Maha</w:t>
             </w:r>
           </w:p>
         </w:tc>
@@ -5522,7 +5522,7 @@
                 <w:szCs w:val="20"/>
                 <w:lang w:val="id-ID"/>
               </w:rPr>
-              <w:t xml:space="preserve">Remote Sensing and GIS; batas proyek, tutupan dan perubahan tutupan lahan, serta stratifikasi</w:t>
+              <w:t xml:space="preserve">Remote Sensing, GIS, and Carbon Accounting; batas proyek, tutupan dan perubahan tutupan lahan, stratifikasi, serta perhitungan karbon</w:t>
             </w:r>
           </w:p>
         </w:tc>
@@ -5598,7 +5598,7 @@
                 <w:szCs w:val="20"/>
                 <w:lang w:val="id-ID"/>
               </w:rPr>
-              <w:t xml:space="preserve">Rieta</w:t>
+              <w:t xml:space="preserve">Reita Chrisilia Aubrey</w:t>
             </w:r>
           </w:p>
         </w:tc>

</xml_diff>

<commit_message>
Add full name for biodiversity team member in KAK TAT
Co-Authored-By: Claude Opus 5.5 <noreply@anthropic.com>
Claude-Session: https://claude.ai/code/session_016hKM1xZpgjxw9qEmhhTJUQ
</commit_message>
<xml_diff>
--- a/KAK_TAT_PIN_PDD_PlanVivo_Desa_Pasir.docx
+++ b/KAK_TAT_PIN_PDD_PlanVivo_Desa_Pasir.docx
@@ -5310,7 +5310,7 @@
                 <w:szCs w:val="20"/>
                 <w:lang w:val="id-ID"/>
               </w:rPr>
-              <w:t xml:space="preserve">Riko</w:t>
+              <w:t xml:space="preserve">Eryesiswanto (Riko)</w:t>
             </w:r>
           </w:p>
         </w:tc>
@@ -5522,7 +5522,7 @@
                 <w:szCs w:val="20"/>
                 <w:lang w:val="id-ID"/>
               </w:rPr>
-              <w:t xml:space="preserve">Remote Sensing, GIS, and Carbon Accounting; batas proyek, tutupan dan perubahan tutupan lahan, stratifikasi, serta perhitungan karbon</w:t>
+              <w:t xml:space="preserve">Remote Sensing, GIS, dan Carbon Accounting; batas proyek, tutupan dan perubahan tutupan lahan, stratifikasi, serta perhitungan karbon</w:t>
             </w:r>
           </w:p>
         </w:tc>

</xml_diff>

<commit_message>
Add peat carbon pre-assessment summary to KAK TAT
Co-Authored-By: Claude Opus 5.5 <noreply@anthropic.com>
Claude-Session: https://claude.ai/code/session_016hKM1xZpgjxw9qEmhhTJUQ
</commit_message>
<xml_diff>
--- a/KAK_TAT_PIN_PDD_PlanVivo_Desa_Pasir.docx
+++ b/KAK_TAT_PIN_PDD_PlanVivo_Desa_Pasir.docx
@@ -162,6 +162,1192 @@
           <w:lang w:val="id-ID"/>
         </w:rPr>
         <w:t xml:space="preserve">Kawasan ini didominasi ekosistem gambut seluas 2.014,34 ha (81,60%). Sekitar 1.482,18 ha (60,04%) masih berupa hutan, sedangkan hampir 40% lainnya berupa semak belukar, perkebunan sawit, dan lahan terbuka. Pembagian kawasan menetapkan 1.299,01 ha untuk perlindungan dan 1.169,49 ha untuk rehabilitasi, sehingga desain proyek memadukan perlindungan hutan (pengurangan emisi dari deforestasi dan degradasi, termasuk gambut) dengan pemulihan ekosistem pada areal terdegradasi. Hasil pre-assessment menunjukkan potensi stok karbon biomassa hidup sekitar 773.000–835.000 tCO₂e, di luar karbon tanah gambut, serta potensi emisi dekomposisi gambut sekitar 76.961 tCO₂e per tahun. Kawasan ini juga merupakan habitat Orangutan Kalimantan, Trenggiling Sunda, Beruang Madu, dan Rangkong Gading.</w:t>
+      </w:r>
+    </w:p>
+    <w:p>
+      <w:pPr>
+        <w:spacing w:after="200" w:line="300" w:lineRule="auto"/>
+        <w:jc w:val="both"/>
+        <w:rPr>
+          <w:lang w:val="id-ID"/>
+        </w:rPr>
+      </w:pPr>
+      <w:r>
+        <w:rPr>
+          <w:lang w:val="id-ID"/>
+        </w:rPr>
+        <w:t xml:space="preserve">SAMPAN telah melakukan pre-assessment carbon accounting gambut dengan menumpangsusunkan Peta Penutupan Lahan 2022 dan peta kedalaman gambut Kesatuan Hidrologis Gambut (KHG Sungai Mempawah – Sungai Duri dan KHG Sungai Mempawah – Sungai Peniti) pada skala 1:250.000. Sebaran luas hasil analisis tersebut disajikan pada Tabel 1. Karena skala peta yang kasar, angka luas hutan pada tabel (1.333 ha hutan rawa sekunder) berbeda dengan hasil analisis spasial program (1.482,18 ha); perbedaan ini akan diselaraskan melalui pemetaan resolusi tinggi dan pengambilan data baseline.</w:t>
+      </w:r>
+    </w:p>
+    <w:p>
+      <w:pPr>
+        <w:keepNext/>
+        <w:spacing w:before="80" w:after="200" w:line="276" w:lineRule="auto"/>
+        <w:jc w:val="both"/>
+        <w:rPr>
+          <w:lang w:val="id-ID"/>
+        </w:rPr>
+      </w:pPr>
+      <w:r>
+        <w:rPr>
+          <w:i/>
+          <w:iCs/>
+          <w:color w:val="595959"/>
+          <w:sz w:val="20"/>
+          <w:szCs w:val="20"/>
+          <w:lang w:val="id-ID"/>
+        </w:rPr>
+        <w:t xml:space="preserve">Tabel 1. Luas Hutan Desa Pasir menurut tutupan lahan dan kelas kedalaman gambut (ha)</w:t>
+      </w:r>
+    </w:p>
+    <w:tbl>
+      <w:tblPr>
+        <w:tblW w:w="9026" w:type="dxa"/>
+        <w:tblLayout w:type="fixed"/>
+        <w:tblLook w:val="04A0" w:firstRow="1" w:lastRow="0" w:firstColumn="1" w:lastColumn="0" w:noHBand="0" w:noVBand="1"/>
+      </w:tblPr>
+      <w:tblGrid>
+        <w:gridCol w:w="2626"/>
+        <w:gridCol w:w="1600"/>
+        <w:gridCol w:w="1600"/>
+        <w:gridCol w:w="1600"/>
+        <w:gridCol w:w="1600"/>
+      </w:tblGrid>
+      <w:tr>
+        <w:trPr>
+          <w:tblHeader/>
+          <w:cantSplit/>
+        </w:trPr>
+        <w:tc>
+          <w:tcPr>
+            <w:tcW w:w="2626" w:type="dxa"/>
+            <w:tcBorders>
+              <w:top w:val="single" w:sz="4" w:space="0" w:color="999999"/>
+              <w:left w:val="single" w:sz="4" w:space="0" w:color="999999"/>
+              <w:bottom w:val="single" w:sz="4" w:space="0" w:color="999999"/>
+              <w:right w:val="single" w:sz="4" w:space="0" w:color="999999"/>
+            </w:tcBorders>
+            <w:shd w:val="clear" w:color="auto" w:fill="D9D9D9"/>
+            <w:tcMar>
+              <w:top w:w="80" w:type="dxa"/>
+              <w:left w:w="100" w:type="dxa"/>
+              <w:bottom w:w="80" w:type="dxa"/>
+              <w:right w:w="100" w:type="dxa"/>
+            </w:tcMar>
+            <w:vAlign w:val="center"/>
+          </w:tcPr>
+          <w:p>
+            <w:pPr>
+              <w:spacing w:after="40"/>
+              <w:jc w:val="center"/>
+              <w:rPr>
+                <w:lang w:val="id-ID"/>
+              </w:rPr>
+            </w:pPr>
+            <w:r>
+              <w:rPr>
+                <w:b/>
+                <w:bCs/>
+                <w:sz w:val="20"/>
+                <w:szCs w:val="20"/>
+                <w:lang w:val="id-ID"/>
+              </w:rPr>
+              <w:t xml:space="preserve">Tutupan Lahan</w:t>
+            </w:r>
+          </w:p>
+        </w:tc>
+        <w:tc>
+          <w:tcPr>
+            <w:tcW w:w="1600" w:type="dxa"/>
+            <w:tcBorders>
+              <w:top w:val="single" w:sz="4" w:space="0" w:color="999999"/>
+              <w:left w:val="single" w:sz="4" w:space="0" w:color="999999"/>
+              <w:bottom w:val="single" w:sz="4" w:space="0" w:color="999999"/>
+              <w:right w:val="single" w:sz="4" w:space="0" w:color="999999"/>
+            </w:tcBorders>
+            <w:shd w:val="clear" w:color="auto" w:fill="D9D9D9"/>
+            <w:tcMar>
+              <w:top w:w="80" w:type="dxa"/>
+              <w:left w:w="100" w:type="dxa"/>
+              <w:bottom w:w="80" w:type="dxa"/>
+              <w:right w:w="100" w:type="dxa"/>
+            </w:tcMar>
+            <w:vAlign w:val="center"/>
+          </w:tcPr>
+          <w:p>
+            <w:pPr>
+              <w:spacing w:after="40"/>
+              <w:jc w:val="center"/>
+              <w:rPr>
+                <w:lang w:val="id-ID"/>
+              </w:rPr>
+            </w:pPr>
+            <w:r>
+              <w:rPr>
+                <w:b/>
+                <w:bCs/>
+                <w:sz w:val="20"/>
+                <w:szCs w:val="20"/>
+                <w:lang w:val="id-ID"/>
+              </w:rPr>
+              <w:t xml:space="preserve">Bergambut (&lt; 50 cm)</w:t>
+            </w:r>
+          </w:p>
+        </w:tc>
+        <w:tc>
+          <w:tcPr>
+            <w:tcW w:w="1600" w:type="dxa"/>
+            <w:tcBorders>
+              <w:top w:val="single" w:sz="4" w:space="0" w:color="999999"/>
+              <w:left w:val="single" w:sz="4" w:space="0" w:color="999999"/>
+              <w:bottom w:val="single" w:sz="4" w:space="0" w:color="999999"/>
+              <w:right w:val="single" w:sz="4" w:space="0" w:color="999999"/>
+            </w:tcBorders>
+            <w:shd w:val="clear" w:color="auto" w:fill="D9D9D9"/>
+            <w:tcMar>
+              <w:top w:w="80" w:type="dxa"/>
+              <w:left w:w="100" w:type="dxa"/>
+              <w:bottom w:w="80" w:type="dxa"/>
+              <w:right w:w="100" w:type="dxa"/>
+            </w:tcMar>
+            <w:vAlign w:val="center"/>
+          </w:tcPr>
+          <w:p>
+            <w:pPr>
+              <w:spacing w:after="40"/>
+              <w:jc w:val="center"/>
+              <w:rPr>
+                <w:lang w:val="id-ID"/>
+              </w:rPr>
+            </w:pPr>
+            <w:r>
+              <w:rPr>
+                <w:b/>
+                <w:bCs/>
+                <w:sz w:val="20"/>
+                <w:szCs w:val="20"/>
+                <w:lang w:val="id-ID"/>
+              </w:rPr>
+              <w:t xml:space="preserve">Gambut (100–200 cm)</w:t>
+            </w:r>
+          </w:p>
+        </w:tc>
+        <w:tc>
+          <w:tcPr>
+            <w:tcW w:w="1600" w:type="dxa"/>
+            <w:tcBorders>
+              <w:top w:val="single" w:sz="4" w:space="0" w:color="999999"/>
+              <w:left w:val="single" w:sz="4" w:space="0" w:color="999999"/>
+              <w:bottom w:val="single" w:sz="4" w:space="0" w:color="999999"/>
+              <w:right w:val="single" w:sz="4" w:space="0" w:color="999999"/>
+            </w:tcBorders>
+            <w:shd w:val="clear" w:color="auto" w:fill="D9D9D9"/>
+            <w:tcMar>
+              <w:top w:w="80" w:type="dxa"/>
+              <w:left w:w="100" w:type="dxa"/>
+              <w:bottom w:w="80" w:type="dxa"/>
+              <w:right w:w="100" w:type="dxa"/>
+            </w:tcMar>
+            <w:vAlign w:val="center"/>
+          </w:tcPr>
+          <w:p>
+            <w:pPr>
+              <w:spacing w:after="40"/>
+              <w:jc w:val="center"/>
+              <w:rPr>
+                <w:lang w:val="id-ID"/>
+              </w:rPr>
+            </w:pPr>
+            <w:r>
+              <w:rPr>
+                <w:b/>
+                <w:bCs/>
+                <w:sz w:val="20"/>
+                <w:szCs w:val="20"/>
+                <w:lang w:val="id-ID"/>
+              </w:rPr>
+              <w:t xml:space="preserve">Gambut (200–300 cm)</w:t>
+            </w:r>
+          </w:p>
+        </w:tc>
+        <w:tc>
+          <w:tcPr>
+            <w:tcW w:w="1600" w:type="dxa"/>
+            <w:tcBorders>
+              <w:top w:val="single" w:sz="4" w:space="0" w:color="999999"/>
+              <w:left w:val="single" w:sz="4" w:space="0" w:color="999999"/>
+              <w:bottom w:val="single" w:sz="4" w:space="0" w:color="999999"/>
+              <w:right w:val="single" w:sz="4" w:space="0" w:color="999999"/>
+            </w:tcBorders>
+            <w:shd w:val="clear" w:color="auto" w:fill="D9D9D9"/>
+            <w:tcMar>
+              <w:top w:w="80" w:type="dxa"/>
+              <w:left w:w="100" w:type="dxa"/>
+              <w:bottom w:w="80" w:type="dxa"/>
+              <w:right w:w="100" w:type="dxa"/>
+            </w:tcMar>
+            <w:vAlign w:val="center"/>
+          </w:tcPr>
+          <w:p>
+            <w:pPr>
+              <w:spacing w:after="40"/>
+              <w:jc w:val="center"/>
+              <w:rPr>
+                <w:lang w:val="id-ID"/>
+              </w:rPr>
+            </w:pPr>
+            <w:r>
+              <w:rPr>
+                <w:b/>
+                <w:bCs/>
+                <w:sz w:val="20"/>
+                <w:szCs w:val="20"/>
+                <w:lang w:val="id-ID"/>
+              </w:rPr>
+              <w:t xml:space="preserve">Total</w:t>
+            </w:r>
+          </w:p>
+        </w:tc>
+      </w:tr>
+      <w:tr>
+        <w:trPr>
+          <w:cantSplit/>
+        </w:trPr>
+        <w:tc>
+          <w:tcPr>
+            <w:tcW w:w="2626" w:type="dxa"/>
+            <w:tcBorders>
+              <w:top w:val="single" w:sz="4" w:space="0" w:color="999999"/>
+              <w:left w:val="single" w:sz="4" w:space="0" w:color="999999"/>
+              <w:bottom w:val="single" w:sz="4" w:space="0" w:color="999999"/>
+              <w:right w:val="single" w:sz="4" w:space="0" w:color="999999"/>
+            </w:tcBorders>
+            <w:tcMar>
+              <w:top w:w="100" w:type="dxa"/>
+              <w:left w:w="120" w:type="dxa"/>
+              <w:bottom w:w="100" w:type="dxa"/>
+              <w:right w:w="120" w:type="dxa"/>
+            </w:tcMar>
+            <w:vAlign w:val="center"/>
+          </w:tcPr>
+          <w:p>
+            <w:pPr>
+              <w:spacing w:after="40"/>
+              <w:rPr>
+                <w:lang w:val="id-ID"/>
+              </w:rPr>
+            </w:pPr>
+            <w:r>
+              <w:rPr>
+                <w:b/>
+                <w:bCs/>
+                <w:sz w:val="20"/>
+                <w:szCs w:val="20"/>
+                <w:lang w:val="id-ID"/>
+              </w:rPr>
+              <w:t xml:space="preserve">Hutan Rawa Sekunder</w:t>
+            </w:r>
+          </w:p>
+        </w:tc>
+        <w:tc>
+          <w:tcPr>
+            <w:tcW w:w="1600" w:type="dxa"/>
+            <w:tcBorders>
+              <w:top w:val="single" w:sz="4" w:space="0" w:color="999999"/>
+              <w:left w:val="single" w:sz="4" w:space="0" w:color="999999"/>
+              <w:bottom w:val="single" w:sz="4" w:space="0" w:color="999999"/>
+              <w:right w:val="single" w:sz="4" w:space="0" w:color="999999"/>
+            </w:tcBorders>
+            <w:tcMar>
+              <w:top w:w="100" w:type="dxa"/>
+              <w:left w:w="120" w:type="dxa"/>
+              <w:bottom w:w="100" w:type="dxa"/>
+              <w:right w:w="120" w:type="dxa"/>
+            </w:tcMar>
+            <w:vAlign w:val="center"/>
+          </w:tcPr>
+          <w:p>
+            <w:pPr>
+              <w:spacing w:after="40"/>
+              <w:jc w:val="center"/>
+              <w:rPr>
+                <w:lang w:val="id-ID"/>
+              </w:rPr>
+            </w:pPr>
+            <w:r>
+              <w:rPr>
+                <w:sz w:val="20"/>
+                <w:szCs w:val="20"/>
+                <w:lang w:val="id-ID"/>
+              </w:rPr>
+              <w:t xml:space="preserve">352</w:t>
+            </w:r>
+          </w:p>
+        </w:tc>
+        <w:tc>
+          <w:tcPr>
+            <w:tcW w:w="1600" w:type="dxa"/>
+            <w:tcBorders>
+              <w:top w:val="single" w:sz="4" w:space="0" w:color="999999"/>
+              <w:left w:val="single" w:sz="4" w:space="0" w:color="999999"/>
+              <w:bottom w:val="single" w:sz="4" w:space="0" w:color="999999"/>
+              <w:right w:val="single" w:sz="4" w:space="0" w:color="999999"/>
+            </w:tcBorders>
+            <w:tcMar>
+              <w:top w:w="100" w:type="dxa"/>
+              <w:left w:w="120" w:type="dxa"/>
+              <w:bottom w:w="100" w:type="dxa"/>
+              <w:right w:w="120" w:type="dxa"/>
+            </w:tcMar>
+            <w:vAlign w:val="center"/>
+          </w:tcPr>
+          <w:p>
+            <w:pPr>
+              <w:spacing w:after="40"/>
+              <w:jc w:val="center"/>
+              <w:rPr>
+                <w:lang w:val="id-ID"/>
+              </w:rPr>
+            </w:pPr>
+            <w:r>
+              <w:rPr>
+                <w:sz w:val="20"/>
+                <w:szCs w:val="20"/>
+                <w:lang w:val="id-ID"/>
+              </w:rPr>
+              <w:t xml:space="preserve">943</w:t>
+            </w:r>
+          </w:p>
+        </w:tc>
+        <w:tc>
+          <w:tcPr>
+            <w:tcW w:w="1600" w:type="dxa"/>
+            <w:tcBorders>
+              <w:top w:val="single" w:sz="4" w:space="0" w:color="999999"/>
+              <w:left w:val="single" w:sz="4" w:space="0" w:color="999999"/>
+              <w:bottom w:val="single" w:sz="4" w:space="0" w:color="999999"/>
+              <w:right w:val="single" w:sz="4" w:space="0" w:color="999999"/>
+            </w:tcBorders>
+            <w:tcMar>
+              <w:top w:w="100" w:type="dxa"/>
+              <w:left w:w="120" w:type="dxa"/>
+              <w:bottom w:w="100" w:type="dxa"/>
+              <w:right w:w="120" w:type="dxa"/>
+            </w:tcMar>
+            <w:vAlign w:val="center"/>
+          </w:tcPr>
+          <w:p>
+            <w:pPr>
+              <w:spacing w:after="40"/>
+              <w:jc w:val="center"/>
+              <w:rPr>
+                <w:lang w:val="id-ID"/>
+              </w:rPr>
+            </w:pPr>
+            <w:r>
+              <w:rPr>
+                <w:sz w:val="20"/>
+                <w:szCs w:val="20"/>
+                <w:lang w:val="id-ID"/>
+              </w:rPr>
+              <w:t xml:space="preserve">38</w:t>
+            </w:r>
+          </w:p>
+        </w:tc>
+        <w:tc>
+          <w:tcPr>
+            <w:tcW w:w="1600" w:type="dxa"/>
+            <w:tcBorders>
+              <w:top w:val="single" w:sz="4" w:space="0" w:color="999999"/>
+              <w:left w:val="single" w:sz="4" w:space="0" w:color="999999"/>
+              <w:bottom w:val="single" w:sz="4" w:space="0" w:color="999999"/>
+              <w:right w:val="single" w:sz="4" w:space="0" w:color="999999"/>
+            </w:tcBorders>
+            <w:tcMar>
+              <w:top w:w="100" w:type="dxa"/>
+              <w:left w:w="120" w:type="dxa"/>
+              <w:bottom w:w="100" w:type="dxa"/>
+              <w:right w:w="120" w:type="dxa"/>
+            </w:tcMar>
+            <w:vAlign w:val="center"/>
+          </w:tcPr>
+          <w:p>
+            <w:pPr>
+              <w:spacing w:after="40"/>
+              <w:jc w:val="center"/>
+              <w:rPr>
+                <w:lang w:val="id-ID"/>
+              </w:rPr>
+            </w:pPr>
+            <w:r>
+              <w:rPr>
+                <w:sz w:val="20"/>
+                <w:szCs w:val="20"/>
+                <w:lang w:val="id-ID"/>
+              </w:rPr>
+              <w:t xml:space="preserve">1.333</w:t>
+            </w:r>
+          </w:p>
+        </w:tc>
+      </w:tr>
+      <w:tr>
+        <w:trPr>
+          <w:cantSplit/>
+        </w:trPr>
+        <w:tc>
+          <w:tcPr>
+            <w:tcW w:w="2626" w:type="dxa"/>
+            <w:tcBorders>
+              <w:top w:val="single" w:sz="4" w:space="0" w:color="999999"/>
+              <w:left w:val="single" w:sz="4" w:space="0" w:color="999999"/>
+              <w:bottom w:val="single" w:sz="4" w:space="0" w:color="999999"/>
+              <w:right w:val="single" w:sz="4" w:space="0" w:color="999999"/>
+            </w:tcBorders>
+            <w:tcMar>
+              <w:top w:w="100" w:type="dxa"/>
+              <w:left w:w="120" w:type="dxa"/>
+              <w:bottom w:w="100" w:type="dxa"/>
+              <w:right w:w="120" w:type="dxa"/>
+            </w:tcMar>
+            <w:vAlign w:val="center"/>
+          </w:tcPr>
+          <w:p>
+            <w:pPr>
+              <w:spacing w:after="40"/>
+              <w:rPr>
+                <w:lang w:val="id-ID"/>
+              </w:rPr>
+            </w:pPr>
+            <w:r>
+              <w:rPr>
+                <w:b/>
+                <w:bCs/>
+                <w:sz w:val="20"/>
+                <w:szCs w:val="20"/>
+                <w:lang w:val="id-ID"/>
+              </w:rPr>
+              <w:t xml:space="preserve">Semak Belukar Rawa</w:t>
+            </w:r>
+          </w:p>
+        </w:tc>
+        <w:tc>
+          <w:tcPr>
+            <w:tcW w:w="1600" w:type="dxa"/>
+            <w:tcBorders>
+              <w:top w:val="single" w:sz="4" w:space="0" w:color="999999"/>
+              <w:left w:val="single" w:sz="4" w:space="0" w:color="999999"/>
+              <w:bottom w:val="single" w:sz="4" w:space="0" w:color="999999"/>
+              <w:right w:val="single" w:sz="4" w:space="0" w:color="999999"/>
+            </w:tcBorders>
+            <w:tcMar>
+              <w:top w:w="100" w:type="dxa"/>
+              <w:left w:w="120" w:type="dxa"/>
+              <w:bottom w:w="100" w:type="dxa"/>
+              <w:right w:w="120" w:type="dxa"/>
+            </w:tcMar>
+            <w:vAlign w:val="center"/>
+          </w:tcPr>
+          <w:p>
+            <w:pPr>
+              <w:spacing w:after="40"/>
+              <w:jc w:val="center"/>
+              <w:rPr>
+                <w:lang w:val="id-ID"/>
+              </w:rPr>
+            </w:pPr>
+            <w:r>
+              <w:rPr>
+                <w:sz w:val="20"/>
+                <w:szCs w:val="20"/>
+                <w:lang w:val="id-ID"/>
+              </w:rPr>
+              <w:t xml:space="preserve">101</w:t>
+            </w:r>
+          </w:p>
+        </w:tc>
+        <w:tc>
+          <w:tcPr>
+            <w:tcW w:w="1600" w:type="dxa"/>
+            <w:tcBorders>
+              <w:top w:val="single" w:sz="4" w:space="0" w:color="999999"/>
+              <w:left w:val="single" w:sz="4" w:space="0" w:color="999999"/>
+              <w:bottom w:val="single" w:sz="4" w:space="0" w:color="999999"/>
+              <w:right w:val="single" w:sz="4" w:space="0" w:color="999999"/>
+            </w:tcBorders>
+            <w:tcMar>
+              <w:top w:w="100" w:type="dxa"/>
+              <w:left w:w="120" w:type="dxa"/>
+              <w:bottom w:w="100" w:type="dxa"/>
+              <w:right w:w="120" w:type="dxa"/>
+            </w:tcMar>
+            <w:vAlign w:val="center"/>
+          </w:tcPr>
+          <w:p>
+            <w:pPr>
+              <w:spacing w:after="40"/>
+              <w:jc w:val="center"/>
+              <w:rPr>
+                <w:lang w:val="id-ID"/>
+              </w:rPr>
+            </w:pPr>
+            <w:r>
+              <w:rPr>
+                <w:sz w:val="20"/>
+                <w:szCs w:val="20"/>
+                <w:lang w:val="id-ID"/>
+              </w:rPr>
+              <w:t xml:space="preserve">635</w:t>
+            </w:r>
+          </w:p>
+        </w:tc>
+        <w:tc>
+          <w:tcPr>
+            <w:tcW w:w="1600" w:type="dxa"/>
+            <w:tcBorders>
+              <w:top w:val="single" w:sz="4" w:space="0" w:color="999999"/>
+              <w:left w:val="single" w:sz="4" w:space="0" w:color="999999"/>
+              <w:bottom w:val="single" w:sz="4" w:space="0" w:color="999999"/>
+              <w:right w:val="single" w:sz="4" w:space="0" w:color="999999"/>
+            </w:tcBorders>
+            <w:tcMar>
+              <w:top w:w="100" w:type="dxa"/>
+              <w:left w:w="120" w:type="dxa"/>
+              <w:bottom w:w="100" w:type="dxa"/>
+              <w:right w:w="120" w:type="dxa"/>
+            </w:tcMar>
+            <w:vAlign w:val="center"/>
+          </w:tcPr>
+          <w:p>
+            <w:pPr>
+              <w:spacing w:after="40"/>
+              <w:jc w:val="center"/>
+              <w:rPr>
+                <w:lang w:val="id-ID"/>
+              </w:rPr>
+            </w:pPr>
+            <w:r>
+              <w:rPr>
+                <w:sz w:val="20"/>
+                <w:szCs w:val="20"/>
+                <w:lang w:val="id-ID"/>
+              </w:rPr>
+              <w:t xml:space="preserve">298</w:t>
+            </w:r>
+          </w:p>
+        </w:tc>
+        <w:tc>
+          <w:tcPr>
+            <w:tcW w:w="1600" w:type="dxa"/>
+            <w:tcBorders>
+              <w:top w:val="single" w:sz="4" w:space="0" w:color="999999"/>
+              <w:left w:val="single" w:sz="4" w:space="0" w:color="999999"/>
+              <w:bottom w:val="single" w:sz="4" w:space="0" w:color="999999"/>
+              <w:right w:val="single" w:sz="4" w:space="0" w:color="999999"/>
+            </w:tcBorders>
+            <w:tcMar>
+              <w:top w:w="100" w:type="dxa"/>
+              <w:left w:w="120" w:type="dxa"/>
+              <w:bottom w:w="100" w:type="dxa"/>
+              <w:right w:w="120" w:type="dxa"/>
+            </w:tcMar>
+            <w:vAlign w:val="center"/>
+          </w:tcPr>
+          <w:p>
+            <w:pPr>
+              <w:spacing w:after="40"/>
+              <w:jc w:val="center"/>
+              <w:rPr>
+                <w:lang w:val="id-ID"/>
+              </w:rPr>
+            </w:pPr>
+            <w:r>
+              <w:rPr>
+                <w:sz w:val="20"/>
+                <w:szCs w:val="20"/>
+                <w:lang w:val="id-ID"/>
+              </w:rPr>
+              <w:t xml:space="preserve">1.034</w:t>
+            </w:r>
+          </w:p>
+        </w:tc>
+      </w:tr>
+      <w:tr>
+        <w:trPr>
+          <w:cantSplit/>
+        </w:trPr>
+        <w:tc>
+          <w:tcPr>
+            <w:tcW w:w="2626" w:type="dxa"/>
+            <w:tcBorders>
+              <w:top w:val="single" w:sz="4" w:space="0" w:color="999999"/>
+              <w:left w:val="single" w:sz="4" w:space="0" w:color="999999"/>
+              <w:bottom w:val="single" w:sz="4" w:space="0" w:color="999999"/>
+              <w:right w:val="single" w:sz="4" w:space="0" w:color="999999"/>
+            </w:tcBorders>
+            <w:tcMar>
+              <w:top w:w="100" w:type="dxa"/>
+              <w:left w:w="120" w:type="dxa"/>
+              <w:bottom w:w="100" w:type="dxa"/>
+              <w:right w:w="120" w:type="dxa"/>
+            </w:tcMar>
+            <w:vAlign w:val="center"/>
+          </w:tcPr>
+          <w:p>
+            <w:pPr>
+              <w:spacing w:after="40"/>
+              <w:rPr>
+                <w:lang w:val="id-ID"/>
+              </w:rPr>
+            </w:pPr>
+            <w:r>
+              <w:rPr>
+                <w:b/>
+                <w:bCs/>
+                <w:sz w:val="20"/>
+                <w:szCs w:val="20"/>
+                <w:lang w:val="id-ID"/>
+              </w:rPr>
+              <w:t xml:space="preserve">Lahan Terbuka</w:t>
+            </w:r>
+          </w:p>
+        </w:tc>
+        <w:tc>
+          <w:tcPr>
+            <w:tcW w:w="1600" w:type="dxa"/>
+            <w:tcBorders>
+              <w:top w:val="single" w:sz="4" w:space="0" w:color="999999"/>
+              <w:left w:val="single" w:sz="4" w:space="0" w:color="999999"/>
+              <w:bottom w:val="single" w:sz="4" w:space="0" w:color="999999"/>
+              <w:right w:val="single" w:sz="4" w:space="0" w:color="999999"/>
+            </w:tcBorders>
+            <w:tcMar>
+              <w:top w:w="100" w:type="dxa"/>
+              <w:left w:w="120" w:type="dxa"/>
+              <w:bottom w:w="100" w:type="dxa"/>
+              <w:right w:w="120" w:type="dxa"/>
+            </w:tcMar>
+            <w:vAlign w:val="center"/>
+          </w:tcPr>
+          <w:p>
+            <w:pPr>
+              <w:spacing w:after="40"/>
+              <w:jc w:val="center"/>
+              <w:rPr>
+                <w:lang w:val="id-ID"/>
+              </w:rPr>
+            </w:pPr>
+            <w:r>
+              <w:rPr>
+                <w:sz w:val="20"/>
+                <w:szCs w:val="20"/>
+                <w:lang w:val="id-ID"/>
+              </w:rPr>
+              <w:t xml:space="preserve">–</w:t>
+            </w:r>
+          </w:p>
+        </w:tc>
+        <w:tc>
+          <w:tcPr>
+            <w:tcW w:w="1600" w:type="dxa"/>
+            <w:tcBorders>
+              <w:top w:val="single" w:sz="4" w:space="0" w:color="999999"/>
+              <w:left w:val="single" w:sz="4" w:space="0" w:color="999999"/>
+              <w:bottom w:val="single" w:sz="4" w:space="0" w:color="999999"/>
+              <w:right w:val="single" w:sz="4" w:space="0" w:color="999999"/>
+            </w:tcBorders>
+            <w:tcMar>
+              <w:top w:w="100" w:type="dxa"/>
+              <w:left w:w="120" w:type="dxa"/>
+              <w:bottom w:w="100" w:type="dxa"/>
+              <w:right w:w="120" w:type="dxa"/>
+            </w:tcMar>
+            <w:vAlign w:val="center"/>
+          </w:tcPr>
+          <w:p>
+            <w:pPr>
+              <w:spacing w:after="40"/>
+              <w:jc w:val="center"/>
+              <w:rPr>
+                <w:lang w:val="id-ID"/>
+              </w:rPr>
+            </w:pPr>
+            <w:r>
+              <w:rPr>
+                <w:sz w:val="20"/>
+                <w:szCs w:val="20"/>
+                <w:lang w:val="id-ID"/>
+              </w:rPr>
+              <w:t xml:space="preserve">8</w:t>
+            </w:r>
+          </w:p>
+        </w:tc>
+        <w:tc>
+          <w:tcPr>
+            <w:tcW w:w="1600" w:type="dxa"/>
+            <w:tcBorders>
+              <w:top w:val="single" w:sz="4" w:space="0" w:color="999999"/>
+              <w:left w:val="single" w:sz="4" w:space="0" w:color="999999"/>
+              <w:bottom w:val="single" w:sz="4" w:space="0" w:color="999999"/>
+              <w:right w:val="single" w:sz="4" w:space="0" w:color="999999"/>
+            </w:tcBorders>
+            <w:tcMar>
+              <w:top w:w="100" w:type="dxa"/>
+              <w:left w:w="120" w:type="dxa"/>
+              <w:bottom w:w="100" w:type="dxa"/>
+              <w:right w:w="120" w:type="dxa"/>
+            </w:tcMar>
+            <w:vAlign w:val="center"/>
+          </w:tcPr>
+          <w:p>
+            <w:pPr>
+              <w:spacing w:after="40"/>
+              <w:jc w:val="center"/>
+              <w:rPr>
+                <w:lang w:val="id-ID"/>
+              </w:rPr>
+            </w:pPr>
+            <w:r>
+              <w:rPr>
+                <w:sz w:val="20"/>
+                <w:szCs w:val="20"/>
+                <w:lang w:val="id-ID"/>
+              </w:rPr>
+              <w:t xml:space="preserve">84</w:t>
+            </w:r>
+          </w:p>
+        </w:tc>
+        <w:tc>
+          <w:tcPr>
+            <w:tcW w:w="1600" w:type="dxa"/>
+            <w:tcBorders>
+              <w:top w:val="single" w:sz="4" w:space="0" w:color="999999"/>
+              <w:left w:val="single" w:sz="4" w:space="0" w:color="999999"/>
+              <w:bottom w:val="single" w:sz="4" w:space="0" w:color="999999"/>
+              <w:right w:val="single" w:sz="4" w:space="0" w:color="999999"/>
+            </w:tcBorders>
+            <w:tcMar>
+              <w:top w:w="100" w:type="dxa"/>
+              <w:left w:w="120" w:type="dxa"/>
+              <w:bottom w:w="100" w:type="dxa"/>
+              <w:right w:w="120" w:type="dxa"/>
+            </w:tcMar>
+            <w:vAlign w:val="center"/>
+          </w:tcPr>
+          <w:p>
+            <w:pPr>
+              <w:spacing w:after="40"/>
+              <w:jc w:val="center"/>
+              <w:rPr>
+                <w:lang w:val="id-ID"/>
+              </w:rPr>
+            </w:pPr>
+            <w:r>
+              <w:rPr>
+                <w:sz w:val="20"/>
+                <w:szCs w:val="20"/>
+                <w:lang w:val="id-ID"/>
+              </w:rPr>
+              <w:t xml:space="preserve">92</w:t>
+            </w:r>
+          </w:p>
+        </w:tc>
+      </w:tr>
+      <w:tr>
+        <w:trPr>
+          <w:cantSplit/>
+        </w:trPr>
+        <w:tc>
+          <w:tcPr>
+            <w:tcW w:w="2626" w:type="dxa"/>
+            <w:tcBorders>
+              <w:top w:val="single" w:sz="4" w:space="0" w:color="999999"/>
+              <w:left w:val="single" w:sz="4" w:space="0" w:color="999999"/>
+              <w:bottom w:val="single" w:sz="4" w:space="0" w:color="999999"/>
+              <w:right w:val="single" w:sz="4" w:space="0" w:color="999999"/>
+            </w:tcBorders>
+            <w:tcMar>
+              <w:top w:w="100" w:type="dxa"/>
+              <w:left w:w="120" w:type="dxa"/>
+              <w:bottom w:w="100" w:type="dxa"/>
+              <w:right w:w="120" w:type="dxa"/>
+            </w:tcMar>
+            <w:vAlign w:val="center"/>
+          </w:tcPr>
+          <w:p>
+            <w:pPr>
+              <w:spacing w:after="40"/>
+              <w:rPr>
+                <w:lang w:val="id-ID"/>
+              </w:rPr>
+            </w:pPr>
+            <w:r>
+              <w:rPr>
+                <w:b/>
+                <w:bCs/>
+                <w:sz w:val="20"/>
+                <w:szCs w:val="20"/>
+                <w:lang w:val="id-ID"/>
+              </w:rPr>
+              <w:t xml:space="preserve">Perkebunan</w:t>
+            </w:r>
+          </w:p>
+        </w:tc>
+        <w:tc>
+          <w:tcPr>
+            <w:tcW w:w="1600" w:type="dxa"/>
+            <w:tcBorders>
+              <w:top w:val="single" w:sz="4" w:space="0" w:color="999999"/>
+              <w:left w:val="single" w:sz="4" w:space="0" w:color="999999"/>
+              <w:bottom w:val="single" w:sz="4" w:space="0" w:color="999999"/>
+              <w:right w:val="single" w:sz="4" w:space="0" w:color="999999"/>
+            </w:tcBorders>
+            <w:tcMar>
+              <w:top w:w="100" w:type="dxa"/>
+              <w:left w:w="120" w:type="dxa"/>
+              <w:bottom w:w="100" w:type="dxa"/>
+              <w:right w:w="120" w:type="dxa"/>
+            </w:tcMar>
+            <w:vAlign w:val="center"/>
+          </w:tcPr>
+          <w:p>
+            <w:pPr>
+              <w:spacing w:after="40"/>
+              <w:jc w:val="center"/>
+              <w:rPr>
+                <w:lang w:val="id-ID"/>
+              </w:rPr>
+            </w:pPr>
+            <w:r>
+              <w:rPr>
+                <w:sz w:val="20"/>
+                <w:szCs w:val="20"/>
+                <w:lang w:val="id-ID"/>
+              </w:rPr>
+              <w:t xml:space="preserve">–</w:t>
+            </w:r>
+          </w:p>
+        </w:tc>
+        <w:tc>
+          <w:tcPr>
+            <w:tcW w:w="1600" w:type="dxa"/>
+            <w:tcBorders>
+              <w:top w:val="single" w:sz="4" w:space="0" w:color="999999"/>
+              <w:left w:val="single" w:sz="4" w:space="0" w:color="999999"/>
+              <w:bottom w:val="single" w:sz="4" w:space="0" w:color="999999"/>
+              <w:right w:val="single" w:sz="4" w:space="0" w:color="999999"/>
+            </w:tcBorders>
+            <w:tcMar>
+              <w:top w:w="100" w:type="dxa"/>
+              <w:left w:w="120" w:type="dxa"/>
+              <w:bottom w:w="100" w:type="dxa"/>
+              <w:right w:w="120" w:type="dxa"/>
+            </w:tcMar>
+            <w:vAlign w:val="center"/>
+          </w:tcPr>
+          <w:p>
+            <w:pPr>
+              <w:spacing w:after="40"/>
+              <w:jc w:val="center"/>
+              <w:rPr>
+                <w:lang w:val="id-ID"/>
+              </w:rPr>
+            </w:pPr>
+            <w:r>
+              <w:rPr>
+                <w:sz w:val="20"/>
+                <w:szCs w:val="20"/>
+                <w:lang w:val="id-ID"/>
+              </w:rPr>
+              <w:t xml:space="preserve">1</w:t>
+            </w:r>
+          </w:p>
+        </w:tc>
+        <w:tc>
+          <w:tcPr>
+            <w:tcW w:w="1600" w:type="dxa"/>
+            <w:tcBorders>
+              <w:top w:val="single" w:sz="4" w:space="0" w:color="999999"/>
+              <w:left w:val="single" w:sz="4" w:space="0" w:color="999999"/>
+              <w:bottom w:val="single" w:sz="4" w:space="0" w:color="999999"/>
+              <w:right w:val="single" w:sz="4" w:space="0" w:color="999999"/>
+            </w:tcBorders>
+            <w:tcMar>
+              <w:top w:w="100" w:type="dxa"/>
+              <w:left w:w="120" w:type="dxa"/>
+              <w:bottom w:w="100" w:type="dxa"/>
+              <w:right w:w="120" w:type="dxa"/>
+            </w:tcMar>
+            <w:vAlign w:val="center"/>
+          </w:tcPr>
+          <w:p>
+            <w:pPr>
+              <w:spacing w:after="40"/>
+              <w:jc w:val="center"/>
+              <w:rPr>
+                <w:lang w:val="id-ID"/>
+              </w:rPr>
+            </w:pPr>
+            <w:r>
+              <w:rPr>
+                <w:sz w:val="20"/>
+                <w:szCs w:val="20"/>
+                <w:lang w:val="id-ID"/>
+              </w:rPr>
+              <w:t xml:space="preserve">9</w:t>
+            </w:r>
+          </w:p>
+        </w:tc>
+        <w:tc>
+          <w:tcPr>
+            <w:tcW w:w="1600" w:type="dxa"/>
+            <w:tcBorders>
+              <w:top w:val="single" w:sz="4" w:space="0" w:color="999999"/>
+              <w:left w:val="single" w:sz="4" w:space="0" w:color="999999"/>
+              <w:bottom w:val="single" w:sz="4" w:space="0" w:color="999999"/>
+              <w:right w:val="single" w:sz="4" w:space="0" w:color="999999"/>
+            </w:tcBorders>
+            <w:tcMar>
+              <w:top w:w="100" w:type="dxa"/>
+              <w:left w:w="120" w:type="dxa"/>
+              <w:bottom w:w="100" w:type="dxa"/>
+              <w:right w:w="120" w:type="dxa"/>
+            </w:tcMar>
+            <w:vAlign w:val="center"/>
+          </w:tcPr>
+          <w:p>
+            <w:pPr>
+              <w:spacing w:after="40"/>
+              <w:jc w:val="center"/>
+              <w:rPr>
+                <w:lang w:val="id-ID"/>
+              </w:rPr>
+            </w:pPr>
+            <w:r>
+              <w:rPr>
+                <w:sz w:val="20"/>
+                <w:szCs w:val="20"/>
+                <w:lang w:val="id-ID"/>
+              </w:rPr>
+              <w:t xml:space="preserve">10</w:t>
+            </w:r>
+          </w:p>
+        </w:tc>
+      </w:tr>
+      <w:tr>
+        <w:trPr>
+          <w:cantSplit/>
+        </w:trPr>
+        <w:tc>
+          <w:tcPr>
+            <w:tcW w:w="2626" w:type="dxa"/>
+            <w:tcBorders>
+              <w:top w:val="single" w:sz="4" w:space="0" w:color="999999"/>
+              <w:left w:val="single" w:sz="4" w:space="0" w:color="999999"/>
+              <w:bottom w:val="single" w:sz="4" w:space="0" w:color="999999"/>
+              <w:right w:val="single" w:sz="4" w:space="0" w:color="999999"/>
+            </w:tcBorders>
+            <w:tcMar>
+              <w:top w:w="100" w:type="dxa"/>
+              <w:left w:w="120" w:type="dxa"/>
+              <w:bottom w:w="100" w:type="dxa"/>
+              <w:right w:w="120" w:type="dxa"/>
+            </w:tcMar>
+            <w:vAlign w:val="center"/>
+          </w:tcPr>
+          <w:p>
+            <w:pPr>
+              <w:spacing w:after="40"/>
+              <w:rPr>
+                <w:lang w:val="id-ID"/>
+              </w:rPr>
+            </w:pPr>
+            <w:r>
+              <w:rPr>
+                <w:b/>
+                <w:bCs/>
+                <w:b/>
+                <w:bCs/>
+                <w:sz w:val="20"/>
+                <w:szCs w:val="20"/>
+                <w:lang w:val="id-ID"/>
+              </w:rPr>
+              <w:t xml:space="preserve">Total</w:t>
+            </w:r>
+          </w:p>
+        </w:tc>
+        <w:tc>
+          <w:tcPr>
+            <w:tcW w:w="1600" w:type="dxa"/>
+            <w:tcBorders>
+              <w:top w:val="single" w:sz="4" w:space="0" w:color="999999"/>
+              <w:left w:val="single" w:sz="4" w:space="0" w:color="999999"/>
+              <w:bottom w:val="single" w:sz="4" w:space="0" w:color="999999"/>
+              <w:right w:val="single" w:sz="4" w:space="0" w:color="999999"/>
+            </w:tcBorders>
+            <w:tcMar>
+              <w:top w:w="100" w:type="dxa"/>
+              <w:left w:w="120" w:type="dxa"/>
+              <w:bottom w:w="100" w:type="dxa"/>
+              <w:right w:w="120" w:type="dxa"/>
+            </w:tcMar>
+            <w:vAlign w:val="center"/>
+          </w:tcPr>
+          <w:p>
+            <w:pPr>
+              <w:spacing w:after="40"/>
+              <w:jc w:val="center"/>
+              <w:rPr>
+                <w:lang w:val="id-ID"/>
+              </w:rPr>
+            </w:pPr>
+            <w:r>
+              <w:rPr>
+                <w:b/>
+                <w:bCs/>
+                <w:sz w:val="20"/>
+                <w:szCs w:val="20"/>
+                <w:lang w:val="id-ID"/>
+              </w:rPr>
+              <w:t xml:space="preserve">453</w:t>
+            </w:r>
+          </w:p>
+        </w:tc>
+        <w:tc>
+          <w:tcPr>
+            <w:tcW w:w="1600" w:type="dxa"/>
+            <w:tcBorders>
+              <w:top w:val="single" w:sz="4" w:space="0" w:color="999999"/>
+              <w:left w:val="single" w:sz="4" w:space="0" w:color="999999"/>
+              <w:bottom w:val="single" w:sz="4" w:space="0" w:color="999999"/>
+              <w:right w:val="single" w:sz="4" w:space="0" w:color="999999"/>
+            </w:tcBorders>
+            <w:tcMar>
+              <w:top w:w="100" w:type="dxa"/>
+              <w:left w:w="120" w:type="dxa"/>
+              <w:bottom w:w="100" w:type="dxa"/>
+              <w:right w:w="120" w:type="dxa"/>
+            </w:tcMar>
+            <w:vAlign w:val="center"/>
+          </w:tcPr>
+          <w:p>
+            <w:pPr>
+              <w:spacing w:after="40"/>
+              <w:jc w:val="center"/>
+              <w:rPr>
+                <w:lang w:val="id-ID"/>
+              </w:rPr>
+            </w:pPr>
+            <w:r>
+              <w:rPr>
+                <w:b/>
+                <w:bCs/>
+                <w:sz w:val="20"/>
+                <w:szCs w:val="20"/>
+                <w:lang w:val="id-ID"/>
+              </w:rPr>
+              <w:t xml:space="preserve">1.587</w:t>
+            </w:r>
+          </w:p>
+        </w:tc>
+        <w:tc>
+          <w:tcPr>
+            <w:tcW w:w="1600" w:type="dxa"/>
+            <w:tcBorders>
+              <w:top w:val="single" w:sz="4" w:space="0" w:color="999999"/>
+              <w:left w:val="single" w:sz="4" w:space="0" w:color="999999"/>
+              <w:bottom w:val="single" w:sz="4" w:space="0" w:color="999999"/>
+              <w:right w:val="single" w:sz="4" w:space="0" w:color="999999"/>
+            </w:tcBorders>
+            <w:tcMar>
+              <w:top w:w="100" w:type="dxa"/>
+              <w:left w:w="120" w:type="dxa"/>
+              <w:bottom w:w="100" w:type="dxa"/>
+              <w:right w:w="120" w:type="dxa"/>
+            </w:tcMar>
+            <w:vAlign w:val="center"/>
+          </w:tcPr>
+          <w:p>
+            <w:pPr>
+              <w:spacing w:after="40"/>
+              <w:jc w:val="center"/>
+              <w:rPr>
+                <w:lang w:val="id-ID"/>
+              </w:rPr>
+            </w:pPr>
+            <w:r>
+              <w:rPr>
+                <w:b/>
+                <w:bCs/>
+                <w:sz w:val="20"/>
+                <w:szCs w:val="20"/>
+                <w:lang w:val="id-ID"/>
+              </w:rPr>
+              <w:t xml:space="preserve">429</w:t>
+            </w:r>
+          </w:p>
+        </w:tc>
+        <w:tc>
+          <w:tcPr>
+            <w:tcW w:w="1600" w:type="dxa"/>
+            <w:tcBorders>
+              <w:top w:val="single" w:sz="4" w:space="0" w:color="999999"/>
+              <w:left w:val="single" w:sz="4" w:space="0" w:color="999999"/>
+              <w:bottom w:val="single" w:sz="4" w:space="0" w:color="999999"/>
+              <w:right w:val="single" w:sz="4" w:space="0" w:color="999999"/>
+            </w:tcBorders>
+            <w:tcMar>
+              <w:top w:w="100" w:type="dxa"/>
+              <w:left w:w="120" w:type="dxa"/>
+              <w:bottom w:w="100" w:type="dxa"/>
+              <w:right w:w="120" w:type="dxa"/>
+            </w:tcMar>
+            <w:vAlign w:val="center"/>
+          </w:tcPr>
+          <w:p>
+            <w:pPr>
+              <w:spacing w:after="40"/>
+              <w:jc w:val="center"/>
+              <w:rPr>
+                <w:lang w:val="id-ID"/>
+              </w:rPr>
+            </w:pPr>
+            <w:r>
+              <w:rPr>
+                <w:b/>
+                <w:bCs/>
+                <w:sz w:val="20"/>
+                <w:szCs w:val="20"/>
+                <w:lang w:val="id-ID"/>
+              </w:rPr>
+              <w:t xml:space="preserve">2.469</w:t>
+            </w:r>
+          </w:p>
+        </w:tc>
+      </w:tr>
+    </w:tbl>
+    <w:p>
+      <w:pPr>
+        <w:spacing w:after="60"/>
+      </w:pPr>
+    </w:p>
+    <w:p>
+      <w:pPr>
+        <w:spacing w:before="80" w:after="200" w:line="276" w:lineRule="auto"/>
+        <w:jc w:val="both"/>
+        <w:rPr>
+          <w:lang w:val="id-ID"/>
+        </w:rPr>
+      </w:pPr>
+      <w:r>
+        <w:rPr>
+          <w:i/>
+          <w:iCs/>
+          <w:color w:val="595959"/>
+          <w:sz w:val="20"/>
+          <w:szCs w:val="20"/>
+          <w:lang w:val="id-ID"/>
+        </w:rPr>
+        <w:t xml:space="preserve">Sumber: pre-assessment carbon accounting SAMPAN Kalimantan, overlay Peta Penutupan Lahan 2022 dan peta KHG skala 1:250.000.</w:t>
       </w:r>
     </w:p>
     <w:p>
@@ -1143,7 +2329,7 @@
                 <w:szCs w:val="20"/>
                 <w:lang w:val="id-ID"/>
               </w:rPr>
-              <w:t xml:space="preserve">Mereview pemilihan metodologi dan perhitungan; melakukan perhitungan ulang atas sampel data.</w:t>
+              <w:t xml:space="preserve">Mereview pre-assessment carbon accounting gambut (sumber dan skala peta, bulk density, fraksi karbon, faktor emisi), pemilihan metodologi, dan perhitungan; melakukan perhitungan ulang atas sampel data.</w:t>
             </w:r>
           </w:p>
         </w:tc>
@@ -2360,7 +3546,7 @@
                 <w:szCs w:val="20"/>
                 <w:lang w:val="id-ID"/>
               </w:rPr>
-              <w:t xml:space="preserve">Rapat awal; telaah RKPS, RKT, peta, dan hasil pre-assessment; gap analysis terhadap PV Climate; penyepakatan rencana kerja dan checklist QA/QC. Output: laporan inception dan matriks gap analysis.</w:t>
+              <w:t xml:space="preserve">Rapat awal; telaah RKPS, RKT, peta, hasil pre-assessment biomassa, dan pre-assessment carbon accounting gambut; gap analysis terhadap PV Climate; penyepakatan rencana kerja dan checklist QA/QC. Output: laporan inception dan matriks gap analysis.</w:t>
             </w:r>
           </w:p>
         </w:tc>
@@ -3931,7 +5117,7 @@
                 <w:szCs w:val="20"/>
                 <w:lang w:val="id-ID"/>
               </w:rPr>
-              <w:t xml:space="preserve">Laporan inception: rencana kerja, matriks gap analysis, dan checklist QA/QC</w:t>
+              <w:t xml:space="preserve">Laporan inception: rencana kerja, matriks gap analysis, catatan review pre-assessment carbon accounting gambut, dan checklist QA/QC</w:t>
             </w:r>
           </w:p>
         </w:tc>

</xml_diff>

<commit_message>
Use updated peat carbon accounting figures in KAK TAT
Co-Authored-By: Claude Opus 5.5 <noreply@anthropic.com>
Claude-Session: https://claude.ai/code/session_016hKM1xZpgjxw9qEmhhTJUQ
</commit_message>
<xml_diff>
--- a/KAK_TAT_PIN_PDD_PlanVivo_Desa_Pasir.docx
+++ b/KAK_TAT_PIN_PDD_PlanVivo_Desa_Pasir.docx
@@ -161,7 +161,7 @@
         <w:rPr>
           <w:lang w:val="id-ID"/>
         </w:rPr>
-        <w:t xml:space="preserve">Kawasan ini didominasi ekosistem gambut seluas 2.014,34 ha (81,60%). Sekitar 1.482,18 ha (60,04%) masih berupa hutan, sedangkan hampir 40% lainnya berupa semak belukar, perkebunan sawit, dan lahan terbuka. Pembagian kawasan menetapkan 1.299,01 ha untuk perlindungan dan 1.169,49 ha untuk rehabilitasi, sehingga desain proyek memadukan perlindungan hutan (pengurangan emisi dari deforestasi dan degradasi, termasuk gambut) dengan pemulihan ekosistem pada areal terdegradasi. Hasil pre-assessment menunjukkan potensi stok karbon biomassa hidup sekitar 773.000–835.000 tCO₂e, di luar karbon tanah gambut, serta potensi emisi dekomposisi gambut sekitar 76.961 tCO₂e per tahun. Kawasan ini juga merupakan habitat Orangutan Kalimantan, Trenggiling Sunda, Beruang Madu, dan Rangkong Gading.</w:t>
+        <w:t xml:space="preserve">Kawasan ini didominasi ekosistem gambut seluas 2.014,34 ha (81,60%). Sekitar 1.482,18 ha (60,04%) masih berupa hutan, sedangkan hampir 40% lainnya berupa semak belukar, perkebunan sawit, dan lahan terbuka. Pembagian kawasan menetapkan 1.299,01 ha untuk perlindungan dan 1.169,49 ha untuk rehabilitasi, sehingga desain proyek memadukan perlindungan hutan (pengurangan emisi dari deforestasi dan degradasi, termasuk gambut) dengan pemulihan ekosistem pada areal terdegradasi. Hasil pre-assessment menunjukkan potensi stok karbon biomassa hidup sekitar 773.000–835.000 tCO₂e, di luar karbon tanah gambut. Kawasan ini juga merupakan habitat Orangutan Kalimantan, Trenggiling Sunda, Beruang Madu, dan Rangkong Gading.</w:t>
       </w:r>
     </w:p>
     <w:p>
@@ -1348,6 +1348,1210 @@
           <w:lang w:val="id-ID"/>
         </w:rPr>
         <w:t xml:space="preserve">Sumber: pre-assessment carbon accounting SAMPAN Kalimantan, overlay Peta Penutupan Lahan 2022 dan peta KHG skala 1:250.000.</w:t>
+      </w:r>
+    </w:p>
+    <w:p>
+      <w:pPr>
+        <w:spacing w:after="200" w:line="300" w:lineRule="auto"/>
+        <w:jc w:val="both"/>
+        <w:rPr>
+          <w:lang w:val="id-ID"/>
+        </w:rPr>
+      </w:pPr>
+      <w:r>
+        <w:rPr>
+          <w:lang w:val="id-ID"/>
+        </w:rPr>
+        <w:t xml:space="preserve">Dengan menerapkan faktor emisi dekomposisi gambut per tutupan lahan, pre-assessment memperkirakan emisi gambut pada kondisi saat ini sekitar </w:t>
+      </w:r>
+      <w:r>
+        <w:rPr>
+          <w:b/>
+          <w:bCs/>
+          <w:lang w:val="id-ID"/>
+        </w:rPr>
+        <w:t xml:space="preserve">48.593 tCO₂e per tahun</w:t>
+      </w:r>
+      <w:r>
+        <w:rPr>
+          <w:lang w:val="id-ID"/>
+        </w:rPr>
+        <w:t xml:space="preserve"> dan stok karbon tanah gambut sekitar </w:t>
+      </w:r>
+      <w:r>
+        <w:rPr>
+          <w:b/>
+          <w:bCs/>
+          <w:lang w:val="id-ID"/>
+        </w:rPr>
+        <w:t xml:space="preserve">2,09 juta tC atau 7,66 juta tCO₂e</w:t>
+      </w:r>
+      <w:r>
+        <w:rPr>
+          <w:lang w:val="id-ID"/>
+        </w:rPr>
+        <w:t xml:space="preserve"> (Tabel 2). Angka ini masih indikatif. Emisi tersebut merupakan emisi kotor pada kondisi tutupan lahan saat ini, bukan pengurangan emisi yang dapat dikreditkan, yang baru dapat dihitung dari selisih skenario baseline dan skenario proyek. Nilai bulk density dan fraksi karbon yang digunakan juga perlu diverifikasi dengan pengukuran lapangan.</w:t>
+      </w:r>
+    </w:p>
+    <w:p>
+      <w:pPr>
+        <w:keepNext/>
+        <w:spacing w:before="80" w:after="200" w:line="276" w:lineRule="auto"/>
+        <w:jc w:val="both"/>
+        <w:rPr>
+          <w:lang w:val="id-ID"/>
+        </w:rPr>
+      </w:pPr>
+      <w:r>
+        <w:rPr>
+          <w:i/>
+          <w:iCs/>
+          <w:color w:val="595959"/>
+          <w:sz w:val="20"/>
+          <w:szCs w:val="20"/>
+          <w:lang w:val="id-ID"/>
+        </w:rPr>
+        <w:t xml:space="preserve">Tabel 2. Estimasi emisi dekomposisi dan stok karbon gambut menurut tutupan lahan</w:t>
+      </w:r>
+    </w:p>
+    <w:tbl>
+      <w:tblPr>
+        <w:tblW w:w="9026" w:type="dxa"/>
+        <w:tblLayout w:type="fixed"/>
+        <w:tblLook w:val="04A0" w:firstRow="1" w:lastRow="0" w:firstColumn="1" w:lastColumn="0" w:noHBand="0" w:noVBand="1"/>
+      </w:tblPr>
+      <w:tblGrid>
+        <w:gridCol w:w="2626"/>
+        <w:gridCol w:w="1200"/>
+        <w:gridCol w:w="1500"/>
+        <w:gridCol w:w="1800"/>
+        <w:gridCol w:w="1900"/>
+      </w:tblGrid>
+      <w:tr>
+        <w:trPr>
+          <w:tblHeader/>
+          <w:cantSplit/>
+        </w:trPr>
+        <w:tc>
+          <w:tcPr>
+            <w:tcW w:w="2626" w:type="dxa"/>
+            <w:tcBorders>
+              <w:top w:val="single" w:sz="4" w:space="0" w:color="999999"/>
+              <w:left w:val="single" w:sz="4" w:space="0" w:color="999999"/>
+              <w:bottom w:val="single" w:sz="4" w:space="0" w:color="999999"/>
+              <w:right w:val="single" w:sz="4" w:space="0" w:color="999999"/>
+            </w:tcBorders>
+            <w:shd w:val="clear" w:color="auto" w:fill="D9D9D9"/>
+            <w:tcMar>
+              <w:top w:w="80" w:type="dxa"/>
+              <w:left w:w="100" w:type="dxa"/>
+              <w:bottom w:w="80" w:type="dxa"/>
+              <w:right w:w="100" w:type="dxa"/>
+            </w:tcMar>
+            <w:vAlign w:val="center"/>
+          </w:tcPr>
+          <w:p>
+            <w:pPr>
+              <w:spacing w:after="40"/>
+              <w:jc w:val="center"/>
+              <w:rPr>
+                <w:lang w:val="id-ID"/>
+              </w:rPr>
+            </w:pPr>
+            <w:r>
+              <w:rPr>
+                <w:b/>
+                <w:bCs/>
+                <w:sz w:val="20"/>
+                <w:szCs w:val="20"/>
+                <w:lang w:val="id-ID"/>
+              </w:rPr>
+              <w:t xml:space="preserve">Tutupan Lahan</w:t>
+            </w:r>
+          </w:p>
+        </w:tc>
+        <w:tc>
+          <w:tcPr>
+            <w:tcW w:w="1200" w:type="dxa"/>
+            <w:tcBorders>
+              <w:top w:val="single" w:sz="4" w:space="0" w:color="999999"/>
+              <w:left w:val="single" w:sz="4" w:space="0" w:color="999999"/>
+              <w:bottom w:val="single" w:sz="4" w:space="0" w:color="999999"/>
+              <w:right w:val="single" w:sz="4" w:space="0" w:color="999999"/>
+            </w:tcBorders>
+            <w:shd w:val="clear" w:color="auto" w:fill="D9D9D9"/>
+            <w:tcMar>
+              <w:top w:w="80" w:type="dxa"/>
+              <w:left w:w="100" w:type="dxa"/>
+              <w:bottom w:w="80" w:type="dxa"/>
+              <w:right w:w="100" w:type="dxa"/>
+            </w:tcMar>
+            <w:vAlign w:val="center"/>
+          </w:tcPr>
+          <w:p>
+            <w:pPr>
+              <w:spacing w:after="40"/>
+              <w:jc w:val="center"/>
+              <w:rPr>
+                <w:lang w:val="id-ID"/>
+              </w:rPr>
+            </w:pPr>
+            <w:r>
+              <w:rPr>
+                <w:b/>
+                <w:bCs/>
+                <w:sz w:val="20"/>
+                <w:szCs w:val="20"/>
+                <w:lang w:val="id-ID"/>
+              </w:rPr>
+              <w:t xml:space="preserve">Luas (ha)</w:t>
+            </w:r>
+          </w:p>
+        </w:tc>
+        <w:tc>
+          <w:tcPr>
+            <w:tcW w:w="1500" w:type="dxa"/>
+            <w:tcBorders>
+              <w:top w:val="single" w:sz="4" w:space="0" w:color="999999"/>
+              <w:left w:val="single" w:sz="4" w:space="0" w:color="999999"/>
+              <w:bottom w:val="single" w:sz="4" w:space="0" w:color="999999"/>
+              <w:right w:val="single" w:sz="4" w:space="0" w:color="999999"/>
+            </w:tcBorders>
+            <w:shd w:val="clear" w:color="auto" w:fill="D9D9D9"/>
+            <w:tcMar>
+              <w:top w:w="80" w:type="dxa"/>
+              <w:left w:w="100" w:type="dxa"/>
+              <w:bottom w:w="80" w:type="dxa"/>
+              <w:right w:w="100" w:type="dxa"/>
+            </w:tcMar>
+            <w:vAlign w:val="center"/>
+          </w:tcPr>
+          <w:p>
+            <w:pPr>
+              <w:spacing w:after="40"/>
+              <w:jc w:val="center"/>
+              <w:rPr>
+                <w:lang w:val="id-ID"/>
+              </w:rPr>
+            </w:pPr>
+            <w:r>
+              <w:rPr>
+                <w:b/>
+                <w:bCs/>
+                <w:sz w:val="20"/>
+                <w:szCs w:val="20"/>
+                <w:lang w:val="id-ID"/>
+              </w:rPr>
+              <w:t xml:space="preserve">Faktor Emisi (tCO₂e/ha/thn)</w:t>
+            </w:r>
+          </w:p>
+        </w:tc>
+        <w:tc>
+          <w:tcPr>
+            <w:tcW w:w="1800" w:type="dxa"/>
+            <w:tcBorders>
+              <w:top w:val="single" w:sz="4" w:space="0" w:color="999999"/>
+              <w:left w:val="single" w:sz="4" w:space="0" w:color="999999"/>
+              <w:bottom w:val="single" w:sz="4" w:space="0" w:color="999999"/>
+              <w:right w:val="single" w:sz="4" w:space="0" w:color="999999"/>
+            </w:tcBorders>
+            <w:shd w:val="clear" w:color="auto" w:fill="D9D9D9"/>
+            <w:tcMar>
+              <w:top w:w="80" w:type="dxa"/>
+              <w:left w:w="100" w:type="dxa"/>
+              <w:bottom w:w="80" w:type="dxa"/>
+              <w:right w:w="100" w:type="dxa"/>
+            </w:tcMar>
+            <w:vAlign w:val="center"/>
+          </w:tcPr>
+          <w:p>
+            <w:pPr>
+              <w:spacing w:after="40"/>
+              <w:jc w:val="center"/>
+              <w:rPr>
+                <w:lang w:val="id-ID"/>
+              </w:rPr>
+            </w:pPr>
+            <w:r>
+              <w:rPr>
+                <w:b/>
+                <w:bCs/>
+                <w:sz w:val="20"/>
+                <w:szCs w:val="20"/>
+                <w:lang w:val="id-ID"/>
+              </w:rPr>
+              <w:t xml:space="preserve">Emisi (tCO₂e/thn)</w:t>
+            </w:r>
+          </w:p>
+        </w:tc>
+        <w:tc>
+          <w:tcPr>
+            <w:tcW w:w="1900" w:type="dxa"/>
+            <w:tcBorders>
+              <w:top w:val="single" w:sz="4" w:space="0" w:color="999999"/>
+              <w:left w:val="single" w:sz="4" w:space="0" w:color="999999"/>
+              <w:bottom w:val="single" w:sz="4" w:space="0" w:color="999999"/>
+              <w:right w:val="single" w:sz="4" w:space="0" w:color="999999"/>
+            </w:tcBorders>
+            <w:shd w:val="clear" w:color="auto" w:fill="D9D9D9"/>
+            <w:tcMar>
+              <w:top w:w="80" w:type="dxa"/>
+              <w:left w:w="100" w:type="dxa"/>
+              <w:bottom w:w="80" w:type="dxa"/>
+              <w:right w:w="100" w:type="dxa"/>
+            </w:tcMar>
+            <w:vAlign w:val="center"/>
+          </w:tcPr>
+          <w:p>
+            <w:pPr>
+              <w:spacing w:after="40"/>
+              <w:jc w:val="center"/>
+              <w:rPr>
+                <w:lang w:val="id-ID"/>
+              </w:rPr>
+            </w:pPr>
+            <w:r>
+              <w:rPr>
+                <w:b/>
+                <w:bCs/>
+                <w:sz w:val="20"/>
+                <w:szCs w:val="20"/>
+                <w:lang w:val="id-ID"/>
+              </w:rPr>
+              <w:t xml:space="preserve">Stok Karbon Gambut (tCO₂e)</w:t>
+            </w:r>
+          </w:p>
+        </w:tc>
+      </w:tr>
+      <w:tr>
+        <w:trPr>
+          <w:cantSplit/>
+        </w:trPr>
+        <w:tc>
+          <w:tcPr>
+            <w:tcW w:w="2626" w:type="dxa"/>
+            <w:tcBorders>
+              <w:top w:val="single" w:sz="4" w:space="0" w:color="999999"/>
+              <w:left w:val="single" w:sz="4" w:space="0" w:color="999999"/>
+              <w:bottom w:val="single" w:sz="4" w:space="0" w:color="999999"/>
+              <w:right w:val="single" w:sz="4" w:space="0" w:color="999999"/>
+            </w:tcBorders>
+            <w:tcMar>
+              <w:top w:w="100" w:type="dxa"/>
+              <w:left w:w="120" w:type="dxa"/>
+              <w:bottom w:w="100" w:type="dxa"/>
+              <w:right w:w="120" w:type="dxa"/>
+            </w:tcMar>
+            <w:vAlign w:val="center"/>
+          </w:tcPr>
+          <w:p>
+            <w:pPr>
+              <w:spacing w:after="40"/>
+              <w:rPr>
+                <w:lang w:val="id-ID"/>
+              </w:rPr>
+            </w:pPr>
+            <w:r>
+              <w:rPr>
+                <w:b/>
+                <w:bCs/>
+                <w:sz w:val="20"/>
+                <w:szCs w:val="20"/>
+                <w:lang w:val="id-ID"/>
+              </w:rPr>
+              <w:t xml:space="preserve">Hutan Rawa Sekunder</w:t>
+            </w:r>
+          </w:p>
+        </w:tc>
+        <w:tc>
+          <w:tcPr>
+            <w:tcW w:w="1200" w:type="dxa"/>
+            <w:tcBorders>
+              <w:top w:val="single" w:sz="4" w:space="0" w:color="999999"/>
+              <w:left w:val="single" w:sz="4" w:space="0" w:color="999999"/>
+              <w:bottom w:val="single" w:sz="4" w:space="0" w:color="999999"/>
+              <w:right w:val="single" w:sz="4" w:space="0" w:color="999999"/>
+            </w:tcBorders>
+            <w:tcMar>
+              <w:top w:w="100" w:type="dxa"/>
+              <w:left w:w="120" w:type="dxa"/>
+              <w:bottom w:w="100" w:type="dxa"/>
+              <w:right w:w="120" w:type="dxa"/>
+            </w:tcMar>
+            <w:vAlign w:val="center"/>
+          </w:tcPr>
+          <w:p>
+            <w:pPr>
+              <w:spacing w:after="40"/>
+              <w:jc w:val="center"/>
+              <w:rPr>
+                <w:lang w:val="id-ID"/>
+              </w:rPr>
+            </w:pPr>
+            <w:r>
+              <w:rPr>
+                <w:sz w:val="20"/>
+                <w:szCs w:val="20"/>
+                <w:lang w:val="id-ID"/>
+              </w:rPr>
+              <w:t xml:space="preserve">1.333</w:t>
+            </w:r>
+          </w:p>
+        </w:tc>
+        <w:tc>
+          <w:tcPr>
+            <w:tcW w:w="1500" w:type="dxa"/>
+            <w:tcBorders>
+              <w:top w:val="single" w:sz="4" w:space="0" w:color="999999"/>
+              <w:left w:val="single" w:sz="4" w:space="0" w:color="999999"/>
+              <w:bottom w:val="single" w:sz="4" w:space="0" w:color="999999"/>
+              <w:right w:val="single" w:sz="4" w:space="0" w:color="999999"/>
+            </w:tcBorders>
+            <w:tcMar>
+              <w:top w:w="100" w:type="dxa"/>
+              <w:left w:w="120" w:type="dxa"/>
+              <w:bottom w:w="100" w:type="dxa"/>
+              <w:right w:w="120" w:type="dxa"/>
+            </w:tcMar>
+            <w:vAlign w:val="center"/>
+          </w:tcPr>
+          <w:p>
+            <w:pPr>
+              <w:spacing w:after="40"/>
+              <w:jc w:val="center"/>
+              <w:rPr>
+                <w:lang w:val="id-ID"/>
+              </w:rPr>
+            </w:pPr>
+            <w:r>
+              <w:rPr>
+                <w:sz w:val="20"/>
+                <w:szCs w:val="20"/>
+                <w:lang w:val="id-ID"/>
+              </w:rPr>
+              <w:t xml:space="preserve">19</w:t>
+            </w:r>
+          </w:p>
+        </w:tc>
+        <w:tc>
+          <w:tcPr>
+            <w:tcW w:w="1800" w:type="dxa"/>
+            <w:tcBorders>
+              <w:top w:val="single" w:sz="4" w:space="0" w:color="999999"/>
+              <w:left w:val="single" w:sz="4" w:space="0" w:color="999999"/>
+              <w:bottom w:val="single" w:sz="4" w:space="0" w:color="999999"/>
+              <w:right w:val="single" w:sz="4" w:space="0" w:color="999999"/>
+            </w:tcBorders>
+            <w:tcMar>
+              <w:top w:w="100" w:type="dxa"/>
+              <w:left w:w="120" w:type="dxa"/>
+              <w:bottom w:w="100" w:type="dxa"/>
+              <w:right w:w="120" w:type="dxa"/>
+            </w:tcMar>
+            <w:vAlign w:val="center"/>
+          </w:tcPr>
+          <w:p>
+            <w:pPr>
+              <w:spacing w:after="40"/>
+              <w:jc w:val="center"/>
+              <w:rPr>
+                <w:lang w:val="id-ID"/>
+              </w:rPr>
+            </w:pPr>
+            <w:r>
+              <w:rPr>
+                <w:sz w:val="20"/>
+                <w:szCs w:val="20"/>
+                <w:lang w:val="id-ID"/>
+              </w:rPr>
+              <w:t xml:space="preserve">25.327</w:t>
+            </w:r>
+          </w:p>
+        </w:tc>
+        <w:tc>
+          <w:tcPr>
+            <w:tcW w:w="1900" w:type="dxa"/>
+            <w:tcBorders>
+              <w:top w:val="single" w:sz="4" w:space="0" w:color="999999"/>
+              <w:left w:val="single" w:sz="4" w:space="0" w:color="999999"/>
+              <w:bottom w:val="single" w:sz="4" w:space="0" w:color="999999"/>
+              <w:right w:val="single" w:sz="4" w:space="0" w:color="999999"/>
+            </w:tcBorders>
+            <w:tcMar>
+              <w:top w:w="100" w:type="dxa"/>
+              <w:left w:w="120" w:type="dxa"/>
+              <w:bottom w:w="100" w:type="dxa"/>
+              <w:right w:w="120" w:type="dxa"/>
+            </w:tcMar>
+            <w:vAlign w:val="center"/>
+          </w:tcPr>
+          <w:p>
+            <w:pPr>
+              <w:spacing w:after="40"/>
+              <w:jc w:val="center"/>
+              <w:rPr>
+                <w:lang w:val="id-ID"/>
+              </w:rPr>
+            </w:pPr>
+            <w:r>
+              <w:rPr>
+                <w:sz w:val="20"/>
+                <w:szCs w:val="20"/>
+                <w:lang w:val="id-ID"/>
+              </w:rPr>
+              <w:t xml:space="preserve">3.221.625</w:t>
+            </w:r>
+          </w:p>
+        </w:tc>
+      </w:tr>
+      <w:tr>
+        <w:trPr>
+          <w:cantSplit/>
+        </w:trPr>
+        <w:tc>
+          <w:tcPr>
+            <w:tcW w:w="2626" w:type="dxa"/>
+            <w:tcBorders>
+              <w:top w:val="single" w:sz="4" w:space="0" w:color="999999"/>
+              <w:left w:val="single" w:sz="4" w:space="0" w:color="999999"/>
+              <w:bottom w:val="single" w:sz="4" w:space="0" w:color="999999"/>
+              <w:right w:val="single" w:sz="4" w:space="0" w:color="999999"/>
+            </w:tcBorders>
+            <w:tcMar>
+              <w:top w:w="100" w:type="dxa"/>
+              <w:left w:w="120" w:type="dxa"/>
+              <w:bottom w:w="100" w:type="dxa"/>
+              <w:right w:w="120" w:type="dxa"/>
+            </w:tcMar>
+            <w:vAlign w:val="center"/>
+          </w:tcPr>
+          <w:p>
+            <w:pPr>
+              <w:spacing w:after="40"/>
+              <w:rPr>
+                <w:lang w:val="id-ID"/>
+              </w:rPr>
+            </w:pPr>
+            <w:r>
+              <w:rPr>
+                <w:b/>
+                <w:bCs/>
+                <w:sz w:val="20"/>
+                <w:szCs w:val="20"/>
+                <w:lang w:val="id-ID"/>
+              </w:rPr>
+              <w:t xml:space="preserve">Semak Belukar Rawa</w:t>
+            </w:r>
+          </w:p>
+        </w:tc>
+        <w:tc>
+          <w:tcPr>
+            <w:tcW w:w="1200" w:type="dxa"/>
+            <w:tcBorders>
+              <w:top w:val="single" w:sz="4" w:space="0" w:color="999999"/>
+              <w:left w:val="single" w:sz="4" w:space="0" w:color="999999"/>
+              <w:bottom w:val="single" w:sz="4" w:space="0" w:color="999999"/>
+              <w:right w:val="single" w:sz="4" w:space="0" w:color="999999"/>
+            </w:tcBorders>
+            <w:tcMar>
+              <w:top w:w="100" w:type="dxa"/>
+              <w:left w:w="120" w:type="dxa"/>
+              <w:bottom w:w="100" w:type="dxa"/>
+              <w:right w:w="120" w:type="dxa"/>
+            </w:tcMar>
+            <w:vAlign w:val="center"/>
+          </w:tcPr>
+          <w:p>
+            <w:pPr>
+              <w:spacing w:after="40"/>
+              <w:jc w:val="center"/>
+              <w:rPr>
+                <w:lang w:val="id-ID"/>
+              </w:rPr>
+            </w:pPr>
+            <w:r>
+              <w:rPr>
+                <w:sz w:val="20"/>
+                <w:szCs w:val="20"/>
+                <w:lang w:val="id-ID"/>
+              </w:rPr>
+              <w:t xml:space="preserve">1.034</w:t>
+            </w:r>
+          </w:p>
+        </w:tc>
+        <w:tc>
+          <w:tcPr>
+            <w:tcW w:w="1500" w:type="dxa"/>
+            <w:tcBorders>
+              <w:top w:val="single" w:sz="4" w:space="0" w:color="999999"/>
+              <w:left w:val="single" w:sz="4" w:space="0" w:color="999999"/>
+              <w:bottom w:val="single" w:sz="4" w:space="0" w:color="999999"/>
+              <w:right w:val="single" w:sz="4" w:space="0" w:color="999999"/>
+            </w:tcBorders>
+            <w:tcMar>
+              <w:top w:w="100" w:type="dxa"/>
+              <w:left w:w="120" w:type="dxa"/>
+              <w:bottom w:w="100" w:type="dxa"/>
+              <w:right w:w="120" w:type="dxa"/>
+            </w:tcMar>
+            <w:vAlign w:val="center"/>
+          </w:tcPr>
+          <w:p>
+            <w:pPr>
+              <w:spacing w:after="40"/>
+              <w:jc w:val="center"/>
+              <w:rPr>
+                <w:lang w:val="id-ID"/>
+              </w:rPr>
+            </w:pPr>
+            <w:r>
+              <w:rPr>
+                <w:sz w:val="20"/>
+                <w:szCs w:val="20"/>
+                <w:lang w:val="id-ID"/>
+              </w:rPr>
+              <w:t xml:space="preserve">19</w:t>
+            </w:r>
+          </w:p>
+        </w:tc>
+        <w:tc>
+          <w:tcPr>
+            <w:tcW w:w="1800" w:type="dxa"/>
+            <w:tcBorders>
+              <w:top w:val="single" w:sz="4" w:space="0" w:color="999999"/>
+              <w:left w:val="single" w:sz="4" w:space="0" w:color="999999"/>
+              <w:bottom w:val="single" w:sz="4" w:space="0" w:color="999999"/>
+              <w:right w:val="single" w:sz="4" w:space="0" w:color="999999"/>
+            </w:tcBorders>
+            <w:tcMar>
+              <w:top w:w="100" w:type="dxa"/>
+              <w:left w:w="120" w:type="dxa"/>
+              <w:bottom w:w="100" w:type="dxa"/>
+              <w:right w:w="120" w:type="dxa"/>
+            </w:tcMar>
+            <w:vAlign w:val="center"/>
+          </w:tcPr>
+          <w:p>
+            <w:pPr>
+              <w:spacing w:after="40"/>
+              <w:jc w:val="center"/>
+              <w:rPr>
+                <w:lang w:val="id-ID"/>
+              </w:rPr>
+            </w:pPr>
+            <w:r>
+              <w:rPr>
+                <w:sz w:val="20"/>
+                <w:szCs w:val="20"/>
+                <w:lang w:val="id-ID"/>
+              </w:rPr>
+              <w:t xml:space="preserve">19.646</w:t>
+            </w:r>
+          </w:p>
+        </w:tc>
+        <w:tc>
+          <w:tcPr>
+            <w:tcW w:w="1900" w:type="dxa"/>
+            <w:tcBorders>
+              <w:top w:val="single" w:sz="4" w:space="0" w:color="999999"/>
+              <w:left w:val="single" w:sz="4" w:space="0" w:color="999999"/>
+              <w:bottom w:val="single" w:sz="4" w:space="0" w:color="999999"/>
+              <w:right w:val="single" w:sz="4" w:space="0" w:color="999999"/>
+            </w:tcBorders>
+            <w:tcMar>
+              <w:top w:w="100" w:type="dxa"/>
+              <w:left w:w="120" w:type="dxa"/>
+              <w:bottom w:w="100" w:type="dxa"/>
+              <w:right w:w="120" w:type="dxa"/>
+            </w:tcMar>
+            <w:vAlign w:val="center"/>
+          </w:tcPr>
+          <w:p>
+            <w:pPr>
+              <w:spacing w:after="40"/>
+              <w:jc w:val="center"/>
+              <w:rPr>
+                <w:lang w:val="id-ID"/>
+              </w:rPr>
+            </w:pPr>
+            <w:r>
+              <w:rPr>
+                <w:sz w:val="20"/>
+                <w:szCs w:val="20"/>
+                <w:lang w:val="id-ID"/>
+              </w:rPr>
+              <w:t xml:space="preserve">3.821.634</w:t>
+            </w:r>
+          </w:p>
+        </w:tc>
+      </w:tr>
+      <w:tr>
+        <w:trPr>
+          <w:cantSplit/>
+        </w:trPr>
+        <w:tc>
+          <w:tcPr>
+            <w:tcW w:w="2626" w:type="dxa"/>
+            <w:tcBorders>
+              <w:top w:val="single" w:sz="4" w:space="0" w:color="999999"/>
+              <w:left w:val="single" w:sz="4" w:space="0" w:color="999999"/>
+              <w:bottom w:val="single" w:sz="4" w:space="0" w:color="999999"/>
+              <w:right w:val="single" w:sz="4" w:space="0" w:color="999999"/>
+            </w:tcBorders>
+            <w:tcMar>
+              <w:top w:w="100" w:type="dxa"/>
+              <w:left w:w="120" w:type="dxa"/>
+              <w:bottom w:w="100" w:type="dxa"/>
+              <w:right w:w="120" w:type="dxa"/>
+            </w:tcMar>
+            <w:vAlign w:val="center"/>
+          </w:tcPr>
+          <w:p>
+            <w:pPr>
+              <w:spacing w:after="40"/>
+              <w:rPr>
+                <w:lang w:val="id-ID"/>
+              </w:rPr>
+            </w:pPr>
+            <w:r>
+              <w:rPr>
+                <w:b/>
+                <w:bCs/>
+                <w:sz w:val="20"/>
+                <w:szCs w:val="20"/>
+                <w:lang w:val="id-ID"/>
+              </w:rPr>
+              <w:t xml:space="preserve">Lahan Terbuka</w:t>
+            </w:r>
+          </w:p>
+        </w:tc>
+        <w:tc>
+          <w:tcPr>
+            <w:tcW w:w="1200" w:type="dxa"/>
+            <w:tcBorders>
+              <w:top w:val="single" w:sz="4" w:space="0" w:color="999999"/>
+              <w:left w:val="single" w:sz="4" w:space="0" w:color="999999"/>
+              <w:bottom w:val="single" w:sz="4" w:space="0" w:color="999999"/>
+              <w:right w:val="single" w:sz="4" w:space="0" w:color="999999"/>
+            </w:tcBorders>
+            <w:tcMar>
+              <w:top w:w="100" w:type="dxa"/>
+              <w:left w:w="120" w:type="dxa"/>
+              <w:bottom w:w="100" w:type="dxa"/>
+              <w:right w:w="120" w:type="dxa"/>
+            </w:tcMar>
+            <w:vAlign w:val="center"/>
+          </w:tcPr>
+          <w:p>
+            <w:pPr>
+              <w:spacing w:after="40"/>
+              <w:jc w:val="center"/>
+              <w:rPr>
+                <w:lang w:val="id-ID"/>
+              </w:rPr>
+            </w:pPr>
+            <w:r>
+              <w:rPr>
+                <w:sz w:val="20"/>
+                <w:szCs w:val="20"/>
+                <w:lang w:val="id-ID"/>
+              </w:rPr>
+              <w:t xml:space="preserve">92</w:t>
+            </w:r>
+          </w:p>
+        </w:tc>
+        <w:tc>
+          <w:tcPr>
+            <w:tcW w:w="1500" w:type="dxa"/>
+            <w:tcBorders>
+              <w:top w:val="single" w:sz="4" w:space="0" w:color="999999"/>
+              <w:left w:val="single" w:sz="4" w:space="0" w:color="999999"/>
+              <w:bottom w:val="single" w:sz="4" w:space="0" w:color="999999"/>
+              <w:right w:val="single" w:sz="4" w:space="0" w:color="999999"/>
+            </w:tcBorders>
+            <w:tcMar>
+              <w:top w:w="100" w:type="dxa"/>
+              <w:left w:w="120" w:type="dxa"/>
+              <w:bottom w:w="100" w:type="dxa"/>
+              <w:right w:w="120" w:type="dxa"/>
+            </w:tcMar>
+            <w:vAlign w:val="center"/>
+          </w:tcPr>
+          <w:p>
+            <w:pPr>
+              <w:spacing w:after="40"/>
+              <w:jc w:val="center"/>
+              <w:rPr>
+                <w:lang w:val="id-ID"/>
+              </w:rPr>
+            </w:pPr>
+            <w:r>
+              <w:rPr>
+                <w:sz w:val="20"/>
+                <w:szCs w:val="20"/>
+                <w:lang w:val="id-ID"/>
+              </w:rPr>
+              <w:t xml:space="preserve">35</w:t>
+            </w:r>
+          </w:p>
+        </w:tc>
+        <w:tc>
+          <w:tcPr>
+            <w:tcW w:w="1800" w:type="dxa"/>
+            <w:tcBorders>
+              <w:top w:val="single" w:sz="4" w:space="0" w:color="999999"/>
+              <w:left w:val="single" w:sz="4" w:space="0" w:color="999999"/>
+              <w:bottom w:val="single" w:sz="4" w:space="0" w:color="999999"/>
+              <w:right w:val="single" w:sz="4" w:space="0" w:color="999999"/>
+            </w:tcBorders>
+            <w:tcMar>
+              <w:top w:w="100" w:type="dxa"/>
+              <w:left w:w="120" w:type="dxa"/>
+              <w:bottom w:w="100" w:type="dxa"/>
+              <w:right w:w="120" w:type="dxa"/>
+            </w:tcMar>
+            <w:vAlign w:val="center"/>
+          </w:tcPr>
+          <w:p>
+            <w:pPr>
+              <w:spacing w:after="40"/>
+              <w:jc w:val="center"/>
+              <w:rPr>
+                <w:lang w:val="id-ID"/>
+              </w:rPr>
+            </w:pPr>
+            <w:r>
+              <w:rPr>
+                <w:sz w:val="20"/>
+                <w:szCs w:val="20"/>
+                <w:lang w:val="id-ID"/>
+              </w:rPr>
+              <w:t xml:space="preserve">3.220</w:t>
+            </w:r>
+          </w:p>
+        </w:tc>
+        <w:tc>
+          <w:tcPr>
+            <w:tcW w:w="1900" w:type="dxa"/>
+            <w:tcBorders>
+              <w:top w:val="single" w:sz="4" w:space="0" w:color="999999"/>
+              <w:left w:val="single" w:sz="4" w:space="0" w:color="999999"/>
+              <w:bottom w:val="single" w:sz="4" w:space="0" w:color="999999"/>
+              <w:right w:val="single" w:sz="4" w:space="0" w:color="999999"/>
+            </w:tcBorders>
+            <w:tcMar>
+              <w:top w:w="100" w:type="dxa"/>
+              <w:left w:w="120" w:type="dxa"/>
+              <w:bottom w:w="100" w:type="dxa"/>
+              <w:right w:w="120" w:type="dxa"/>
+            </w:tcMar>
+            <w:vAlign w:val="center"/>
+          </w:tcPr>
+          <w:p>
+            <w:pPr>
+              <w:spacing w:after="40"/>
+              <w:jc w:val="center"/>
+              <w:rPr>
+                <w:lang w:val="id-ID"/>
+              </w:rPr>
+            </w:pPr>
+            <w:r>
+              <w:rPr>
+                <w:sz w:val="20"/>
+                <w:szCs w:val="20"/>
+                <w:lang w:val="id-ID"/>
+              </w:rPr>
+              <w:t xml:space="preserve">560.846</w:t>
+            </w:r>
+          </w:p>
+        </w:tc>
+      </w:tr>
+      <w:tr>
+        <w:trPr>
+          <w:cantSplit/>
+        </w:trPr>
+        <w:tc>
+          <w:tcPr>
+            <w:tcW w:w="2626" w:type="dxa"/>
+            <w:tcBorders>
+              <w:top w:val="single" w:sz="4" w:space="0" w:color="999999"/>
+              <w:left w:val="single" w:sz="4" w:space="0" w:color="999999"/>
+              <w:bottom w:val="single" w:sz="4" w:space="0" w:color="999999"/>
+              <w:right w:val="single" w:sz="4" w:space="0" w:color="999999"/>
+            </w:tcBorders>
+            <w:tcMar>
+              <w:top w:w="100" w:type="dxa"/>
+              <w:left w:w="120" w:type="dxa"/>
+              <w:bottom w:w="100" w:type="dxa"/>
+              <w:right w:w="120" w:type="dxa"/>
+            </w:tcMar>
+            <w:vAlign w:val="center"/>
+          </w:tcPr>
+          <w:p>
+            <w:pPr>
+              <w:spacing w:after="40"/>
+              <w:rPr>
+                <w:lang w:val="id-ID"/>
+              </w:rPr>
+            </w:pPr>
+            <w:r>
+              <w:rPr>
+                <w:b/>
+                <w:bCs/>
+                <w:sz w:val="20"/>
+                <w:szCs w:val="20"/>
+                <w:lang w:val="id-ID"/>
+              </w:rPr>
+              <w:t xml:space="preserve">Perkebunan</w:t>
+            </w:r>
+          </w:p>
+        </w:tc>
+        <w:tc>
+          <w:tcPr>
+            <w:tcW w:w="1200" w:type="dxa"/>
+            <w:tcBorders>
+              <w:top w:val="single" w:sz="4" w:space="0" w:color="999999"/>
+              <w:left w:val="single" w:sz="4" w:space="0" w:color="999999"/>
+              <w:bottom w:val="single" w:sz="4" w:space="0" w:color="999999"/>
+              <w:right w:val="single" w:sz="4" w:space="0" w:color="999999"/>
+            </w:tcBorders>
+            <w:tcMar>
+              <w:top w:w="100" w:type="dxa"/>
+              <w:left w:w="120" w:type="dxa"/>
+              <w:bottom w:w="100" w:type="dxa"/>
+              <w:right w:w="120" w:type="dxa"/>
+            </w:tcMar>
+            <w:vAlign w:val="center"/>
+          </w:tcPr>
+          <w:p>
+            <w:pPr>
+              <w:spacing w:after="40"/>
+              <w:jc w:val="center"/>
+              <w:rPr>
+                <w:lang w:val="id-ID"/>
+              </w:rPr>
+            </w:pPr>
+            <w:r>
+              <w:rPr>
+                <w:sz w:val="20"/>
+                <w:szCs w:val="20"/>
+                <w:lang w:val="id-ID"/>
+              </w:rPr>
+              <w:t xml:space="preserve">10</w:t>
+            </w:r>
+          </w:p>
+        </w:tc>
+        <w:tc>
+          <w:tcPr>
+            <w:tcW w:w="1500" w:type="dxa"/>
+            <w:tcBorders>
+              <w:top w:val="single" w:sz="4" w:space="0" w:color="999999"/>
+              <w:left w:val="single" w:sz="4" w:space="0" w:color="999999"/>
+              <w:bottom w:val="single" w:sz="4" w:space="0" w:color="999999"/>
+              <w:right w:val="single" w:sz="4" w:space="0" w:color="999999"/>
+            </w:tcBorders>
+            <w:tcMar>
+              <w:top w:w="100" w:type="dxa"/>
+              <w:left w:w="120" w:type="dxa"/>
+              <w:bottom w:w="100" w:type="dxa"/>
+              <w:right w:w="120" w:type="dxa"/>
+            </w:tcMar>
+            <w:vAlign w:val="center"/>
+          </w:tcPr>
+          <w:p>
+            <w:pPr>
+              <w:spacing w:after="40"/>
+              <w:jc w:val="center"/>
+              <w:rPr>
+                <w:lang w:val="id-ID"/>
+              </w:rPr>
+            </w:pPr>
+            <w:r>
+              <w:rPr>
+                <w:sz w:val="20"/>
+                <w:szCs w:val="20"/>
+                <w:lang w:val="id-ID"/>
+              </w:rPr>
+              <w:t xml:space="preserve">40</w:t>
+            </w:r>
+          </w:p>
+        </w:tc>
+        <w:tc>
+          <w:tcPr>
+            <w:tcW w:w="1800" w:type="dxa"/>
+            <w:tcBorders>
+              <w:top w:val="single" w:sz="4" w:space="0" w:color="999999"/>
+              <w:left w:val="single" w:sz="4" w:space="0" w:color="999999"/>
+              <w:bottom w:val="single" w:sz="4" w:space="0" w:color="999999"/>
+              <w:right w:val="single" w:sz="4" w:space="0" w:color="999999"/>
+            </w:tcBorders>
+            <w:tcMar>
+              <w:top w:w="100" w:type="dxa"/>
+              <w:left w:w="120" w:type="dxa"/>
+              <w:bottom w:w="100" w:type="dxa"/>
+              <w:right w:w="120" w:type="dxa"/>
+            </w:tcMar>
+            <w:vAlign w:val="center"/>
+          </w:tcPr>
+          <w:p>
+            <w:pPr>
+              <w:spacing w:after="40"/>
+              <w:jc w:val="center"/>
+              <w:rPr>
+                <w:lang w:val="id-ID"/>
+              </w:rPr>
+            </w:pPr>
+            <w:r>
+              <w:rPr>
+                <w:sz w:val="20"/>
+                <w:szCs w:val="20"/>
+                <w:lang w:val="id-ID"/>
+              </w:rPr>
+              <w:t xml:space="preserve">400</w:t>
+            </w:r>
+          </w:p>
+        </w:tc>
+        <w:tc>
+          <w:tcPr>
+            <w:tcW w:w="1900" w:type="dxa"/>
+            <w:tcBorders>
+              <w:top w:val="single" w:sz="4" w:space="0" w:color="999999"/>
+              <w:left w:val="single" w:sz="4" w:space="0" w:color="999999"/>
+              <w:bottom w:val="single" w:sz="4" w:space="0" w:color="999999"/>
+              <w:right w:val="single" w:sz="4" w:space="0" w:color="999999"/>
+            </w:tcBorders>
+            <w:tcMar>
+              <w:top w:w="100" w:type="dxa"/>
+              <w:left w:w="120" w:type="dxa"/>
+              <w:bottom w:w="100" w:type="dxa"/>
+              <w:right w:w="120" w:type="dxa"/>
+            </w:tcMar>
+            <w:vAlign w:val="center"/>
+          </w:tcPr>
+          <w:p>
+            <w:pPr>
+              <w:spacing w:after="40"/>
+              <w:jc w:val="center"/>
+              <w:rPr>
+                <w:lang w:val="id-ID"/>
+              </w:rPr>
+            </w:pPr>
+            <w:r>
+              <w:rPr>
+                <w:sz w:val="20"/>
+                <w:szCs w:val="20"/>
+                <w:lang w:val="id-ID"/>
+              </w:rPr>
+              <w:t xml:space="preserve">60.632</w:t>
+            </w:r>
+          </w:p>
+        </w:tc>
+      </w:tr>
+      <w:tr>
+        <w:trPr>
+          <w:cantSplit/>
+        </w:trPr>
+        <w:tc>
+          <w:tcPr>
+            <w:tcW w:w="2626" w:type="dxa"/>
+            <w:tcBorders>
+              <w:top w:val="single" w:sz="4" w:space="0" w:color="999999"/>
+              <w:left w:val="single" w:sz="4" w:space="0" w:color="999999"/>
+              <w:bottom w:val="single" w:sz="4" w:space="0" w:color="999999"/>
+              <w:right w:val="single" w:sz="4" w:space="0" w:color="999999"/>
+            </w:tcBorders>
+            <w:tcMar>
+              <w:top w:w="100" w:type="dxa"/>
+              <w:left w:w="120" w:type="dxa"/>
+              <w:bottom w:w="100" w:type="dxa"/>
+              <w:right w:w="120" w:type="dxa"/>
+            </w:tcMar>
+            <w:vAlign w:val="center"/>
+          </w:tcPr>
+          <w:p>
+            <w:pPr>
+              <w:spacing w:after="40"/>
+              <w:rPr>
+                <w:lang w:val="id-ID"/>
+              </w:rPr>
+            </w:pPr>
+            <w:r>
+              <w:rPr>
+                <w:b/>
+                <w:bCs/>
+                <w:b/>
+                <w:bCs/>
+                <w:sz w:val="20"/>
+                <w:szCs w:val="20"/>
+                <w:lang w:val="id-ID"/>
+              </w:rPr>
+              <w:t xml:space="preserve">Total</w:t>
+            </w:r>
+          </w:p>
+        </w:tc>
+        <w:tc>
+          <w:tcPr>
+            <w:tcW w:w="1200" w:type="dxa"/>
+            <w:tcBorders>
+              <w:top w:val="single" w:sz="4" w:space="0" w:color="999999"/>
+              <w:left w:val="single" w:sz="4" w:space="0" w:color="999999"/>
+              <w:bottom w:val="single" w:sz="4" w:space="0" w:color="999999"/>
+              <w:right w:val="single" w:sz="4" w:space="0" w:color="999999"/>
+            </w:tcBorders>
+            <w:tcMar>
+              <w:top w:w="100" w:type="dxa"/>
+              <w:left w:w="120" w:type="dxa"/>
+              <w:bottom w:w="100" w:type="dxa"/>
+              <w:right w:w="120" w:type="dxa"/>
+            </w:tcMar>
+            <w:vAlign w:val="center"/>
+          </w:tcPr>
+          <w:p>
+            <w:pPr>
+              <w:spacing w:after="40"/>
+              <w:jc w:val="center"/>
+              <w:rPr>
+                <w:lang w:val="id-ID"/>
+              </w:rPr>
+            </w:pPr>
+            <w:r>
+              <w:rPr>
+                <w:b/>
+                <w:bCs/>
+                <w:sz w:val="20"/>
+                <w:szCs w:val="20"/>
+                <w:lang w:val="id-ID"/>
+              </w:rPr>
+              <w:t xml:space="preserve">2.469</w:t>
+            </w:r>
+          </w:p>
+        </w:tc>
+        <w:tc>
+          <w:tcPr>
+            <w:tcW w:w="1500" w:type="dxa"/>
+            <w:tcBorders>
+              <w:top w:val="single" w:sz="4" w:space="0" w:color="999999"/>
+              <w:left w:val="single" w:sz="4" w:space="0" w:color="999999"/>
+              <w:bottom w:val="single" w:sz="4" w:space="0" w:color="999999"/>
+              <w:right w:val="single" w:sz="4" w:space="0" w:color="999999"/>
+            </w:tcBorders>
+            <w:tcMar>
+              <w:top w:w="100" w:type="dxa"/>
+              <w:left w:w="120" w:type="dxa"/>
+              <w:bottom w:w="100" w:type="dxa"/>
+              <w:right w:w="120" w:type="dxa"/>
+            </w:tcMar>
+            <w:vAlign w:val="center"/>
+          </w:tcPr>
+          <w:p>
+            <w:pPr>
+              <w:spacing w:after="40"/>
+              <w:jc w:val="center"/>
+              <w:rPr>
+                <w:lang w:val="id-ID"/>
+              </w:rPr>
+            </w:pPr>
+          </w:p>
+        </w:tc>
+        <w:tc>
+          <w:tcPr>
+            <w:tcW w:w="1800" w:type="dxa"/>
+            <w:tcBorders>
+              <w:top w:val="single" w:sz="4" w:space="0" w:color="999999"/>
+              <w:left w:val="single" w:sz="4" w:space="0" w:color="999999"/>
+              <w:bottom w:val="single" w:sz="4" w:space="0" w:color="999999"/>
+              <w:right w:val="single" w:sz="4" w:space="0" w:color="999999"/>
+            </w:tcBorders>
+            <w:tcMar>
+              <w:top w:w="100" w:type="dxa"/>
+              <w:left w:w="120" w:type="dxa"/>
+              <w:bottom w:w="100" w:type="dxa"/>
+              <w:right w:w="120" w:type="dxa"/>
+            </w:tcMar>
+            <w:vAlign w:val="center"/>
+          </w:tcPr>
+          <w:p>
+            <w:pPr>
+              <w:spacing w:after="40"/>
+              <w:jc w:val="center"/>
+              <w:rPr>
+                <w:lang w:val="id-ID"/>
+              </w:rPr>
+            </w:pPr>
+            <w:r>
+              <w:rPr>
+                <w:b/>
+                <w:bCs/>
+                <w:sz w:val="20"/>
+                <w:szCs w:val="20"/>
+                <w:lang w:val="id-ID"/>
+              </w:rPr>
+              <w:t xml:space="preserve">48.593</w:t>
+            </w:r>
+          </w:p>
+        </w:tc>
+        <w:tc>
+          <w:tcPr>
+            <w:tcW w:w="1900" w:type="dxa"/>
+            <w:tcBorders>
+              <w:top w:val="single" w:sz="4" w:space="0" w:color="999999"/>
+              <w:left w:val="single" w:sz="4" w:space="0" w:color="999999"/>
+              <w:bottom w:val="single" w:sz="4" w:space="0" w:color="999999"/>
+              <w:right w:val="single" w:sz="4" w:space="0" w:color="999999"/>
+            </w:tcBorders>
+            <w:tcMar>
+              <w:top w:w="100" w:type="dxa"/>
+              <w:left w:w="120" w:type="dxa"/>
+              <w:bottom w:w="100" w:type="dxa"/>
+              <w:right w:w="120" w:type="dxa"/>
+            </w:tcMar>
+            <w:vAlign w:val="center"/>
+          </w:tcPr>
+          <w:p>
+            <w:pPr>
+              <w:spacing w:after="40"/>
+              <w:jc w:val="center"/>
+              <w:rPr>
+                <w:lang w:val="id-ID"/>
+              </w:rPr>
+            </w:pPr>
+            <w:r>
+              <w:rPr>
+                <w:b/>
+                <w:bCs/>
+                <w:sz w:val="20"/>
+                <w:szCs w:val="20"/>
+                <w:lang w:val="id-ID"/>
+              </w:rPr>
+              <w:t xml:space="preserve">7.664.737</w:t>
+            </w:r>
+          </w:p>
+        </w:tc>
+      </w:tr>
+    </w:tbl>
+    <w:p>
+      <w:pPr>
+        <w:spacing w:after="60"/>
+      </w:pPr>
+    </w:p>
+    <w:p>
+      <w:pPr>
+        <w:spacing w:before="80" w:after="200" w:line="276" w:lineRule="auto"/>
+        <w:jc w:val="both"/>
+        <w:rPr>
+          <w:lang w:val="id-ID"/>
+        </w:rPr>
+      </w:pPr>
+      <w:r>
+        <w:rPr>
+          <w:i/>
+          <w:iCs/>
+          <w:color w:val="595959"/>
+          <w:sz w:val="20"/>
+          <w:szCs w:val="20"/>
+          <w:lang w:val="id-ID"/>
+        </w:rPr>
+        <w:t xml:space="preserve">Sumber: pre-assessment carbon accounting SAMPAN Kalimantan. Stok karbon = luas × ketebalan gambut × 10.000 × bulk density × fraksi karbon × 44/12; ketebalan menggunakan nilai tengah kelas kedalaman (0,25 m; 1,5 m; 2,5 m).</w:t>
       </w:r>
     </w:p>
     <w:p>

</xml_diff>